<commit_message>
Add the Haulage client portal guide and update the Haulage manual to 1.1
The help centre gets a third manual, the IBS Haulage Client Portal guide
(9 chapters), at /help/haulage-portal/, linked from the hub and the
sitemap. The IBS Haulage manual is rebuilt at version 1.1.
</commit_message>
<xml_diff>
--- a/help/haulage/IBS_Haulage_User_Manual.docx
+++ b/help/haulage/IBS_Haulage_User_Manual.docx
@@ -40,7 +40,7 @@
         <w:rPr>
           <w:color w:val="333333"/>
         </w:rPr>
-        <w:t>Version 1.0  |  October 2026</w:t>
+        <w:t>Version 1.1  |  October 2026</w:t>
       </w:r>
     </w:p>
     <w:p>
@@ -60,7 +60,7 @@
         <w:pageBreakBefore/>
       </w:pPr>
       <w:bookmarkStart w:id="0" w:name="_Toc900000000"/>
-      <w:bookmarkStart w:id="1" w:name="_Toc243299901"/>
+      <w:bookmarkStart w:id="1" w:name="_Toc243389748"/>
       <w:r>
         <w:rPr>
           <w:color w:val="1D4E89"/>
@@ -96,7 +96,7 @@
       <w:r>
         <w:fldChar w:fldCharType="separate"/>
       </w:r>
-      <w:hyperlink w:anchor="_Toc243299901" w:history="1">
+      <w:hyperlink w:anchor="_Toc243389748" w:history="1">
         <w:r>
           <w:rPr>
             <w:rStyle w:val="Hyperlink"/>
@@ -123,7 +123,7 @@
             <w:noProof/>
             <w:webHidden/>
           </w:rPr>
-          <w:instrText xml:space="preserve"> PAGEREF _Toc243299901 \h </w:instrText>
+          <w:instrText xml:space="preserve"> PAGEREF _Toc243389748 \h </w:instrText>
         </w:r>
         <w:r>
           <w:rPr>
@@ -170,7 +170,7 @@
           <w14:ligatures w14:val="standardContextual"/>
         </w:rPr>
       </w:pPr>
-      <w:hyperlink w:anchor="_Toc243299902" w:history="1">
+      <w:hyperlink w:anchor="_Toc243389749" w:history="1">
         <w:r>
           <w:rPr>
             <w:rStyle w:val="Hyperlink"/>
@@ -197,7 +197,7 @@
             <w:noProof/>
             <w:webHidden/>
           </w:rPr>
-          <w:instrText xml:space="preserve"> PAGEREF _Toc243299902 \h </w:instrText>
+          <w:instrText xml:space="preserve"> PAGEREF _Toc243389749 \h </w:instrText>
         </w:r>
         <w:r>
           <w:rPr>
@@ -244,7 +244,7 @@
           <w14:ligatures w14:val="standardContextual"/>
         </w:rPr>
       </w:pPr>
-      <w:hyperlink w:anchor="_Toc243299903" w:history="1">
+      <w:hyperlink w:anchor="_Toc243389750" w:history="1">
         <w:r>
           <w:rPr>
             <w:rStyle w:val="Hyperlink"/>
@@ -271,7 +271,7 @@
             <w:noProof/>
             <w:webHidden/>
           </w:rPr>
-          <w:instrText xml:space="preserve"> PAGEREF _Toc243299903 \h </w:instrText>
+          <w:instrText xml:space="preserve"> PAGEREF _Toc243389750 \h </w:instrText>
         </w:r>
         <w:r>
           <w:rPr>
@@ -318,7 +318,7 @@
           <w14:ligatures w14:val="standardContextual"/>
         </w:rPr>
       </w:pPr>
-      <w:hyperlink w:anchor="_Toc243299904" w:history="1">
+      <w:hyperlink w:anchor="_Toc243389751" w:history="1">
         <w:r>
           <w:rPr>
             <w:rStyle w:val="Hyperlink"/>
@@ -345,7 +345,7 @@
             <w:noProof/>
             <w:webHidden/>
           </w:rPr>
-          <w:instrText xml:space="preserve"> PAGEREF _Toc243299904 \h </w:instrText>
+          <w:instrText xml:space="preserve"> PAGEREF _Toc243389751 \h </w:instrText>
         </w:r>
         <w:r>
           <w:rPr>
@@ -392,7 +392,7 @@
           <w14:ligatures w14:val="standardContextual"/>
         </w:rPr>
       </w:pPr>
-      <w:hyperlink w:anchor="_Toc243299905" w:history="1">
+      <w:hyperlink w:anchor="_Toc243389752" w:history="1">
         <w:r>
           <w:rPr>
             <w:rStyle w:val="Hyperlink"/>
@@ -419,7 +419,7 @@
             <w:noProof/>
             <w:webHidden/>
           </w:rPr>
-          <w:instrText xml:space="preserve"> PAGEREF _Toc243299905 \h </w:instrText>
+          <w:instrText xml:space="preserve"> PAGEREF _Toc243389752 \h </w:instrText>
         </w:r>
         <w:r>
           <w:rPr>
@@ -466,7 +466,7 @@
           <w14:ligatures w14:val="standardContextual"/>
         </w:rPr>
       </w:pPr>
-      <w:hyperlink w:anchor="_Toc243299906" w:history="1">
+      <w:hyperlink w:anchor="_Toc243389753" w:history="1">
         <w:r>
           <w:rPr>
             <w:rStyle w:val="Hyperlink"/>
@@ -493,7 +493,7 @@
             <w:noProof/>
             <w:webHidden/>
           </w:rPr>
-          <w:instrText xml:space="preserve"> PAGEREF _Toc243299906 \h </w:instrText>
+          <w:instrText xml:space="preserve"> PAGEREF _Toc243389753 \h </w:instrText>
         </w:r>
         <w:r>
           <w:rPr>
@@ -540,7 +540,7 @@
           <w14:ligatures w14:val="standardContextual"/>
         </w:rPr>
       </w:pPr>
-      <w:hyperlink w:anchor="_Toc243299907" w:history="1">
+      <w:hyperlink w:anchor="_Toc243389754" w:history="1">
         <w:r>
           <w:rPr>
             <w:rStyle w:val="Hyperlink"/>
@@ -567,7 +567,7 @@
             <w:noProof/>
             <w:webHidden/>
           </w:rPr>
-          <w:instrText xml:space="preserve"> PAGEREF _Toc243299907 \h </w:instrText>
+          <w:instrText xml:space="preserve"> PAGEREF _Toc243389754 \h </w:instrText>
         </w:r>
         <w:r>
           <w:rPr>
@@ -614,7 +614,7 @@
           <w14:ligatures w14:val="standardContextual"/>
         </w:rPr>
       </w:pPr>
-      <w:hyperlink w:anchor="_Toc243299908" w:history="1">
+      <w:hyperlink w:anchor="_Toc243389755" w:history="1">
         <w:r>
           <w:rPr>
             <w:rStyle w:val="Hyperlink"/>
@@ -641,7 +641,7 @@
             <w:noProof/>
             <w:webHidden/>
           </w:rPr>
-          <w:instrText xml:space="preserve"> PAGEREF _Toc243299908 \h </w:instrText>
+          <w:instrText xml:space="preserve"> PAGEREF _Toc243389755 \h </w:instrText>
         </w:r>
         <w:r>
           <w:rPr>
@@ -688,7 +688,7 @@
           <w14:ligatures w14:val="standardContextual"/>
         </w:rPr>
       </w:pPr>
-      <w:hyperlink w:anchor="_Toc243299909" w:history="1">
+      <w:hyperlink w:anchor="_Toc243389756" w:history="1">
         <w:r>
           <w:rPr>
             <w:rStyle w:val="Hyperlink"/>
@@ -715,7 +715,7 @@
             <w:noProof/>
             <w:webHidden/>
           </w:rPr>
-          <w:instrText xml:space="preserve"> PAGEREF _Toc243299909 \h </w:instrText>
+          <w:instrText xml:space="preserve"> PAGEREF _Toc243389756 \h </w:instrText>
         </w:r>
         <w:r>
           <w:rPr>
@@ -762,7 +762,7 @@
           <w14:ligatures w14:val="standardContextual"/>
         </w:rPr>
       </w:pPr>
-      <w:hyperlink w:anchor="_Toc243299910" w:history="1">
+      <w:hyperlink w:anchor="_Toc243389757" w:history="1">
         <w:r>
           <w:rPr>
             <w:rStyle w:val="Hyperlink"/>
@@ -789,7 +789,7 @@
             <w:noProof/>
             <w:webHidden/>
           </w:rPr>
-          <w:instrText xml:space="preserve"> PAGEREF _Toc243299910 \h </w:instrText>
+          <w:instrText xml:space="preserve"> PAGEREF _Toc243389757 \h </w:instrText>
         </w:r>
         <w:r>
           <w:rPr>
@@ -836,7 +836,7 @@
           <w14:ligatures w14:val="standardContextual"/>
         </w:rPr>
       </w:pPr>
-      <w:hyperlink w:anchor="_Toc243299911" w:history="1">
+      <w:hyperlink w:anchor="_Toc243389758" w:history="1">
         <w:r>
           <w:rPr>
             <w:rStyle w:val="Hyperlink"/>
@@ -863,7 +863,7 @@
             <w:noProof/>
             <w:webHidden/>
           </w:rPr>
-          <w:instrText xml:space="preserve"> PAGEREF _Toc243299911 \h </w:instrText>
+          <w:instrText xml:space="preserve"> PAGEREF _Toc243389758 \h </w:instrText>
         </w:r>
         <w:r>
           <w:rPr>
@@ -910,7 +910,7 @@
           <w14:ligatures w14:val="standardContextual"/>
         </w:rPr>
       </w:pPr>
-      <w:hyperlink w:anchor="_Toc243299912" w:history="1">
+      <w:hyperlink w:anchor="_Toc243389759" w:history="1">
         <w:r>
           <w:rPr>
             <w:rStyle w:val="Hyperlink"/>
@@ -937,7 +937,7 @@
             <w:noProof/>
             <w:webHidden/>
           </w:rPr>
-          <w:instrText xml:space="preserve"> PAGEREF _Toc243299912 \h </w:instrText>
+          <w:instrText xml:space="preserve"> PAGEREF _Toc243389759 \h </w:instrText>
         </w:r>
         <w:r>
           <w:rPr>
@@ -984,7 +984,7 @@
           <w14:ligatures w14:val="standardContextual"/>
         </w:rPr>
       </w:pPr>
-      <w:hyperlink w:anchor="_Toc243299913" w:history="1">
+      <w:hyperlink w:anchor="_Toc243389760" w:history="1">
         <w:r>
           <w:rPr>
             <w:rStyle w:val="Hyperlink"/>
@@ -1011,7 +1011,7 @@
             <w:noProof/>
             <w:webHidden/>
           </w:rPr>
-          <w:instrText xml:space="preserve"> PAGEREF _Toc243299913 \h </w:instrText>
+          <w:instrText xml:space="preserve"> PAGEREF _Toc243389760 \h </w:instrText>
         </w:r>
         <w:r>
           <w:rPr>
@@ -1058,7 +1058,7 @@
           <w14:ligatures w14:val="standardContextual"/>
         </w:rPr>
       </w:pPr>
-      <w:hyperlink w:anchor="_Toc243299914" w:history="1">
+      <w:hyperlink w:anchor="_Toc243389761" w:history="1">
         <w:r>
           <w:rPr>
             <w:rStyle w:val="Hyperlink"/>
@@ -1085,7 +1085,7 @@
             <w:noProof/>
             <w:webHidden/>
           </w:rPr>
-          <w:instrText xml:space="preserve"> PAGEREF _Toc243299914 \h </w:instrText>
+          <w:instrText xml:space="preserve"> PAGEREF _Toc243389761 \h </w:instrText>
         </w:r>
         <w:r>
           <w:rPr>
@@ -1132,7 +1132,7 @@
           <w14:ligatures w14:val="standardContextual"/>
         </w:rPr>
       </w:pPr>
-      <w:hyperlink w:anchor="_Toc243299915" w:history="1">
+      <w:hyperlink w:anchor="_Toc243389762" w:history="1">
         <w:r>
           <w:rPr>
             <w:rStyle w:val="Hyperlink"/>
@@ -1159,7 +1159,7 @@
             <w:noProof/>
             <w:webHidden/>
           </w:rPr>
-          <w:instrText xml:space="preserve"> PAGEREF _Toc243299915 \h </w:instrText>
+          <w:instrText xml:space="preserve"> PAGEREF _Toc243389762 \h </w:instrText>
         </w:r>
         <w:r>
           <w:rPr>
@@ -1206,7 +1206,7 @@
           <w14:ligatures w14:val="standardContextual"/>
         </w:rPr>
       </w:pPr>
-      <w:hyperlink w:anchor="_Toc243299916" w:history="1">
+      <w:hyperlink w:anchor="_Toc243389763" w:history="1">
         <w:r>
           <w:rPr>
             <w:rStyle w:val="Hyperlink"/>
@@ -1233,7 +1233,7 @@
             <w:noProof/>
             <w:webHidden/>
           </w:rPr>
-          <w:instrText xml:space="preserve"> PAGEREF _Toc243299916 \h </w:instrText>
+          <w:instrText xml:space="preserve"> PAGEREF _Toc243389763 \h </w:instrText>
         </w:r>
         <w:r>
           <w:rPr>
@@ -1280,7 +1280,7 @@
           <w14:ligatures w14:val="standardContextual"/>
         </w:rPr>
       </w:pPr>
-      <w:hyperlink w:anchor="_Toc243299917" w:history="1">
+      <w:hyperlink w:anchor="_Toc243389764" w:history="1">
         <w:r>
           <w:rPr>
             <w:rStyle w:val="Hyperlink"/>
@@ -1307,7 +1307,7 @@
             <w:noProof/>
             <w:webHidden/>
           </w:rPr>
-          <w:instrText xml:space="preserve"> PAGEREF _Toc243299917 \h </w:instrText>
+          <w:instrText xml:space="preserve"> PAGEREF _Toc243389764 \h </w:instrText>
         </w:r>
         <w:r>
           <w:rPr>
@@ -1354,7 +1354,7 @@
           <w14:ligatures w14:val="standardContextual"/>
         </w:rPr>
       </w:pPr>
-      <w:hyperlink w:anchor="_Toc243299918" w:history="1">
+      <w:hyperlink w:anchor="_Toc243389765" w:history="1">
         <w:r>
           <w:rPr>
             <w:rStyle w:val="Hyperlink"/>
@@ -1381,7 +1381,7 @@
             <w:noProof/>
             <w:webHidden/>
           </w:rPr>
-          <w:instrText xml:space="preserve"> PAGEREF _Toc243299918 \h </w:instrText>
+          <w:instrText xml:space="preserve"> PAGEREF _Toc243389765 \h </w:instrText>
         </w:r>
         <w:r>
           <w:rPr>
@@ -1428,7 +1428,7 @@
           <w14:ligatures w14:val="standardContextual"/>
         </w:rPr>
       </w:pPr>
-      <w:hyperlink w:anchor="_Toc243299919" w:history="1">
+      <w:hyperlink w:anchor="_Toc243389766" w:history="1">
         <w:r>
           <w:rPr>
             <w:rStyle w:val="Hyperlink"/>
@@ -1455,15 +1455,7 @@
             <w:noProof/>
             <w:webHidden/>
           </w:rPr>
-          <w:instrText xml:space="preserve"> PA</w:instrText>
-        </w:r>
-        <w:r>
-          <w:rPr>
-            <w:noProof/>
-            <w:webHidden/>
-          </w:rPr>
-          <w:lastRenderedPageBreak/>
-          <w:instrText xml:space="preserve">GEREF _Toc243299919 \h </w:instrText>
+          <w:instrText xml:space="preserve"> PAGEREF _Toc243389766 \h </w:instrText>
         </w:r>
         <w:r>
           <w:rPr>
@@ -1510,7 +1502,7 @@
           <w14:ligatures w14:val="standardContextual"/>
         </w:rPr>
       </w:pPr>
-      <w:hyperlink w:anchor="_Toc243299920" w:history="1">
+      <w:hyperlink w:anchor="_Toc243389767" w:history="1">
         <w:r>
           <w:rPr>
             <w:rStyle w:val="Hyperlink"/>
@@ -1537,7 +1529,7 @@
             <w:noProof/>
             <w:webHidden/>
           </w:rPr>
-          <w:instrText xml:space="preserve"> PAGEREF _Toc243299920 \h </w:instrText>
+          <w:instrText xml:space="preserve"> PAGEREF _Toc243389767 \h </w:instrText>
         </w:r>
         <w:r>
           <w:rPr>
@@ -1584,7 +1576,7 @@
           <w14:ligatures w14:val="standardContextual"/>
         </w:rPr>
       </w:pPr>
-      <w:hyperlink w:anchor="_Toc243299921" w:history="1">
+      <w:hyperlink w:anchor="_Toc243389768" w:history="1">
         <w:r>
           <w:rPr>
             <w:rStyle w:val="Hyperlink"/>
@@ -1611,7 +1603,7 @@
             <w:noProof/>
             <w:webHidden/>
           </w:rPr>
-          <w:instrText xml:space="preserve"> PAGEREF _Toc243299921 \h </w:instrText>
+          <w:instrText xml:space="preserve"> PAGEREF _Toc243389768 \h </w:instrText>
         </w:r>
         <w:r>
           <w:rPr>
@@ -1658,7 +1650,7 @@
           <w14:ligatures w14:val="standardContextual"/>
         </w:rPr>
       </w:pPr>
-      <w:hyperlink w:anchor="_Toc243299922" w:history="1">
+      <w:hyperlink w:anchor="_Toc243389769" w:history="1">
         <w:r>
           <w:rPr>
             <w:rStyle w:val="Hyperlink"/>
@@ -1685,7 +1677,7 @@
             <w:noProof/>
             <w:webHidden/>
           </w:rPr>
-          <w:instrText xml:space="preserve"> PAGEREF _Toc243299922 \h </w:instrText>
+          <w:instrText xml:space="preserve"> PAGEREF _Toc243389769 \h </w:instrText>
         </w:r>
         <w:r>
           <w:rPr>
@@ -1732,7 +1724,7 @@
           <w14:ligatures w14:val="standardContextual"/>
         </w:rPr>
       </w:pPr>
-      <w:hyperlink w:anchor="_Toc243299923" w:history="1">
+      <w:hyperlink w:anchor="_Toc243389770" w:history="1">
         <w:r>
           <w:rPr>
             <w:rStyle w:val="Hyperlink"/>
@@ -1759,7 +1751,7 @@
             <w:noProof/>
             <w:webHidden/>
           </w:rPr>
-          <w:instrText xml:space="preserve"> PAGEREF _Toc243299923 \h </w:instrText>
+          <w:instrText xml:space="preserve"> PAGEREF _Toc243389770 \h </w:instrText>
         </w:r>
         <w:r>
           <w:rPr>
@@ -1806,7 +1798,7 @@
           <w14:ligatures w14:val="standardContextual"/>
         </w:rPr>
       </w:pPr>
-      <w:hyperlink w:anchor="_Toc243299924" w:history="1">
+      <w:hyperlink w:anchor="_Toc243389771" w:history="1">
         <w:r>
           <w:rPr>
             <w:rStyle w:val="Hyperlink"/>
@@ -1833,7 +1825,7 @@
             <w:noProof/>
             <w:webHidden/>
           </w:rPr>
-          <w:instrText xml:space="preserve"> PAGEREF _Toc243299924 \h </w:instrText>
+          <w:instrText xml:space="preserve"> PAGEREF _Toc243389771 \h </w:instrText>
         </w:r>
         <w:r>
           <w:rPr>
@@ -1880,7 +1872,7 @@
           <w14:ligatures w14:val="standardContextual"/>
         </w:rPr>
       </w:pPr>
-      <w:hyperlink w:anchor="_Toc243299925" w:history="1">
+      <w:hyperlink w:anchor="_Toc243389772" w:history="1">
         <w:r>
           <w:rPr>
             <w:rStyle w:val="Hyperlink"/>
@@ -1907,7 +1899,7 @@
             <w:noProof/>
             <w:webHidden/>
           </w:rPr>
-          <w:instrText xml:space="preserve"> PAGEREF _Toc243299925 \h </w:instrText>
+          <w:instrText xml:space="preserve"> PAGEREF _Toc243389772 \h </w:instrText>
         </w:r>
         <w:r>
           <w:rPr>
@@ -1954,7 +1946,7 @@
           <w14:ligatures w14:val="standardContextual"/>
         </w:rPr>
       </w:pPr>
-      <w:hyperlink w:anchor="_Toc243299926" w:history="1">
+      <w:hyperlink w:anchor="_Toc243389773" w:history="1">
         <w:r>
           <w:rPr>
             <w:rStyle w:val="Hyperlink"/>
@@ -1981,7 +1973,7 @@
             <w:noProof/>
             <w:webHidden/>
           </w:rPr>
-          <w:instrText xml:space="preserve"> PAGEREF _Toc243299926 \h </w:instrText>
+          <w:instrText xml:space="preserve"> PAGEREF _Toc243389773 \h </w:instrText>
         </w:r>
         <w:r>
           <w:rPr>
@@ -2028,7 +2020,7 @@
           <w14:ligatures w14:val="standardContextual"/>
         </w:rPr>
       </w:pPr>
-      <w:hyperlink w:anchor="_Toc243299927" w:history="1">
+      <w:hyperlink w:anchor="_Toc243389774" w:history="1">
         <w:r>
           <w:rPr>
             <w:rStyle w:val="Hyperlink"/>
@@ -2055,7 +2047,7 @@
             <w:noProof/>
             <w:webHidden/>
           </w:rPr>
-          <w:instrText xml:space="preserve"> PAGEREF _Toc243299927 \h </w:instrText>
+          <w:instrText xml:space="preserve"> PAGEREF _Toc243389774 \h </w:instrText>
         </w:r>
         <w:r>
           <w:rPr>
@@ -2102,7 +2094,7 @@
           <w14:ligatures w14:val="standardContextual"/>
         </w:rPr>
       </w:pPr>
-      <w:hyperlink w:anchor="_Toc243299928" w:history="1">
+      <w:hyperlink w:anchor="_Toc243389775" w:history="1">
         <w:r>
           <w:rPr>
             <w:rStyle w:val="Hyperlink"/>
@@ -2129,7 +2121,7 @@
             <w:noProof/>
             <w:webHidden/>
           </w:rPr>
-          <w:instrText xml:space="preserve"> PAGEREF _Toc243299928 \h </w:instrText>
+          <w:instrText xml:space="preserve"> PAGEREF _Toc243389775 \h </w:instrText>
         </w:r>
         <w:r>
           <w:rPr>
@@ -2176,7 +2168,7 @@
           <w14:ligatures w14:val="standardContextual"/>
         </w:rPr>
       </w:pPr>
-      <w:hyperlink w:anchor="_Toc243299929" w:history="1">
+      <w:hyperlink w:anchor="_Toc243389776" w:history="1">
         <w:r>
           <w:rPr>
             <w:rStyle w:val="Hyperlink"/>
@@ -2203,7 +2195,7 @@
             <w:noProof/>
             <w:webHidden/>
           </w:rPr>
-          <w:instrText xml:space="preserve"> PAGEREF _Toc243299929 \h </w:instrText>
+          <w:instrText xml:space="preserve"> PAGEREF _Toc243389776 \h </w:instrText>
         </w:r>
         <w:r>
           <w:rPr>
@@ -2250,7 +2242,7 @@
           <w14:ligatures w14:val="standardContextual"/>
         </w:rPr>
       </w:pPr>
-      <w:hyperlink w:anchor="_Toc243299930" w:history="1">
+      <w:hyperlink w:anchor="_Toc243389777" w:history="1">
         <w:r>
           <w:rPr>
             <w:rStyle w:val="Hyperlink"/>
@@ -2277,7 +2269,7 @@
             <w:noProof/>
             <w:webHidden/>
           </w:rPr>
-          <w:instrText xml:space="preserve"> PAGEREF _Toc243299930 \h </w:instrText>
+          <w:instrText xml:space="preserve"> PAGEREF _Toc243389777 \h </w:instrText>
         </w:r>
         <w:r>
           <w:rPr>
@@ -2324,7 +2316,7 @@
           <w14:ligatures w14:val="standardContextual"/>
         </w:rPr>
       </w:pPr>
-      <w:hyperlink w:anchor="_Toc243299931" w:history="1">
+      <w:hyperlink w:anchor="_Toc243389778" w:history="1">
         <w:r>
           <w:rPr>
             <w:rStyle w:val="Hyperlink"/>
@@ -2351,7 +2343,7 @@
             <w:noProof/>
             <w:webHidden/>
           </w:rPr>
-          <w:instrText xml:space="preserve"> PAGEREF _Toc243299931 \h </w:instrText>
+          <w:instrText xml:space="preserve"> PAGEREF _Toc243389778 \h </w:instrText>
         </w:r>
         <w:r>
           <w:rPr>
@@ -2398,7 +2390,7 @@
           <w14:ligatures w14:val="standardContextual"/>
         </w:rPr>
       </w:pPr>
-      <w:hyperlink w:anchor="_Toc243299932" w:history="1">
+      <w:hyperlink w:anchor="_Toc243389779" w:history="1">
         <w:r>
           <w:rPr>
             <w:rStyle w:val="Hyperlink"/>
@@ -2425,7 +2417,7 @@
             <w:noProof/>
             <w:webHidden/>
           </w:rPr>
-          <w:instrText xml:space="preserve"> PAGEREF _Toc243299932 \h </w:instrText>
+          <w:instrText xml:space="preserve"> PAGEREF _Toc243389779 \h </w:instrText>
         </w:r>
         <w:r>
           <w:rPr>
@@ -2472,7 +2464,7 @@
           <w14:ligatures w14:val="standardContextual"/>
         </w:rPr>
       </w:pPr>
-      <w:hyperlink w:anchor="_Toc243299933" w:history="1">
+      <w:hyperlink w:anchor="_Toc243389780" w:history="1">
         <w:r>
           <w:rPr>
             <w:rStyle w:val="Hyperlink"/>
@@ -2499,7 +2491,7 @@
             <w:noProof/>
             <w:webHidden/>
           </w:rPr>
-          <w:instrText xml:space="preserve"> PAGEREF _Toc243299933 \h </w:instrText>
+          <w:instrText xml:space="preserve"> PAGEREF _Toc243389780 \h </w:instrText>
         </w:r>
         <w:r>
           <w:rPr>
@@ -2546,7 +2538,7 @@
           <w14:ligatures w14:val="standardContextual"/>
         </w:rPr>
       </w:pPr>
-      <w:hyperlink w:anchor="_Toc243299934" w:history="1">
+      <w:hyperlink w:anchor="_Toc243389781" w:history="1">
         <w:r>
           <w:rPr>
             <w:rStyle w:val="Hyperlink"/>
@@ -2573,7 +2565,7 @@
             <w:noProof/>
             <w:webHidden/>
           </w:rPr>
-          <w:instrText xml:space="preserve"> PAGEREF _Toc243299934 \h </w:instrText>
+          <w:instrText xml:space="preserve"> PAGEREF _Toc243389781 \h </w:instrText>
         </w:r>
         <w:r>
           <w:rPr>
@@ -2620,7 +2612,7 @@
           <w14:ligatures w14:val="standardContextual"/>
         </w:rPr>
       </w:pPr>
-      <w:hyperlink w:anchor="_Toc243299935" w:history="1">
+      <w:hyperlink w:anchor="_Toc243389782" w:history="1">
         <w:r>
           <w:rPr>
             <w:rStyle w:val="Hyperlink"/>
@@ -2647,7 +2639,7 @@
             <w:noProof/>
             <w:webHidden/>
           </w:rPr>
-          <w:instrText xml:space="preserve"> PAGEREF _Toc243299935 \h </w:instrText>
+          <w:instrText xml:space="preserve"> PAGEREF _Toc243389782 \h </w:instrText>
         </w:r>
         <w:r>
           <w:rPr>
@@ -2694,7 +2686,7 @@
           <w14:ligatures w14:val="standardContextual"/>
         </w:rPr>
       </w:pPr>
-      <w:hyperlink w:anchor="_Toc243299936" w:history="1">
+      <w:hyperlink w:anchor="_Toc243389783" w:history="1">
         <w:r>
           <w:rPr>
             <w:rStyle w:val="Hyperlink"/>
@@ -2721,7 +2713,7 @@
             <w:noProof/>
             <w:webHidden/>
           </w:rPr>
-          <w:instrText xml:space="preserve"> PAGEREF _Toc243299936 \h </w:instrText>
+          <w:instrText xml:space="preserve"> PAGEREF _Toc243389783 \h </w:instrText>
         </w:r>
         <w:r>
           <w:rPr>
@@ -2768,7 +2760,7 @@
           <w14:ligatures w14:val="standardContextual"/>
         </w:rPr>
       </w:pPr>
-      <w:hyperlink w:anchor="_Toc243299937" w:history="1">
+      <w:hyperlink w:anchor="_Toc243389784" w:history="1">
         <w:r>
           <w:rPr>
             <w:rStyle w:val="Hyperlink"/>
@@ -2795,7 +2787,7 @@
             <w:noProof/>
             <w:webHidden/>
           </w:rPr>
-          <w:instrText xml:space="preserve"> PAGEREF _Toc243299937 \h </w:instrText>
+          <w:instrText xml:space="preserve"> PAGEREF _Toc243389784 \h </w:instrText>
         </w:r>
         <w:r>
           <w:rPr>
@@ -2842,7 +2834,7 @@
           <w14:ligatures w14:val="standardContextual"/>
         </w:rPr>
       </w:pPr>
-      <w:hyperlink w:anchor="_Toc243299938" w:history="1">
+      <w:hyperlink w:anchor="_Toc243389785" w:history="1">
         <w:r>
           <w:rPr>
             <w:rStyle w:val="Hyperlink"/>
@@ -2869,7 +2861,7 @@
             <w:noProof/>
             <w:webHidden/>
           </w:rPr>
-          <w:instrText xml:space="preserve"> PAGEREF _Toc243299938 \h </w:instrText>
+          <w:instrText xml:space="preserve"> PAGEREF _Toc243389785 \h </w:instrText>
         </w:r>
         <w:r>
           <w:rPr>
@@ -2916,7 +2908,7 @@
           <w14:ligatures w14:val="standardContextual"/>
         </w:rPr>
       </w:pPr>
-      <w:hyperlink w:anchor="_Toc243299939" w:history="1">
+      <w:hyperlink w:anchor="_Toc243389786" w:history="1">
         <w:r>
           <w:rPr>
             <w:rStyle w:val="Hyperlink"/>
@@ -2943,7 +2935,7 @@
             <w:noProof/>
             <w:webHidden/>
           </w:rPr>
-          <w:instrText xml:space="preserve"> PAGEREF _Toc243299939 \h </w:instrText>
+          <w:instrText xml:space="preserve"> PAGEREF _Toc243389786 \h </w:instrText>
         </w:r>
         <w:r>
           <w:rPr>
@@ -2990,7 +2982,7 @@
           <w14:ligatures w14:val="standardContextual"/>
         </w:rPr>
       </w:pPr>
-      <w:hyperlink w:anchor="_Toc243299940" w:history="1">
+      <w:hyperlink w:anchor="_Toc243389787" w:history="1">
         <w:r>
           <w:rPr>
             <w:rStyle w:val="Hyperlink"/>
@@ -3017,7 +3009,7 @@
             <w:noProof/>
             <w:webHidden/>
           </w:rPr>
-          <w:instrText xml:space="preserve"> PAGEREF _Toc243299940 \h </w:instrText>
+          <w:instrText xml:space="preserve"> PAGEREF _Toc243389787 \h </w:instrText>
         </w:r>
         <w:r>
           <w:rPr>
@@ -3064,7 +3056,7 @@
           <w14:ligatures w14:val="standardContextual"/>
         </w:rPr>
       </w:pPr>
-      <w:hyperlink w:anchor="_Toc243299941" w:history="1">
+      <w:hyperlink w:anchor="_Toc243389788" w:history="1">
         <w:r>
           <w:rPr>
             <w:rStyle w:val="Hyperlink"/>
@@ -3091,7 +3083,7 @@
             <w:noProof/>
             <w:webHidden/>
           </w:rPr>
-          <w:instrText xml:space="preserve"> PAGEREF _Toc243299941 \h </w:instrText>
+          <w:instrText xml:space="preserve"> PAGEREF _Toc243389788 \h </w:instrText>
         </w:r>
         <w:r>
           <w:rPr>
@@ -3138,7 +3130,7 @@
           <w14:ligatures w14:val="standardContextual"/>
         </w:rPr>
       </w:pPr>
-      <w:hyperlink w:anchor="_Toc243299942" w:history="1">
+      <w:hyperlink w:anchor="_Toc243389789" w:history="1">
         <w:r>
           <w:rPr>
             <w:rStyle w:val="Hyperlink"/>
@@ -3165,7 +3157,7 @@
             <w:noProof/>
             <w:webHidden/>
           </w:rPr>
-          <w:instrText xml:space="preserve"> PAGEREF _Toc243299942 \h </w:instrText>
+          <w:instrText xml:space="preserve"> PAGEREF _Toc243389789 \h </w:instrText>
         </w:r>
         <w:r>
           <w:rPr>
@@ -3212,7 +3204,7 @@
           <w14:ligatures w14:val="standardContextual"/>
         </w:rPr>
       </w:pPr>
-      <w:hyperlink w:anchor="_Toc243299943" w:history="1">
+      <w:hyperlink w:anchor="_Toc243389790" w:history="1">
         <w:r>
           <w:rPr>
             <w:rStyle w:val="Hyperlink"/>
@@ -3239,7 +3231,7 @@
             <w:noProof/>
             <w:webHidden/>
           </w:rPr>
-          <w:instrText xml:space="preserve"> PAGEREF _Toc243299943 \h </w:instrText>
+          <w:instrText xml:space="preserve"> PAGEREF _Toc243389790 \h </w:instrText>
         </w:r>
         <w:r>
           <w:rPr>
@@ -3259,7 +3251,7 @@
             <w:noProof/>
             <w:webHidden/>
           </w:rPr>
-          <w:t>17</w:t>
+          <w:t>18</w:t>
         </w:r>
         <w:r>
           <w:rPr>
@@ -3286,7 +3278,7 @@
           <w14:ligatures w14:val="standardContextual"/>
         </w:rPr>
       </w:pPr>
-      <w:hyperlink w:anchor="_Toc243299944" w:history="1">
+      <w:hyperlink w:anchor="_Toc243389791" w:history="1">
         <w:r>
           <w:rPr>
             <w:rStyle w:val="Hyperlink"/>
@@ -3313,7 +3305,7 @@
             <w:noProof/>
             <w:webHidden/>
           </w:rPr>
-          <w:instrText xml:space="preserve"> PAGEREF _Toc243299944 \h </w:instrText>
+          <w:instrText xml:space="preserve"> PAGEREF _Toc243389791 \h </w:instrText>
         </w:r>
         <w:r>
           <w:rPr>
@@ -3360,7 +3352,7 @@
           <w14:ligatures w14:val="standardContextual"/>
         </w:rPr>
       </w:pPr>
-      <w:hyperlink w:anchor="_Toc243299945" w:history="1">
+      <w:hyperlink w:anchor="_Toc243389792" w:history="1">
         <w:r>
           <w:rPr>
             <w:rStyle w:val="Hyperlink"/>
@@ -3387,7 +3379,7 @@
             <w:noProof/>
             <w:webHidden/>
           </w:rPr>
-          <w:instrText xml:space="preserve"> PAGEREF _Toc243299945 \h </w:instrText>
+          <w:instrText xml:space="preserve"> PAGEREF _Toc243389792 \h </w:instrText>
         </w:r>
         <w:r>
           <w:rPr>
@@ -3434,7 +3426,7 @@
           <w14:ligatures w14:val="standardContextual"/>
         </w:rPr>
       </w:pPr>
-      <w:hyperlink w:anchor="_Toc243299946" w:history="1">
+      <w:hyperlink w:anchor="_Toc243389793" w:history="1">
         <w:r>
           <w:rPr>
             <w:rStyle w:val="Hyperlink"/>
@@ -3461,7 +3453,7 @@
             <w:noProof/>
             <w:webHidden/>
           </w:rPr>
-          <w:instrText xml:space="preserve"> PAGEREF _Toc243299946 \h </w:instrText>
+          <w:instrText xml:space="preserve"> PAGEREF _Toc243389793 \h </w:instrText>
         </w:r>
         <w:r>
           <w:rPr>
@@ -3508,7 +3500,7 @@
           <w14:ligatures w14:val="standardContextual"/>
         </w:rPr>
       </w:pPr>
-      <w:hyperlink w:anchor="_Toc243299947" w:history="1">
+      <w:hyperlink w:anchor="_Toc243389794" w:history="1">
         <w:r>
           <w:rPr>
             <w:rStyle w:val="Hyperlink"/>
@@ -3535,7 +3527,7 @@
             <w:noProof/>
             <w:webHidden/>
           </w:rPr>
-          <w:instrText xml:space="preserve"> PAGEREF _Toc243299947 \h </w:instrText>
+          <w:instrText xml:space="preserve"> PAGEREF _Toc243389794 \h </w:instrText>
         </w:r>
         <w:r>
           <w:rPr>
@@ -3582,7 +3574,7 @@
           <w14:ligatures w14:val="standardContextual"/>
         </w:rPr>
       </w:pPr>
-      <w:hyperlink w:anchor="_Toc243299948" w:history="1">
+      <w:hyperlink w:anchor="_Toc243389795" w:history="1">
         <w:r>
           <w:rPr>
             <w:rStyle w:val="Hyperlink"/>
@@ -3609,7 +3601,7 @@
             <w:noProof/>
             <w:webHidden/>
           </w:rPr>
-          <w:instrText xml:space="preserve"> PAGEREF _Toc243299948 \h </w:instrText>
+          <w:instrText xml:space="preserve"> PAGEREF _Toc243389795 \h </w:instrText>
         </w:r>
         <w:r>
           <w:rPr>
@@ -3656,7 +3648,7 @@
           <w14:ligatures w14:val="standardContextual"/>
         </w:rPr>
       </w:pPr>
-      <w:hyperlink w:anchor="_Toc243299949" w:history="1">
+      <w:hyperlink w:anchor="_Toc243389796" w:history="1">
         <w:r>
           <w:rPr>
             <w:rStyle w:val="Hyperlink"/>
@@ -3683,7 +3675,7 @@
             <w:noProof/>
             <w:webHidden/>
           </w:rPr>
-          <w:instrText xml:space="preserve"> PAGEREF _Toc243299949 \h </w:instrText>
+          <w:instrText xml:space="preserve"> PAGEREF _Toc243389796 \h </w:instrText>
         </w:r>
         <w:r>
           <w:rPr>
@@ -3730,7 +3722,7 @@
           <w14:ligatures w14:val="standardContextual"/>
         </w:rPr>
       </w:pPr>
-      <w:hyperlink w:anchor="_Toc243299950" w:history="1">
+      <w:hyperlink w:anchor="_Toc243389797" w:history="1">
         <w:r>
           <w:rPr>
             <w:rStyle w:val="Hyperlink"/>
@@ -3757,7 +3749,7 @@
             <w:noProof/>
             <w:webHidden/>
           </w:rPr>
-          <w:instrText xml:space="preserve"> PAGEREF _Toc243299950 \h </w:instrText>
+          <w:instrText xml:space="preserve"> PAGEREF _Toc243389797 \h </w:instrText>
         </w:r>
         <w:r>
           <w:rPr>
@@ -3804,7 +3796,7 @@
           <w14:ligatures w14:val="standardContextual"/>
         </w:rPr>
       </w:pPr>
-      <w:hyperlink w:anchor="_Toc243299951" w:history="1">
+      <w:hyperlink w:anchor="_Toc243389798" w:history="1">
         <w:r>
           <w:rPr>
             <w:rStyle w:val="Hyperlink"/>
@@ -3831,7 +3823,7 @@
             <w:noProof/>
             <w:webHidden/>
           </w:rPr>
-          <w:instrText xml:space="preserve"> PAGEREF _Toc243299951 \h </w:instrText>
+          <w:instrText xml:space="preserve"> PAGEREF _Toc243389798 \h </w:instrText>
         </w:r>
         <w:r>
           <w:rPr>
@@ -3878,7 +3870,7 @@
           <w14:ligatures w14:val="standardContextual"/>
         </w:rPr>
       </w:pPr>
-      <w:hyperlink w:anchor="_Toc243299952" w:history="1">
+      <w:hyperlink w:anchor="_Toc243389799" w:history="1">
         <w:r>
           <w:rPr>
             <w:rStyle w:val="Hyperlink"/>
@@ -3905,7 +3897,7 @@
             <w:noProof/>
             <w:webHidden/>
           </w:rPr>
-          <w:instrText xml:space="preserve"> PAGEREF _Toc243299952 \h </w:instrText>
+          <w:instrText xml:space="preserve"> PAGEREF _Toc243389799 \h </w:instrText>
         </w:r>
         <w:r>
           <w:rPr>
@@ -3952,7 +3944,7 @@
           <w14:ligatures w14:val="standardContextual"/>
         </w:rPr>
       </w:pPr>
-      <w:hyperlink w:anchor="_Toc243299953" w:history="1">
+      <w:hyperlink w:anchor="_Toc243389800" w:history="1">
         <w:r>
           <w:rPr>
             <w:rStyle w:val="Hyperlink"/>
@@ -3979,7 +3971,7 @@
             <w:noProof/>
             <w:webHidden/>
           </w:rPr>
-          <w:instrText xml:space="preserve"> PAGEREF _Toc243299953 \h </w:instrText>
+          <w:instrText xml:space="preserve"> PAGEREF _Toc243389800 \h </w:instrText>
         </w:r>
         <w:r>
           <w:rPr>
@@ -4026,7 +4018,7 @@
           <w14:ligatures w14:val="standardContextual"/>
         </w:rPr>
       </w:pPr>
-      <w:hyperlink w:anchor="_Toc243299954" w:history="1">
+      <w:hyperlink w:anchor="_Toc243389801" w:history="1">
         <w:r>
           <w:rPr>
             <w:rStyle w:val="Hyperlink"/>
@@ -4053,7 +4045,7 @@
             <w:noProof/>
             <w:webHidden/>
           </w:rPr>
-          <w:instrText xml:space="preserve"> PAGEREF _Toc243299954 \h </w:instrText>
+          <w:instrText xml:space="preserve"> PAGEREF _Toc243389801 \h </w:instrText>
         </w:r>
         <w:r>
           <w:rPr>
@@ -4100,7 +4092,7 @@
           <w14:ligatures w14:val="standardContextual"/>
         </w:rPr>
       </w:pPr>
-      <w:hyperlink w:anchor="_Toc243299955" w:history="1">
+      <w:hyperlink w:anchor="_Toc243389802" w:history="1">
         <w:r>
           <w:rPr>
             <w:rStyle w:val="Hyperlink"/>
@@ -4127,7 +4119,7 @@
             <w:noProof/>
             <w:webHidden/>
           </w:rPr>
-          <w:instrText xml:space="preserve"> PAGEREF _Toc243299955 \h </w:instrText>
+          <w:instrText xml:space="preserve"> PAGEREF _Toc243389802 \h </w:instrText>
         </w:r>
         <w:r>
           <w:rPr>
@@ -4174,7 +4166,7 @@
           <w14:ligatures w14:val="standardContextual"/>
         </w:rPr>
       </w:pPr>
-      <w:hyperlink w:anchor="_Toc243299956" w:history="1">
+      <w:hyperlink w:anchor="_Toc243389803" w:history="1">
         <w:r>
           <w:rPr>
             <w:rStyle w:val="Hyperlink"/>
@@ -4201,7 +4193,7 @@
             <w:noProof/>
             <w:webHidden/>
           </w:rPr>
-          <w:instrText xml:space="preserve"> PAGEREF _Toc243299956 \h </w:instrText>
+          <w:instrText xml:space="preserve"> PAGEREF _Toc243389803 \h </w:instrText>
         </w:r>
         <w:r>
           <w:rPr>
@@ -4248,7 +4240,7 @@
           <w14:ligatures w14:val="standardContextual"/>
         </w:rPr>
       </w:pPr>
-      <w:hyperlink w:anchor="_Toc243299957" w:history="1">
+      <w:hyperlink w:anchor="_Toc243389804" w:history="1">
         <w:r>
           <w:rPr>
             <w:rStyle w:val="Hyperlink"/>
@@ -4275,7 +4267,7 @@
             <w:noProof/>
             <w:webHidden/>
           </w:rPr>
-          <w:instrText xml:space="preserve"> PAGEREF _Toc243299957 \h </w:instrText>
+          <w:instrText xml:space="preserve"> PAGEREF _Toc243389804 \h </w:instrText>
         </w:r>
         <w:r>
           <w:rPr>
@@ -4322,7 +4314,7 @@
           <w14:ligatures w14:val="standardContextual"/>
         </w:rPr>
       </w:pPr>
-      <w:hyperlink w:anchor="_Toc243299958" w:history="1">
+      <w:hyperlink w:anchor="_Toc243389805" w:history="1">
         <w:r>
           <w:rPr>
             <w:rStyle w:val="Hyperlink"/>
@@ -4349,7 +4341,7 @@
             <w:noProof/>
             <w:webHidden/>
           </w:rPr>
-          <w:instrText xml:space="preserve"> PAGEREF _Toc243299958 \h </w:instrText>
+          <w:instrText xml:space="preserve"> PAGEREF _Toc243389805 \h </w:instrText>
         </w:r>
         <w:r>
           <w:rPr>
@@ -4396,7 +4388,7 @@
           <w14:ligatures w14:val="standardContextual"/>
         </w:rPr>
       </w:pPr>
-      <w:hyperlink w:anchor="_Toc243299959" w:history="1">
+      <w:hyperlink w:anchor="_Toc243389806" w:history="1">
         <w:r>
           <w:rPr>
             <w:rStyle w:val="Hyperlink"/>
@@ -4423,7 +4415,7 @@
             <w:noProof/>
             <w:webHidden/>
           </w:rPr>
-          <w:instrText xml:space="preserve"> PAGEREF _Toc243299959 \h </w:instrText>
+          <w:instrText xml:space="preserve"> PAGEREF _Toc243389806 \h </w:instrText>
         </w:r>
         <w:r>
           <w:rPr>
@@ -4470,7 +4462,7 @@
           <w14:ligatures w14:val="standardContextual"/>
         </w:rPr>
       </w:pPr>
-      <w:hyperlink w:anchor="_Toc243299960" w:history="1">
+      <w:hyperlink w:anchor="_Toc243389807" w:history="1">
         <w:r>
           <w:rPr>
             <w:rStyle w:val="Hyperlink"/>
@@ -4497,7 +4489,7 @@
             <w:noProof/>
             <w:webHidden/>
           </w:rPr>
-          <w:instrText xml:space="preserve"> PAGEREF _Toc243299960 \h </w:instrText>
+          <w:instrText xml:space="preserve"> PAGEREF _Toc243389807 \h </w:instrText>
         </w:r>
         <w:r>
           <w:rPr>
@@ -4544,7 +4536,7 @@
           <w14:ligatures w14:val="standardContextual"/>
         </w:rPr>
       </w:pPr>
-      <w:hyperlink w:anchor="_Toc243299961" w:history="1">
+      <w:hyperlink w:anchor="_Toc243389808" w:history="1">
         <w:r>
           <w:rPr>
             <w:rStyle w:val="Hyperlink"/>
@@ -4571,7 +4563,7 @@
             <w:noProof/>
             <w:webHidden/>
           </w:rPr>
-          <w:instrText xml:space="preserve"> PAGEREF _Toc243299961 \h </w:instrText>
+          <w:instrText xml:space="preserve"> PAGEREF _Toc243389808 \h </w:instrText>
         </w:r>
         <w:r>
           <w:rPr>
@@ -4618,7 +4610,7 @@
           <w14:ligatures w14:val="standardContextual"/>
         </w:rPr>
       </w:pPr>
-      <w:hyperlink w:anchor="_Toc243299962" w:history="1">
+      <w:hyperlink w:anchor="_Toc243389809" w:history="1">
         <w:r>
           <w:rPr>
             <w:rStyle w:val="Hyperlink"/>
@@ -4645,7 +4637,7 @@
             <w:noProof/>
             <w:webHidden/>
           </w:rPr>
-          <w:instrText xml:space="preserve"> PAGEREF _Toc243299962 \h </w:instrText>
+          <w:instrText xml:space="preserve"> PAGEREF _Toc243389809 \h </w:instrText>
         </w:r>
         <w:r>
           <w:rPr>
@@ -4692,7 +4684,7 @@
           <w14:ligatures w14:val="standardContextual"/>
         </w:rPr>
       </w:pPr>
-      <w:hyperlink w:anchor="_Toc243299963" w:history="1">
+      <w:hyperlink w:anchor="_Toc243389810" w:history="1">
         <w:r>
           <w:rPr>
             <w:rStyle w:val="Hyperlink"/>
@@ -4719,7 +4711,7 @@
             <w:noProof/>
             <w:webHidden/>
           </w:rPr>
-          <w:instrText xml:space="preserve"> PAGEREF _Toc243299963 \h </w:instrText>
+          <w:instrText xml:space="preserve"> PAGEREF _Toc243389810 \h </w:instrText>
         </w:r>
         <w:r>
           <w:rPr>
@@ -4766,7 +4758,7 @@
           <w14:ligatures w14:val="standardContextual"/>
         </w:rPr>
       </w:pPr>
-      <w:hyperlink w:anchor="_Toc243299964" w:history="1">
+      <w:hyperlink w:anchor="_Toc243389811" w:history="1">
         <w:r>
           <w:rPr>
             <w:rStyle w:val="Hyperlink"/>
@@ -4793,7 +4785,7 @@
             <w:noProof/>
             <w:webHidden/>
           </w:rPr>
-          <w:instrText xml:space="preserve"> PAGEREF _Toc243299964 \h </w:instrText>
+          <w:instrText xml:space="preserve"> PAGEREF _Toc243389811 \h </w:instrText>
         </w:r>
         <w:r>
           <w:rPr>
@@ -4840,7 +4832,7 @@
           <w14:ligatures w14:val="standardContextual"/>
         </w:rPr>
       </w:pPr>
-      <w:hyperlink w:anchor="_Toc243299965" w:history="1">
+      <w:hyperlink w:anchor="_Toc243389812" w:history="1">
         <w:r>
           <w:rPr>
             <w:rStyle w:val="Hyperlink"/>
@@ -4867,7 +4859,7 @@
             <w:noProof/>
             <w:webHidden/>
           </w:rPr>
-          <w:instrText xml:space="preserve"> PAGEREF _Toc243299965 \h </w:instrText>
+          <w:instrText xml:space="preserve"> PAGEREF _Toc243389812 \h </w:instrText>
         </w:r>
         <w:r>
           <w:rPr>
@@ -4914,7 +4906,7 @@
           <w14:ligatures w14:val="standardContextual"/>
         </w:rPr>
       </w:pPr>
-      <w:hyperlink w:anchor="_Toc243299966" w:history="1">
+      <w:hyperlink w:anchor="_Toc243389813" w:history="1">
         <w:r>
           <w:rPr>
             <w:rStyle w:val="Hyperlink"/>
@@ -4941,7 +4933,7 @@
             <w:noProof/>
             <w:webHidden/>
           </w:rPr>
-          <w:instrText xml:space="preserve"> PAGEREF _Toc243299966 \h </w:instrText>
+          <w:instrText xml:space="preserve"> PAGEREF _Toc243389813 \h </w:instrText>
         </w:r>
         <w:r>
           <w:rPr>
@@ -4988,7 +4980,7 @@
           <w14:ligatures w14:val="standardContextual"/>
         </w:rPr>
       </w:pPr>
-      <w:hyperlink w:anchor="_Toc243299967" w:history="1">
+      <w:hyperlink w:anchor="_Toc243389814" w:history="1">
         <w:r>
           <w:rPr>
             <w:rStyle w:val="Hyperlink"/>
@@ -5015,7 +5007,7 @@
             <w:noProof/>
             <w:webHidden/>
           </w:rPr>
-          <w:instrText xml:space="preserve"> PAGEREF _Toc243299967 \h </w:instrText>
+          <w:instrText xml:space="preserve"> PAGEREF _Toc243389814 \h </w:instrText>
         </w:r>
         <w:r>
           <w:rPr>
@@ -5062,7 +5054,7 @@
           <w14:ligatures w14:val="standardContextual"/>
         </w:rPr>
       </w:pPr>
-      <w:hyperlink w:anchor="_Toc243299968" w:history="1">
+      <w:hyperlink w:anchor="_Toc243389815" w:history="1">
         <w:r>
           <w:rPr>
             <w:rStyle w:val="Hyperlink"/>
@@ -5089,7 +5081,7 @@
             <w:noProof/>
             <w:webHidden/>
           </w:rPr>
-          <w:instrText xml:space="preserve"> PAGEREF _Toc243299968 \h </w:instrText>
+          <w:instrText xml:space="preserve"> PAGEREF _Toc243389815 \h </w:instrText>
         </w:r>
         <w:r>
           <w:rPr>
@@ -5136,7 +5128,7 @@
           <w14:ligatures w14:val="standardContextual"/>
         </w:rPr>
       </w:pPr>
-      <w:hyperlink w:anchor="_Toc243299969" w:history="1">
+      <w:hyperlink w:anchor="_Toc243389816" w:history="1">
         <w:r>
           <w:rPr>
             <w:rStyle w:val="Hyperlink"/>
@@ -5163,7 +5155,81 @@
             <w:noProof/>
             <w:webHidden/>
           </w:rPr>
-          <w:instrText xml:space="preserve"> PAGEREF _Toc243299969 \h </w:instrText>
+          <w:instrText xml:space="preserve"> PAGEREF _Toc243389816 \h </w:instrText>
+        </w:r>
+        <w:r>
+          <w:rPr>
+            <w:noProof/>
+            <w:webHidden/>
+          </w:rPr>
+        </w:r>
+        <w:r>
+          <w:rPr>
+            <w:noProof/>
+            <w:webHidden/>
+          </w:rPr>
+          <w:fldChar w:fldCharType="separate"/>
+        </w:r>
+        <w:r>
+          <w:rPr>
+            <w:noProof/>
+            <w:webHidden/>
+          </w:rPr>
+          <w:t>26</w:t>
+        </w:r>
+        <w:r>
+          <w:rPr>
+            <w:noProof/>
+            <w:webHidden/>
+          </w:rPr>
+          <w:fldChar w:fldCharType="end"/>
+        </w:r>
+      </w:hyperlink>
+    </w:p>
+    <w:p>
+      <w:pPr>
+        <w:pStyle w:val="TOC2"/>
+        <w:tabs>
+          <w:tab w:val="right" w:leader="dot" w:pos="8630"/>
+        </w:tabs>
+        <w:rPr>
+          <w:rFonts w:asciiTheme="minorHAnsi" w:hAnsiTheme="minorHAnsi"/>
+          <w:noProof/>
+          <w:kern w:val="2"/>
+          <w:sz w:val="24"/>
+          <w:szCs w:val="24"/>
+          <w:lang w:val="en-GB" w:eastAsia="en-GB"/>
+          <w14:ligatures w14:val="standardContextual"/>
+        </w:rPr>
+      </w:pPr>
+      <w:hyperlink w:anchor="_Toc243389817" w:history="1">
+        <w:r>
+          <w:rPr>
+            <w:rStyle w:val="Hyperlink"/>
+            <w:noProof/>
+          </w:rPr>
+          <w:t>13.5 Currencies</w:t>
+        </w:r>
+        <w:r>
+          <w:rPr>
+            <w:noProof/>
+            <w:webHidden/>
+          </w:rPr>
+          <w:tab/>
+        </w:r>
+        <w:r>
+          <w:rPr>
+            <w:noProof/>
+            <w:webHidden/>
+          </w:rPr>
+          <w:fldChar w:fldCharType="begin"/>
+        </w:r>
+        <w:r>
+          <w:rPr>
+            <w:noProof/>
+            <w:webHidden/>
+          </w:rPr>
+          <w:instrText xml:space="preserve"> PAGEREF _Toc243389817 \h </w:instrText>
         </w:r>
         <w:r>
           <w:rPr>
@@ -5210,7 +5276,7 @@
           <w14:ligatures w14:val="standardContextual"/>
         </w:rPr>
       </w:pPr>
-      <w:hyperlink w:anchor="_Toc243299970" w:history="1">
+      <w:hyperlink w:anchor="_Toc243389818" w:history="1">
         <w:r>
           <w:rPr>
             <w:rStyle w:val="Hyperlink"/>
@@ -5237,7 +5303,7 @@
             <w:noProof/>
             <w:webHidden/>
           </w:rPr>
-          <w:instrText xml:space="preserve"> PAGEREF _Toc243299970 \h </w:instrText>
+          <w:instrText xml:space="preserve"> PAGEREF _Toc243389818 \h </w:instrText>
         </w:r>
         <w:r>
           <w:rPr>
@@ -5257,7 +5323,7 @@
             <w:noProof/>
             <w:webHidden/>
           </w:rPr>
-          <w:t>27</w:t>
+          <w:t>28</w:t>
         </w:r>
         <w:r>
           <w:rPr>
@@ -5284,7 +5350,7 @@
           <w14:ligatures w14:val="standardContextual"/>
         </w:rPr>
       </w:pPr>
-      <w:hyperlink w:anchor="_Toc243299971" w:history="1">
+      <w:hyperlink w:anchor="_Toc243389819" w:history="1">
         <w:r>
           <w:rPr>
             <w:rStyle w:val="Hyperlink"/>
@@ -5311,7 +5377,7 @@
             <w:noProof/>
             <w:webHidden/>
           </w:rPr>
-          <w:instrText xml:space="preserve"> PAGEREF _Toc243299971 \h </w:instrText>
+          <w:instrText xml:space="preserve"> PAGEREF _Toc243389819 \h </w:instrText>
         </w:r>
         <w:r>
           <w:rPr>
@@ -5331,7 +5397,7 @@
             <w:noProof/>
             <w:webHidden/>
           </w:rPr>
-          <w:t>27</w:t>
+          <w:t>28</w:t>
         </w:r>
         <w:r>
           <w:rPr>
@@ -5358,7 +5424,7 @@
           <w14:ligatures w14:val="standardContextual"/>
         </w:rPr>
       </w:pPr>
-      <w:hyperlink w:anchor="_Toc243299972" w:history="1">
+      <w:hyperlink w:anchor="_Toc243389820" w:history="1">
         <w:r>
           <w:rPr>
             <w:rStyle w:val="Hyperlink"/>
@@ -5385,7 +5451,7 @@
             <w:noProof/>
             <w:webHidden/>
           </w:rPr>
-          <w:instrText xml:space="preserve"> PAGEREF _Toc243299972 \h </w:instrText>
+          <w:instrText xml:space="preserve"> PAGEREF _Toc243389820 \h </w:instrText>
         </w:r>
         <w:r>
           <w:rPr>
@@ -5405,7 +5471,7 @@
             <w:noProof/>
             <w:webHidden/>
           </w:rPr>
-          <w:t>27</w:t>
+          <w:t>28</w:t>
         </w:r>
         <w:r>
           <w:rPr>
@@ -5432,7 +5498,7 @@
           <w14:ligatures w14:val="standardContextual"/>
         </w:rPr>
       </w:pPr>
-      <w:hyperlink w:anchor="_Toc243299973" w:history="1">
+      <w:hyperlink w:anchor="_Toc243389821" w:history="1">
         <w:r>
           <w:rPr>
             <w:rStyle w:val="Hyperlink"/>
@@ -5459,7 +5525,7 @@
             <w:noProof/>
             <w:webHidden/>
           </w:rPr>
-          <w:instrText xml:space="preserve"> PAGEREF _Toc243299973 \h </w:instrText>
+          <w:instrText xml:space="preserve"> PAGEREF _Toc243389821 \h </w:instrText>
         </w:r>
         <w:r>
           <w:rPr>
@@ -5479,7 +5545,7 @@
             <w:noProof/>
             <w:webHidden/>
           </w:rPr>
-          <w:t>28</w:t>
+          <w:t>29</w:t>
         </w:r>
         <w:r>
           <w:rPr>
@@ -5506,7 +5572,7 @@
           <w14:ligatures w14:val="standardContextual"/>
         </w:rPr>
       </w:pPr>
-      <w:hyperlink w:anchor="_Toc243299974" w:history="1">
+      <w:hyperlink w:anchor="_Toc243389822" w:history="1">
         <w:r>
           <w:rPr>
             <w:rStyle w:val="Hyperlink"/>
@@ -5533,7 +5599,7 @@
             <w:noProof/>
             <w:webHidden/>
           </w:rPr>
-          <w:instrText xml:space="preserve"> PAGEREF _Toc243299974 \h </w:instrText>
+          <w:instrText xml:space="preserve"> PAGEREF _Toc243389822 \h </w:instrText>
         </w:r>
         <w:r>
           <w:rPr>
@@ -5553,7 +5619,7 @@
             <w:noProof/>
             <w:webHidden/>
           </w:rPr>
-          <w:t>30</w:t>
+          <w:t>31</w:t>
         </w:r>
         <w:r>
           <w:rPr>
@@ -5580,7 +5646,7 @@
         <w:pStyle w:val="Heading1"/>
         <w:pageBreakBefore/>
       </w:pPr>
-      <w:bookmarkStart w:id="2" w:name="_Toc243299902"/>
+      <w:bookmarkStart w:id="2" w:name="_Toc243389749"/>
       <w:r>
         <w:rPr>
           <w:color w:val="1D4E89"/>
@@ -5593,7 +5659,7 @@
       <w:pPr>
         <w:pStyle w:val="Heading2"/>
       </w:pPr>
-      <w:bookmarkStart w:id="3" w:name="_Toc243299903"/>
+      <w:bookmarkStart w:id="3" w:name="_Toc243389750"/>
       <w:r>
         <w:rPr>
           <w:color w:val="1D4E89"/>
@@ -5696,7 +5762,7 @@
       <w:pPr>
         <w:pStyle w:val="Heading2"/>
       </w:pPr>
-      <w:bookmarkStart w:id="4" w:name="_Toc243299904"/>
+      <w:bookmarkStart w:id="4" w:name="_Toc243389751"/>
       <w:r>
         <w:rPr>
           <w:color w:val="1D4E89"/>
@@ -5714,7 +5780,7 @@
       <w:pPr>
         <w:pStyle w:val="Heading2"/>
       </w:pPr>
-      <w:bookmarkStart w:id="5" w:name="_Toc243299905"/>
+      <w:bookmarkStart w:id="5" w:name="_Toc243389752"/>
       <w:r>
         <w:rPr>
           <w:color w:val="1D4E89"/>
@@ -5732,7 +5798,7 @@
       <w:pPr>
         <w:pStyle w:val="Heading2"/>
       </w:pPr>
-      <w:bookmarkStart w:id="6" w:name="_Toc243299906"/>
+      <w:bookmarkStart w:id="6" w:name="_Toc243389753"/>
       <w:r>
         <w:rPr>
           <w:color w:val="1D4E89"/>
@@ -5793,7 +5859,7 @@
       <w:pPr>
         <w:pStyle w:val="Heading2"/>
       </w:pPr>
-      <w:bookmarkStart w:id="7" w:name="_Toc243299907"/>
+      <w:bookmarkStart w:id="7" w:name="_Toc243389754"/>
       <w:r>
         <w:rPr>
           <w:color w:val="1D4E89"/>
@@ -6461,7 +6527,7 @@
           </w:tcPr>
           <w:p>
             <w:r>
-              <w:t>Users, settings, expense categories, audit log</w:t>
+              <w:t>Users, settings, currencies, expense categories, audit log</w:t>
             </w:r>
           </w:p>
         </w:tc>
@@ -6552,7 +6618,7 @@
         <w:pStyle w:val="Heading1"/>
         <w:pageBreakBefore/>
       </w:pPr>
-      <w:bookmarkStart w:id="8" w:name="_Toc243299908"/>
+      <w:bookmarkStart w:id="8" w:name="_Toc243389755"/>
       <w:r>
         <w:rPr>
           <w:color w:val="1D4E89"/>
@@ -6565,7 +6631,7 @@
       <w:pPr>
         <w:pStyle w:val="Heading2"/>
       </w:pPr>
-      <w:bookmarkStart w:id="9" w:name="_Toc243299909"/>
+      <w:bookmarkStart w:id="9" w:name="_Toc243389756"/>
       <w:r>
         <w:rPr>
           <w:color w:val="1D4E89"/>
@@ -6664,7 +6730,7 @@
       <w:pPr>
         <w:pStyle w:val="Heading2"/>
       </w:pPr>
-      <w:bookmarkStart w:id="10" w:name="_Toc243299910"/>
+      <w:bookmarkStart w:id="10" w:name="_Toc243389757"/>
       <w:r>
         <w:rPr>
           <w:color w:val="1D4E89"/>
@@ -6701,7 +6767,7 @@
       <w:pPr>
         <w:pStyle w:val="Heading2"/>
       </w:pPr>
-      <w:bookmarkStart w:id="11" w:name="_Toc243299911"/>
+      <w:bookmarkStart w:id="11" w:name="_Toc243389758"/>
       <w:r>
         <w:rPr>
           <w:color w:val="1D4E89"/>
@@ -6974,7 +7040,7 @@
               <w:cnfStyle w:val="000000100000" w:firstRow="0" w:lastRow="0" w:firstColumn="0" w:lastColumn="0" w:oddVBand="0" w:evenVBand="0" w:oddHBand="1" w:evenHBand="0" w:firstRowFirstColumn="0" w:firstRowLastColumn="0" w:lastRowFirstColumn="0" w:lastRowLastColumn="0"/>
             </w:pPr>
             <w:r>
-              <w:t>Expense Categories, Users, Settings, Audit Log</w:t>
+              <w:t>Currencies, Expense Categories, Users, Settings, Audit Log</w:t>
             </w:r>
           </w:p>
         </w:tc>
@@ -7022,7 +7088,7 @@
       <w:pPr>
         <w:pStyle w:val="Heading2"/>
       </w:pPr>
-      <w:bookmarkStart w:id="12" w:name="_Toc243299912"/>
+      <w:bookmarkStart w:id="12" w:name="_Toc243389759"/>
       <w:r>
         <w:rPr>
           <w:color w:val="1D4E89"/>
@@ -7218,7 +7284,7 @@
       <w:pPr>
         <w:pStyle w:val="Heading2"/>
       </w:pPr>
-      <w:bookmarkStart w:id="13" w:name="_Toc243299913"/>
+      <w:bookmarkStart w:id="13" w:name="_Toc243389760"/>
       <w:r>
         <w:rPr>
           <w:color w:val="1D4E89"/>
@@ -7277,7 +7343,7 @@
         <w:pStyle w:val="Heading1"/>
         <w:pageBreakBefore/>
       </w:pPr>
-      <w:bookmarkStart w:id="14" w:name="_Toc243299914"/>
+      <w:bookmarkStart w:id="14" w:name="_Toc243389761"/>
       <w:r>
         <w:rPr>
           <w:color w:val="1D4E89"/>
@@ -7335,7 +7401,7 @@
       <w:pPr>
         <w:pStyle w:val="Heading2"/>
       </w:pPr>
-      <w:bookmarkStart w:id="15" w:name="_Toc243299915"/>
+      <w:bookmarkStart w:id="15" w:name="_Toc243389762"/>
       <w:r>
         <w:rPr>
           <w:color w:val="1D4E89"/>
@@ -7632,7 +7698,7 @@
       <w:pPr>
         <w:pStyle w:val="Heading2"/>
       </w:pPr>
-      <w:bookmarkStart w:id="16" w:name="_Toc243299916"/>
+      <w:bookmarkStart w:id="16" w:name="_Toc243389763"/>
       <w:r>
         <w:rPr>
           <w:color w:val="1D4E89"/>
@@ -7769,7 +7835,7 @@
       <w:pPr>
         <w:pStyle w:val="Heading2"/>
       </w:pPr>
-      <w:bookmarkStart w:id="17" w:name="_Toc243299917"/>
+      <w:bookmarkStart w:id="17" w:name="_Toc243389764"/>
       <w:r>
         <w:rPr>
           <w:color w:val="1D4E89"/>
@@ -7780,7 +7846,7 @@
     </w:p>
     <w:p>
       <w:r>
-        <w:t>On the request page, click “+ Add Quote” (or “+ Revise Quote” once there is one). Enter the Amount, the Currency, the date the quote is Valid Until (today or later), and any Notes, then click “Save Quote.”</w:t>
+        <w:t>On the request page, click “+ Add Quote” (or “+ Revise Quote” once there is one). Enter the Amount, choose the Currency (it starts as the latest quote’s currency, or else the client’s default), set the date the quote is Valid Until (today or later), add any Notes, then click “Save Quote.”</w:t>
       </w:r>
     </w:p>
     <w:p>
@@ -7811,7 +7877,7 @@
       <w:pPr>
         <w:pStyle w:val="Heading2"/>
       </w:pPr>
-      <w:bookmarkStart w:id="18" w:name="_Toc243299918"/>
+      <w:bookmarkStart w:id="18" w:name="_Toc243389765"/>
       <w:r>
         <w:rPr>
           <w:color w:val="1D4E89"/>
@@ -7834,7 +7900,7 @@
       <w:pPr>
         <w:pStyle w:val="Heading2"/>
       </w:pPr>
-      <w:bookmarkStart w:id="19" w:name="_Toc243299919"/>
+      <w:bookmarkStart w:id="19" w:name="_Toc243389766"/>
       <w:r>
         <w:rPr>
           <w:color w:val="1D4E89"/>
@@ -7863,7 +7929,7 @@
       <w:pPr>
         <w:pStyle w:val="Heading2"/>
       </w:pPr>
-      <w:bookmarkStart w:id="20" w:name="_Toc243299920"/>
+      <w:bookmarkStart w:id="20" w:name="_Toc243389767"/>
       <w:r>
         <w:rPr>
           <w:color w:val="1D4E89"/>
@@ -7882,7 +7948,7 @@
         <w:pStyle w:val="Heading1"/>
         <w:pageBreakBefore/>
       </w:pPr>
-      <w:bookmarkStart w:id="21" w:name="_Toc243299921"/>
+      <w:bookmarkStart w:id="21" w:name="_Toc243389768"/>
       <w:r>
         <w:rPr>
           <w:color w:val="1D4E89"/>
@@ -7940,7 +8006,7 @@
       <w:pPr>
         <w:pStyle w:val="Heading2"/>
       </w:pPr>
-      <w:bookmarkStart w:id="22" w:name="_Toc243299922"/>
+      <w:bookmarkStart w:id="22" w:name="_Toc243389769"/>
       <w:r>
         <w:rPr>
           <w:color w:val="1D4E89"/>
@@ -7999,7 +8065,7 @@
         </w:numPr>
       </w:pPr>
       <w:r>
-        <w:t>Admins also see Trip Value, Currency and Exchange Rate, filled in from the latest quote. Check them.</w:t>
+        <w:t>Admins also see Trip Value, Currency and Exchange Rate. The value and currency come from the latest quote, and the rate is today’s rate from the currency list (section 13.5). Check them: for any currency other than GHS, the rate is required.</w:t>
       </w:r>
     </w:p>
     <w:p>
@@ -8103,7 +8169,7 @@
       <w:pPr>
         <w:pStyle w:val="Heading2"/>
       </w:pPr>
-      <w:bookmarkStart w:id="23" w:name="_Toc243299923"/>
+      <w:bookmarkStart w:id="23" w:name="_Toc243389770"/>
       <w:r>
         <w:rPr>
           <w:color w:val="1D4E89"/>
@@ -8541,7 +8607,7 @@
       <w:pPr>
         <w:pStyle w:val="Heading2"/>
       </w:pPr>
-      <w:bookmarkStart w:id="24" w:name="_Toc243299924"/>
+      <w:bookmarkStart w:id="24" w:name="_Toc243389771"/>
       <w:r>
         <w:rPr>
           <w:color w:val="1D4E89"/>
@@ -8615,7 +8681,7 @@
       <w:pPr>
         <w:pStyle w:val="Heading2"/>
       </w:pPr>
-      <w:bookmarkStart w:id="25" w:name="_Toc243299925"/>
+      <w:bookmarkStart w:id="25" w:name="_Toc243389772"/>
       <w:r>
         <w:rPr>
           <w:color w:val="1D4E89"/>
@@ -8633,7 +8699,7 @@
       <w:pPr>
         <w:pStyle w:val="Heading2"/>
       </w:pPr>
-      <w:bookmarkStart w:id="26" w:name="_Toc243299926"/>
+      <w:bookmarkStart w:id="26" w:name="_Toc243389773"/>
       <w:r>
         <w:rPr>
           <w:color w:val="1D4E89"/>
@@ -8727,7 +8793,7 @@
         </w:numPr>
       </w:pPr>
       <w:r>
-        <w:t>Enter the Amount, the Currency and, for a foreign currency, the Exchange Rate to cedis. Add a Description, the date, and attach a photo or scan of the Receipt if you have one.</w:t>
+        <w:t>Enter the Amount and choose the Currency. Choosing a currency fills in its Exchange Rate to cedis from the currency list; change it if you paid at a different rate. Add a Description, the date, and attach a photo or scan of the Receipt if you have one.</w:t>
       </w:r>
     </w:p>
     <w:p>
@@ -8791,7 +8857,7 @@
       <w:pPr>
         <w:pStyle w:val="Heading2"/>
       </w:pPr>
-      <w:bookmarkStart w:id="27" w:name="_Toc243299927"/>
+      <w:bookmarkStart w:id="27" w:name="_Toc243389774"/>
       <w:r>
         <w:rPr>
           <w:color w:val="1D4E89"/>
@@ -8809,7 +8875,7 @@
       <w:pPr>
         <w:pStyle w:val="Heading2"/>
       </w:pPr>
-      <w:bookmarkStart w:id="28" w:name="_Toc243299928"/>
+      <w:bookmarkStart w:id="28" w:name="_Toc243389775"/>
       <w:r>
         <w:rPr>
           <w:color w:val="1D4E89"/>
@@ -8887,7 +8953,7 @@
         <w:pStyle w:val="Heading1"/>
         <w:pageBreakBefore/>
       </w:pPr>
-      <w:bookmarkStart w:id="29" w:name="_Toc243299929"/>
+      <w:bookmarkStart w:id="29" w:name="_Toc243389776"/>
       <w:r>
         <w:rPr>
           <w:color w:val="1D4E89"/>
@@ -8940,7 +9006,7 @@
       <w:pPr>
         <w:pStyle w:val="Heading2"/>
       </w:pPr>
-      <w:bookmarkStart w:id="30" w:name="_Toc243299930"/>
+      <w:bookmarkStart w:id="30" w:name="_Toc243389777"/>
       <w:r>
         <w:rPr>
           <w:color w:val="1D4E89"/>
@@ -9217,7 +9283,7 @@
       <w:pPr>
         <w:pStyle w:val="Heading2"/>
       </w:pPr>
-      <w:bookmarkStart w:id="31" w:name="_Toc243299931"/>
+      <w:bookmarkStart w:id="31" w:name="_Toc243389778"/>
       <w:r>
         <w:rPr>
           <w:color w:val="1D4E89"/>
@@ -9281,7 +9347,7 @@
         <w:pStyle w:val="Heading1"/>
         <w:pageBreakBefore/>
       </w:pPr>
-      <w:bookmarkStart w:id="32" w:name="_Toc243299932"/>
+      <w:bookmarkStart w:id="32" w:name="_Toc243389779"/>
       <w:r>
         <w:rPr>
           <w:color w:val="1D4E89"/>
@@ -9294,7 +9360,7 @@
       <w:pPr>
         <w:pStyle w:val="Heading2"/>
       </w:pPr>
-      <w:bookmarkStart w:id="33" w:name="_Toc243299933"/>
+      <w:bookmarkStart w:id="33" w:name="_Toc243389780"/>
       <w:r>
         <w:rPr>
           <w:color w:val="1D4E89"/>
@@ -9357,7 +9423,7 @@
       <w:pPr>
         <w:pStyle w:val="Heading2"/>
       </w:pPr>
-      <w:bookmarkStart w:id="34" w:name="_Toc243299934"/>
+      <w:bookmarkStart w:id="34" w:name="_Toc243389781"/>
       <w:r>
         <w:rPr>
           <w:color w:val="1D4E89"/>
@@ -9421,7 +9487,7 @@
         <w:pStyle w:val="Heading1"/>
         <w:pageBreakBefore/>
       </w:pPr>
-      <w:bookmarkStart w:id="35" w:name="_Toc243299935"/>
+      <w:bookmarkStart w:id="35" w:name="_Toc243389782"/>
       <w:r>
         <w:rPr>
           <w:color w:val="1D4E89"/>
@@ -9474,7 +9540,7 @@
       <w:pPr>
         <w:pStyle w:val="Heading2"/>
       </w:pPr>
-      <w:bookmarkStart w:id="36" w:name="_Toc243299936"/>
+      <w:bookmarkStart w:id="36" w:name="_Toc243389783"/>
       <w:r>
         <w:rPr>
           <w:color w:val="1D4E89"/>
@@ -9516,7 +9582,7 @@
         </w:numPr>
       </w:pPr>
       <w:r>
-        <w:t>Optionally add the Address, City, Region, Country, Default Currency and Notes.</w:t>
+        <w:t>Optionally add the Address, City, Region, Country and Notes, and choose the Default Currency. New quotes for the client start in that currency, but any quote, trip or invoice can use another one if you have agreed it.</w:t>
       </w:r>
     </w:p>
     <w:p>
@@ -9535,7 +9601,7 @@
       <w:pPr>
         <w:pStyle w:val="Heading2"/>
       </w:pPr>
-      <w:bookmarkStart w:id="37" w:name="_Toc243299937"/>
+      <w:bookmarkStart w:id="37" w:name="_Toc243389784"/>
       <w:r>
         <w:rPr>
           <w:color w:val="1D4E89"/>
@@ -9609,7 +9675,7 @@
       <w:pPr>
         <w:pStyle w:val="Heading2"/>
       </w:pPr>
-      <w:bookmarkStart w:id="38" w:name="_Toc243299938"/>
+      <w:bookmarkStart w:id="38" w:name="_Toc243389785"/>
       <w:r>
         <w:rPr>
           <w:color w:val="1D4E89"/>
@@ -9691,7 +9757,7 @@
       <w:pPr>
         <w:pStyle w:val="Heading2"/>
       </w:pPr>
-      <w:bookmarkStart w:id="39" w:name="_Toc243299939"/>
+      <w:bookmarkStart w:id="39" w:name="_Toc243389786"/>
       <w:r>
         <w:rPr>
           <w:color w:val="1D4E89"/>
@@ -9710,7 +9776,7 @@
         <w:pStyle w:val="Heading1"/>
         <w:pageBreakBefore/>
       </w:pPr>
-      <w:bookmarkStart w:id="40" w:name="_Toc243299940"/>
+      <w:bookmarkStart w:id="40" w:name="_Toc243389787"/>
       <w:r>
         <w:rPr>
           <w:color w:val="1D4E89"/>
@@ -9763,7 +9829,7 @@
       <w:pPr>
         <w:pStyle w:val="Heading2"/>
       </w:pPr>
-      <w:bookmarkStart w:id="41" w:name="_Toc243299941"/>
+      <w:bookmarkStart w:id="41" w:name="_Toc243389788"/>
       <w:r>
         <w:rPr>
           <w:color w:val="1D4E89"/>
@@ -9981,7 +10047,7 @@
       <w:pPr>
         <w:pStyle w:val="Heading2"/>
       </w:pPr>
-      <w:bookmarkStart w:id="42" w:name="_Toc243299942"/>
+      <w:bookmarkStart w:id="42" w:name="_Toc243389789"/>
       <w:r>
         <w:rPr>
           <w:color w:val="1D4E89"/>
@@ -10065,7 +10131,7 @@
         </w:numPr>
       </w:pPr>
       <w:r>
-        <w:t>Set the Invoice Date, the Due Date (on or after the invoice date) and the Tax Rate (%) if you charge tax. Add any Notes.</w:t>
+        <w:t>Check the Currency and Exchange Rate. They start as the first selected trip’s currency (or else the client’s default) and today’s rate from the currency list (section 13.5). Change them if you agreed otherwise. If some trips are priced in another currency, a note reminds you to convert their prices.</w:t>
       </w:r>
     </w:p>
     <w:p>
@@ -10077,7 +10143,7 @@
         </w:numPr>
       </w:pPr>
       <w:r>
-        <w:t>Decide whether to tick “Show itemized trip expenses on PDF” (see section 8.4).</w:t>
+        <w:t>Set the Invoice Date, the Due Date (on or after the invoice date) and the Tax Rate (%) if you charge tax. Add any Notes.</w:t>
       </w:r>
     </w:p>
     <w:p>
@@ -10089,19 +10155,31 @@
         </w:numPr>
       </w:pPr>
       <w:r>
+        <w:t>Decide whether to tick “Show itemized trip expenses on PDF” (see section 8.4).</w:t>
+      </w:r>
+    </w:p>
+    <w:p>
+      <w:pPr>
+        <w:pStyle w:val="ListNumber"/>
+        <w:numPr>
+          <w:ilvl w:val="0"/>
+          <w:numId w:val="13"/>
+        </w:numPr>
+      </w:pPr>
+      <w:r>
         <w:t>Click “Create Invoice (Draft).” The invoice gets a number such as INV-2026-0001.</w:t>
       </w:r>
     </w:p>
     <w:p>
       <w:r>
-        <w:t>Subtotal, tax and total are worked out for you. The invoice is in the client’s currency, taken from the trips you add.</w:t>
+        <w:t>Subtotal, tax and total are worked out for you, in the invoice’s currency. A draft’s currency and rate can still be changed with “Edit.”</w:t>
       </w:r>
     </w:p>
     <w:p>
       <w:pPr>
         <w:pStyle w:val="Heading2"/>
       </w:pPr>
-      <w:bookmarkStart w:id="43" w:name="_Toc243299943"/>
+      <w:bookmarkStart w:id="43" w:name="_Toc243389790"/>
       <w:r>
         <w:rPr>
           <w:color w:val="1D4E89"/>
@@ -10186,7 +10264,7 @@
       <w:pPr>
         <w:pStyle w:val="Heading2"/>
       </w:pPr>
-      <w:bookmarkStart w:id="44" w:name="_Toc243299944"/>
+      <w:bookmarkStart w:id="44" w:name="_Toc243389791"/>
       <w:r>
         <w:rPr>
           <w:color w:val="1D4E89"/>
@@ -10238,7 +10316,7 @@
         <w:pStyle w:val="Heading1"/>
         <w:pageBreakBefore/>
       </w:pPr>
-      <w:bookmarkStart w:id="45" w:name="_Toc243299945"/>
+      <w:bookmarkStart w:id="45" w:name="_Toc243389792"/>
       <w:r>
         <w:rPr>
           <w:color w:val="1D4E89"/>
@@ -10291,7 +10369,7 @@
       <w:pPr>
         <w:pStyle w:val="Heading2"/>
       </w:pPr>
-      <w:bookmarkStart w:id="46" w:name="_Toc243299946"/>
+      <w:bookmarkStart w:id="46" w:name="_Toc243389793"/>
       <w:r>
         <w:rPr>
           <w:color w:val="1D4E89"/>
@@ -10345,7 +10423,7 @@
         </w:numPr>
       </w:pPr>
       <w:r>
-        <w:t>Enter the Amount, the Currency and, for a foreign currency, the Exchange Rate to cedis.</w:t>
+        <w:t>Enter the Amount and choose the Currency the client paid in. The Exchange Rate to cedis is filled in with today’s rate from the currency list; change it to the rate you actually received.</w:t>
       </w:r>
     </w:p>
     <w:p>
@@ -10421,7 +10499,7 @@
       <w:pPr>
         <w:pStyle w:val="Heading2"/>
       </w:pPr>
-      <w:bookmarkStart w:id="47" w:name="_Toc243299947"/>
+      <w:bookmarkStart w:id="47" w:name="_Toc243389794"/>
       <w:r>
         <w:rPr>
           <w:color w:val="1D4E89"/>
@@ -10439,7 +10517,7 @@
       <w:pPr>
         <w:pStyle w:val="Heading2"/>
       </w:pPr>
-      <w:bookmarkStart w:id="48" w:name="_Toc243299948"/>
+      <w:bookmarkStart w:id="48" w:name="_Toc243389795"/>
       <w:r>
         <w:rPr>
           <w:color w:val="1D4E89"/>
@@ -10498,7 +10576,7 @@
         <w:pStyle w:val="Heading1"/>
         <w:pageBreakBefore/>
       </w:pPr>
-      <w:bookmarkStart w:id="49" w:name="_Toc243299949"/>
+      <w:bookmarkStart w:id="49" w:name="_Toc243389796"/>
       <w:r>
         <w:rPr>
           <w:color w:val="1D4E89"/>
@@ -10556,7 +10634,7 @@
       <w:pPr>
         <w:pStyle w:val="Heading2"/>
       </w:pPr>
-      <w:bookmarkStart w:id="50" w:name="_Toc243299950"/>
+      <w:bookmarkStart w:id="50" w:name="_Toc243389797"/>
       <w:r>
         <w:rPr>
           <w:color w:val="1D4E89"/>
@@ -10574,7 +10652,7 @@
       <w:pPr>
         <w:pStyle w:val="Heading2"/>
       </w:pPr>
-      <w:bookmarkStart w:id="51" w:name="_Toc243299951"/>
+      <w:bookmarkStart w:id="51" w:name="_Toc243389798"/>
       <w:r>
         <w:rPr>
           <w:color w:val="1D4E89"/>
@@ -10659,7 +10737,7 @@
       <w:pPr>
         <w:pStyle w:val="Heading2"/>
       </w:pPr>
-      <w:bookmarkStart w:id="52" w:name="_Toc243299952"/>
+      <w:bookmarkStart w:id="52" w:name="_Toc243389799"/>
       <w:r>
         <w:rPr>
           <w:color w:val="1D4E89"/>
@@ -10677,7 +10755,7 @@
       <w:pPr>
         <w:pStyle w:val="Heading2"/>
       </w:pPr>
-      <w:bookmarkStart w:id="53" w:name="_Toc243299953"/>
+      <w:bookmarkStart w:id="53" w:name="_Toc243389800"/>
       <w:r>
         <w:rPr>
           <w:color w:val="1D4E89"/>
@@ -10722,7 +10800,7 @@
       <w:pPr>
         <w:pStyle w:val="Heading2"/>
       </w:pPr>
-      <w:bookmarkStart w:id="54" w:name="_Toc243299954"/>
+      <w:bookmarkStart w:id="54" w:name="_Toc243389801"/>
       <w:r>
         <w:rPr>
           <w:color w:val="1D4E89"/>
@@ -10733,7 +10811,7 @@
     </w:p>
     <w:p>
       <w:r>
-        <w:t>When the client goes ahead, open the issued proforma and click “Convert to Invoice.” The system creates a draft invoice with the same lines, currency and tax, dated today and due in 30 days, with a note saying which proforma it came from. The proforma becomes Converted, and the invoice shows “Converted From” with a link back.</w:t>
+        <w:t>When the client goes ahead, open the issued proforma and click “Convert to Invoice.” The system creates a draft invoice with the same lines, currency and tax, and today’s exchange rate for that currency, dated today and due in 30 days, with a note saying which proforma it came from. The proforma becomes Converted, and the invoice shows “Converted From” with a link back.</w:t>
       </w:r>
     </w:p>
     <w:p>
@@ -10786,7 +10864,7 @@
         <w:pStyle w:val="Heading1"/>
         <w:pageBreakBefore/>
       </w:pPr>
-      <w:bookmarkStart w:id="55" w:name="_Toc243299955"/>
+      <w:bookmarkStart w:id="55" w:name="_Toc243389802"/>
       <w:r>
         <w:rPr>
           <w:color w:val="1D4E89"/>
@@ -10839,7 +10917,7 @@
       <w:pPr>
         <w:pStyle w:val="Heading2"/>
       </w:pPr>
-      <w:bookmarkStart w:id="56" w:name="_Toc243299956"/>
+      <w:bookmarkStart w:id="56" w:name="_Toc243389803"/>
       <w:r>
         <w:rPr>
           <w:color w:val="1D4E89"/>
@@ -10867,7 +10945,7 @@
       <w:pPr>
         <w:pStyle w:val="Heading2"/>
       </w:pPr>
-      <w:bookmarkStart w:id="57" w:name="_Toc243299957"/>
+      <w:bookmarkStart w:id="57" w:name="_Toc243389804"/>
       <w:r>
         <w:rPr>
           <w:color w:val="1D4E89"/>
@@ -10992,7 +11070,7 @@
       <w:pPr>
         <w:pStyle w:val="Heading2"/>
       </w:pPr>
-      <w:bookmarkStart w:id="58" w:name="_Toc243299958"/>
+      <w:bookmarkStart w:id="58" w:name="_Toc243389805"/>
       <w:r>
         <w:rPr>
           <w:color w:val="1D4E89"/>
@@ -11010,7 +11088,7 @@
       <w:pPr>
         <w:pStyle w:val="Heading2"/>
       </w:pPr>
-      <w:bookmarkStart w:id="59" w:name="_Toc243299959"/>
+      <w:bookmarkStart w:id="59" w:name="_Toc243389806"/>
       <w:r>
         <w:rPr>
           <w:color w:val="1D4E89"/>
@@ -11083,7 +11161,7 @@
       <w:pPr>
         <w:pStyle w:val="Heading2"/>
       </w:pPr>
-      <w:bookmarkStart w:id="60" w:name="_Toc243299960"/>
+      <w:bookmarkStart w:id="60" w:name="_Toc243389807"/>
       <w:r>
         <w:rPr>
           <w:color w:val="1D4E89"/>
@@ -11101,7 +11179,7 @@
       <w:pPr>
         <w:pStyle w:val="Heading2"/>
       </w:pPr>
-      <w:bookmarkStart w:id="61" w:name="_Toc243299961"/>
+      <w:bookmarkStart w:id="61" w:name="_Toc243389808"/>
       <w:r>
         <w:rPr>
           <w:color w:val="1D4E89"/>
@@ -11120,7 +11198,7 @@
         <w:pStyle w:val="Heading1"/>
         <w:pageBreakBefore/>
       </w:pPr>
-      <w:bookmarkStart w:id="62" w:name="_Toc243299962"/>
+      <w:bookmarkStart w:id="62" w:name="_Toc243389809"/>
       <w:r>
         <w:rPr>
           <w:color w:val="1D4E89"/>
@@ -11173,7 +11251,7 @@
       <w:pPr>
         <w:pStyle w:val="Heading2"/>
       </w:pPr>
-      <w:bookmarkStart w:id="63" w:name="_Toc243299963"/>
+      <w:bookmarkStart w:id="63" w:name="_Toc243389810"/>
       <w:r>
         <w:rPr>
           <w:color w:val="1D4E89"/>
@@ -11472,7 +11550,7 @@
       <w:pPr>
         <w:pStyle w:val="Heading2"/>
       </w:pPr>
-      <w:bookmarkStart w:id="64" w:name="_Toc243299964"/>
+      <w:bookmarkStart w:id="64" w:name="_Toc243389811"/>
       <w:r>
         <w:rPr>
           <w:color w:val="1D4E89"/>
@@ -11491,7 +11569,7 @@
         <w:pStyle w:val="Heading1"/>
         <w:pageBreakBefore/>
       </w:pPr>
-      <w:bookmarkStart w:id="65" w:name="_Toc243299965"/>
+      <w:bookmarkStart w:id="65" w:name="_Toc243389812"/>
       <w:r>
         <w:rPr>
           <w:color w:val="1D4E89"/>
@@ -11544,7 +11622,7 @@
       <w:pPr>
         <w:pStyle w:val="Heading2"/>
       </w:pPr>
-      <w:bookmarkStart w:id="66" w:name="_Toc243299966"/>
+      <w:bookmarkStart w:id="66" w:name="_Toc243389813"/>
       <w:r>
         <w:rPr>
           <w:color w:val="1D4E89"/>
@@ -11667,7 +11745,7 @@
       <w:pPr>
         <w:pStyle w:val="Heading2"/>
       </w:pPr>
-      <w:bookmarkStart w:id="69" w:name="_Toc243299967"/>
+      <w:bookmarkStart w:id="69" w:name="_Toc243389814"/>
       <w:r>
         <w:rPr>
           <w:color w:val="1D4E89"/>
@@ -11828,7 +11906,7 @@
       <w:pPr>
         <w:pStyle w:val="Heading2"/>
       </w:pPr>
-      <w:bookmarkStart w:id="70" w:name="_Toc243299968"/>
+      <w:bookmarkStart w:id="70" w:name="_Toc243389815"/>
       <w:r>
         <w:rPr>
           <w:color w:val="1D4E89"/>
@@ -11851,7 +11929,7 @@
       <w:pPr>
         <w:pStyle w:val="Heading2"/>
       </w:pPr>
-      <w:bookmarkStart w:id="71" w:name="_Toc243299969"/>
+      <w:bookmarkStart w:id="71" w:name="_Toc243389816"/>
       <w:r>
         <w:rPr>
           <w:color w:val="1D4E89"/>
@@ -11872,80 +11950,21 @@
     </w:p>
     <w:p>
       <w:pPr>
-        <w:pStyle w:val="Heading1"/>
-        <w:pageBreakBefore/>
-      </w:pPr>
-      <w:bookmarkStart w:id="72" w:name="_Toc243299970"/>
+        <w:pStyle w:val="Heading2"/>
+      </w:pPr>
+      <w:bookmarkStart w:id="72" w:name="_Toc243389817"/>
       <w:r>
         <w:rPr>
           <w:color w:val="1D4E89"/>
         </w:rPr>
-        <w:t>14. The Client Portal</w:t>
+        <w:t>13.5 Currencies</w:t>
       </w:r>
       <w:bookmarkEnd w:id="72"/>
     </w:p>
     <w:p>
       <w:r>
-        <w:t>The client portal is a separate area where your clients sign in to work with you directly. This chapter describes what they see, so you can help them.</w:t>
-      </w:r>
-    </w:p>
-    <w:p>
-      <w:pPr>
-        <w:pStyle w:val="Heading2"/>
-      </w:pPr>
-      <w:bookmarkStart w:id="73" w:name="_Toc243299971"/>
-      <w:r>
-        <w:rPr>
-          <w:color w:val="1D4E89"/>
-        </w:rPr>
-        <w:t>14.1 Signing in</w:t>
-      </w:r>
-      <w:bookmarkEnd w:id="73"/>
-    </w:p>
-    <w:p>
-      <w:pPr>
-        <w:pStyle w:val="ListBullet"/>
-      </w:pPr>
-      <w:r>
-        <w:t>Clients go to the portal’s login page: your system’s address followed by /portal/login.</w:t>
-      </w:r>
-    </w:p>
-    <w:p>
-      <w:pPr>
-        <w:pStyle w:val="ListBullet"/>
-      </w:pPr>
-      <w:r>
-        <w:t>They sign in with their email address and the password you set or reset for them (section 7.3).</w:t>
-      </w:r>
-    </w:p>
-    <w:p>
-      <w:pPr>
-        <w:pStyle w:val="ListBullet"/>
-      </w:pPr>
-      <w:r>
-        <w:t>After 5 wrong passwords the login is locked for 15 minutes. After 15 minutes without activity they are signed out.</w:t>
-      </w:r>
-    </w:p>
-    <w:p>
-      <w:pPr>
-        <w:pStyle w:val="ListBullet"/>
-      </w:pPr>
-      <w:r>
-        <w:t>A deactivated portal user sees a message telling them to contact their account manager.</w:t>
-      </w:r>
-    </w:p>
-    <w:p>
-      <w:pPr>
-        <w:pStyle w:val="Heading2"/>
-      </w:pPr>
-      <w:bookmarkStart w:id="74" w:name="_Toc243299972"/>
-      <w:r>
-        <w:rPr>
-          <w:color w:val="1D4E89"/>
-        </w:rPr>
-        <w:t>14.2 What clients can do</w:t>
-      </w:r>
-      <w:bookmarkEnd w:id="74"/>
+        <w:t>Administration → Currencies lists the currencies staff can choose for clients, quotes, trips, expenses, invoices, proformas and payments. It starts with GHS, USD, EUR and NGN.</w:t>
+      </w:r>
     </w:p>
     <w:tbl>
       <w:tblPr>
@@ -11972,7 +11991,7 @@
           </w:tcPr>
           <w:p>
             <w:r>
-              <w:t>Page</w:t>
+              <w:t>Column</w:t>
             </w:r>
           </w:p>
         </w:tc>
@@ -11985,7 +12004,7 @@
               <w:cnfStyle w:val="100000000000" w:firstRow="1" w:lastRow="0" w:firstColumn="0" w:lastColumn="0" w:oddVBand="0" w:evenVBand="0" w:oddHBand="0" w:evenHBand="0" w:firstRowFirstColumn="0" w:firstRowLastColumn="0" w:lastRowFirstColumn="0" w:lastRowLastColumn="0"/>
             </w:pPr>
             <w:r>
-              <w:t>What the client can do</w:t>
+              <w:t>What it means</w:t>
             </w:r>
           </w:p>
         </w:tc>
@@ -12003,7 +12022,7 @@
           </w:tcPr>
           <w:p>
             <w:r>
-              <w:t>Dashboard</w:t>
+              <w:t>Code</w:t>
             </w:r>
           </w:p>
         </w:tc>
@@ -12016,7 +12035,7 @@
               <w:cnfStyle w:val="000000100000" w:firstRow="0" w:lastRow="0" w:firstColumn="0" w:lastColumn="0" w:oddVBand="0" w:evenVBand="0" w:oddHBand="1" w:evenHBand="0" w:firstRowFirstColumn="0" w:firstRowLastColumn="0" w:lastRowFirstColumn="0" w:lastRowLastColumn="0"/>
             </w:pPr>
             <w:r>
-              <w:t>See their active trips, their open invoice balance, and quotes awaiting their action</w:t>
+              <w:t>The 3-letter international code, e.g. USD</w:t>
             </w:r>
           </w:p>
         </w:tc>
@@ -12034,7 +12053,7 @@
           </w:tcPr>
           <w:p>
             <w:r>
-              <w:t>My Requests</w:t>
+              <w:t>Name</w:t>
             </w:r>
           </w:p>
         </w:tc>
@@ -12047,7 +12066,7 @@
               <w:cnfStyle w:val="000000010000" w:firstRow="0" w:lastRow="0" w:firstColumn="0" w:lastColumn="0" w:oddVBand="0" w:evenVBand="0" w:oddHBand="0" w:evenHBand="1" w:firstRowFirstColumn="0" w:firstRowLastColumn="0" w:lastRowFirstColumn="0" w:lastRowLastColumn="0"/>
             </w:pPr>
             <w:r>
-              <w:t>Submit a new transport request, see your quotes, and accept or reject the latest one (with an optional comment)</w:t>
+              <w:t>The currency’s name, e.g. US Dollar</w:t>
             </w:r>
           </w:p>
         </w:tc>
@@ -12065,7 +12084,7 @@
           </w:tcPr>
           <w:p>
             <w:r>
-              <w:t>My Trips</w:t>
+              <w:t>Rate to GHS</w:t>
             </w:r>
           </w:p>
         </w:tc>
@@ -12078,7 +12097,7 @@
               <w:cnfStyle w:val="000000100000" w:firstRow="0" w:lastRow="0" w:firstColumn="0" w:lastColumn="0" w:oddVBand="0" w:evenVBand="0" w:oddHBand="1" w:evenHBand="0" w:firstRowFirstColumn="0" w:firstRowLastColumn="0" w:lastRowFirstColumn="0" w:lastRowLastColumn="0"/>
             </w:pPr>
             <w:r>
-              <w:t>Follow each trip’s status and timeline</w:t>
+              <w:t>How many cedis one unit is worth today, e.g. “1 USD = GHS 15.2500,” or “Not set”</w:t>
             </w:r>
           </w:p>
         </w:tc>
@@ -12096,7 +12115,7 @@
           </w:tcPr>
           <w:p>
             <w:r>
-              <w:t>My Invoices</w:t>
+              <w:t>Rate Updated</w:t>
             </w:r>
           </w:p>
         </w:tc>
@@ -12109,7 +12128,7 @@
               <w:cnfStyle w:val="000000010000" w:firstRow="0" w:lastRow="0" w:firstColumn="0" w:lastColumn="0" w:oddVBand="0" w:evenVBand="0" w:oddHBand="0" w:evenHBand="1" w:firstRowFirstColumn="0" w:firstRowLastColumn="0" w:lastRowFirstColumn="0" w:lastRowLastColumn="0"/>
             </w:pPr>
             <w:r>
-              <w:t>See issued invoices with their payments and balance, and download the PDF</w:t>
+              <w:t>When the rate was last changed</w:t>
             </w:r>
           </w:p>
         </w:tc>
@@ -12127,7 +12146,7 @@
           </w:tcPr>
           <w:p>
             <w:r>
-              <w:t>Proforma Invoices</w:t>
+              <w:t>Status</w:t>
             </w:r>
           </w:p>
         </w:tc>
@@ -12140,44 +12159,78 @@
               <w:cnfStyle w:val="000000100000" w:firstRow="0" w:lastRow="0" w:firstColumn="0" w:lastColumn="0" w:oddVBand="0" w:evenVBand="0" w:oddHBand="1" w:evenHBand="0" w:firstRowFirstColumn="0" w:firstRowLastColumn="0" w:lastRowFirstColumn="0" w:lastRowLastColumn="0"/>
             </w:pPr>
             <w:r>
-              <w:t>See issued proformas and download the PDF (only if proformas are switched on)</w:t>
-            </w:r>
-          </w:p>
-        </w:tc>
-      </w:tr>
-      <w:tr>
-        <w:trPr>
-          <w:cnfStyle w:val="000000010000" w:firstRow="0" w:lastRow="0" w:firstColumn="0" w:lastColumn="0" w:oddVBand="0" w:evenVBand="0" w:oddHBand="0" w:evenHBand="1" w:firstRowFirstColumn="0" w:firstRowLastColumn="0" w:lastRowFirstColumn="0" w:lastRowLastColumn="0"/>
-          <w:cantSplit/>
-          <w:jc w:val="center"/>
-        </w:trPr>
-        <w:tc>
-          <w:tcPr>
-            <w:cnfStyle w:val="001000000000" w:firstRow="0" w:lastRow="0" w:firstColumn="1" w:lastColumn="0" w:oddVBand="0" w:evenVBand="0" w:oddHBand="0" w:evenHBand="0" w:firstRowFirstColumn="0" w:firstRowLastColumn="0" w:lastRowFirstColumn="0" w:lastRowLastColumn="0"/>
-            <w:tcW w:w="4320" w:type="dxa"/>
-          </w:tcPr>
-          <w:p>
-            <w:r>
-              <w:t>Profile</w:t>
-            </w:r>
-          </w:p>
-        </w:tc>
-        <w:tc>
-          <w:tcPr>
-            <w:tcW w:w="4320" w:type="dxa"/>
-          </w:tcPr>
-          <w:p>
-            <w:pPr>
-              <w:cnfStyle w:val="000000010000" w:firstRow="0" w:lastRow="0" w:firstColumn="0" w:lastColumn="0" w:oddVBand="0" w:evenVBand="0" w:oddHBand="0" w:evenHBand="1" w:firstRowFirstColumn="0" w:firstRowLastColumn="0" w:lastRowFirstColumn="0" w:lastRowLastColumn="0"/>
-            </w:pPr>
-            <w:r>
-              <w:t>Update their details and change their password</w:t>
+              <w:t>Active currencies appear on forms; inactive ones don’t</w:t>
             </w:r>
           </w:p>
         </w:tc>
       </w:tr>
     </w:tbl>
-    <w:p/>
+    <w:p>
+      <w:r>
+        <w:t>Keep the rates up to date:</w:t>
+      </w:r>
+    </w:p>
+    <w:p>
+      <w:pPr>
+        <w:pStyle w:val="ListBullet"/>
+      </w:pPr>
+      <w:r>
+        <w:t>When staff choose a currency on a form, its rate is filled in as that record’s exchange rate. Staff can change it on each record, for example to the rate a client actually paid at.</w:t>
+      </w:r>
+    </w:p>
+    <w:p>
+      <w:pPr>
+        <w:pStyle w:val="ListBullet"/>
+      </w:pPr>
+      <w:r>
+        <w:t>Changing a rate here doesn’t change anything already saved: each trip, invoice, payment and expense keeps its own rate.</w:t>
+      </w:r>
+    </w:p>
+    <w:p>
+      <w:pPr>
+        <w:pStyle w:val="ListBullet"/>
+      </w:pPr>
+      <w:r>
+        <w:t>A currency with no rate shows “Not set,” and staff have to type the rate on each record.</w:t>
+      </w:r>
+    </w:p>
+    <w:p>
+      <w:r>
+        <w:t>To manage the list:</w:t>
+      </w:r>
+    </w:p>
+    <w:p>
+      <w:pPr>
+        <w:pStyle w:val="ListBullet"/>
+      </w:pPr>
+      <w:r>
+        <w:t>“Edit” changes a currency’s name or rate. The code can’t be changed, because saved records use it.</w:t>
+      </w:r>
+    </w:p>
+    <w:p>
+      <w:pPr>
+        <w:pStyle w:val="ListBullet"/>
+      </w:pPr>
+      <w:r>
+        <w:t>“New Currency” adds another, with its code (e.g. XOF), name and, if you know it, its rate.</w:t>
+      </w:r>
+    </w:p>
+    <w:p>
+      <w:pPr>
+        <w:pStyle w:val="ListBullet"/>
+      </w:pPr>
+      <w:r>
+        <w:t>“Deactivate” takes a currency off the forms. Records already in that currency keep it. GHS, and the default currency in Settings, can’t be deactivated.</w:t>
+      </w:r>
+    </w:p>
+    <w:p>
+      <w:pPr>
+        <w:pStyle w:val="ListBullet"/>
+      </w:pPr>
+      <w:r>
+        <w:t>“Delete” works only for a currency that nothing uses yet. Once a currency is used, deactivate it instead.</w:t>
+      </w:r>
+    </w:p>
     <w:tbl>
       <w:tblPr>
         <w:tblW w:w="0" w:type="auto"/>
@@ -12211,39 +12264,386 @@
               <w:t xml:space="preserve">Note:  </w:t>
             </w:r>
             <w:r>
-              <w:t>Clients never see draft invoices or proformas, trip expenses, or anything about other clients. Requests they submit arrive in your Requests list as Pending, with the source “Portal.”</w:t>
+              <w:t>GHS is the base currency. Accounts, reports and trip profit are all in cedis, worked out with each record’s own exchange rate.</w:t>
+            </w:r>
+          </w:p>
+        </w:tc>
+      </w:tr>
+    </w:tbl>
+    <w:p>
+      <w:pPr>
+        <w:pStyle w:val="Heading1"/>
+        <w:pageBreakBefore/>
+      </w:pPr>
+      <w:bookmarkStart w:id="73" w:name="_Toc243389818"/>
+      <w:r>
+        <w:rPr>
+          <w:color w:val="1D4E89"/>
+        </w:rPr>
+        <w:t>14. The Client Portal</w:t>
+      </w:r>
+      <w:bookmarkEnd w:id="73"/>
+    </w:p>
+    <w:p>
+      <w:r>
+        <w:t>The client portal is a separate area where your clients sign in to work with you directly. This chapter describes what they see, so you can help them.</w:t>
+      </w:r>
+    </w:p>
+    <w:p>
+      <w:pPr>
+        <w:pStyle w:val="Heading2"/>
+      </w:pPr>
+      <w:bookmarkStart w:id="74" w:name="_Toc243389819"/>
+      <w:r>
+        <w:rPr>
+          <w:color w:val="1D4E89"/>
+        </w:rPr>
+        <w:t>14.1 Signing in</w:t>
+      </w:r>
+      <w:bookmarkEnd w:id="74"/>
+    </w:p>
+    <w:p>
+      <w:pPr>
+        <w:pStyle w:val="ListBullet"/>
+      </w:pPr>
+      <w:r>
+        <w:t>Clients go to the portal’s login page: your system’s address followed by /portal/login.</w:t>
+      </w:r>
+    </w:p>
+    <w:p>
+      <w:pPr>
+        <w:pStyle w:val="ListBullet"/>
+      </w:pPr>
+      <w:r>
+        <w:t>They sign in with their email address and the password you set or reset for them (section 7.3).</w:t>
+      </w:r>
+    </w:p>
+    <w:p>
+      <w:pPr>
+        <w:pStyle w:val="ListBullet"/>
+      </w:pPr>
+      <w:r>
+        <w:t>After 5 wrong passwords the login is locked for 15 minutes. After 15 minutes without activity they are signed out.</w:t>
+      </w:r>
+    </w:p>
+    <w:p>
+      <w:pPr>
+        <w:pStyle w:val="ListBullet"/>
+      </w:pPr>
+      <w:r>
+        <w:t>A deactivated portal user sees a message telling them to contact their account manager.</w:t>
+      </w:r>
+    </w:p>
+    <w:p>
+      <w:pPr>
+        <w:pStyle w:val="Heading2"/>
+      </w:pPr>
+      <w:bookmarkStart w:id="75" w:name="_Toc243389820"/>
+      <w:r>
+        <w:rPr>
+          <w:color w:val="1D4E89"/>
+        </w:rPr>
+        <w:t>14.2 What clients can do</w:t>
+      </w:r>
+      <w:bookmarkEnd w:id="75"/>
+    </w:p>
+    <w:tbl>
+      <w:tblPr>
+        <w:tblStyle w:val="LightGrid-Accent1"/>
+        <w:tblW w:w="0" w:type="auto"/>
+        <w:jc w:val="center"/>
+        <w:tblLook w:val="04A0" w:firstRow="1" w:lastRow="0" w:firstColumn="1" w:lastColumn="0" w:noHBand="0" w:noVBand="1"/>
+      </w:tblPr>
+      <w:tblGrid>
+        <w:gridCol w:w="4320"/>
+        <w:gridCol w:w="4320"/>
+      </w:tblGrid>
+      <w:tr>
+        <w:trPr>
+          <w:cnfStyle w:val="100000000000" w:firstRow="1" w:lastRow="0" w:firstColumn="0" w:lastColumn="0" w:oddVBand="0" w:evenVBand="0" w:oddHBand="0" w:evenHBand="0" w:firstRowFirstColumn="0" w:firstRowLastColumn="0" w:lastRowFirstColumn="0" w:lastRowLastColumn="0"/>
+          <w:cantSplit/>
+          <w:tblHeader/>
+          <w:jc w:val="center"/>
+        </w:trPr>
+        <w:tc>
+          <w:tcPr>
+            <w:cnfStyle w:val="001000000000" w:firstRow="0" w:lastRow="0" w:firstColumn="1" w:lastColumn="0" w:oddVBand="0" w:evenVBand="0" w:oddHBand="0" w:evenHBand="0" w:firstRowFirstColumn="0" w:firstRowLastColumn="0" w:lastRowFirstColumn="0" w:lastRowLastColumn="0"/>
+            <w:tcW w:w="4320" w:type="dxa"/>
+          </w:tcPr>
+          <w:p>
+            <w:r>
+              <w:t>Page</w:t>
+            </w:r>
+          </w:p>
+        </w:tc>
+        <w:tc>
+          <w:tcPr>
+            <w:tcW w:w="4320" w:type="dxa"/>
+          </w:tcPr>
+          <w:p>
+            <w:pPr>
+              <w:cnfStyle w:val="100000000000" w:firstRow="1" w:lastRow="0" w:firstColumn="0" w:lastColumn="0" w:oddVBand="0" w:evenVBand="0" w:oddHBand="0" w:evenHBand="0" w:firstRowFirstColumn="0" w:firstRowLastColumn="0" w:lastRowFirstColumn="0" w:lastRowLastColumn="0"/>
+            </w:pPr>
+            <w:r>
+              <w:t>What the client can do</w:t>
+            </w:r>
+          </w:p>
+        </w:tc>
+      </w:tr>
+      <w:tr>
+        <w:trPr>
+          <w:cnfStyle w:val="000000100000" w:firstRow="0" w:lastRow="0" w:firstColumn="0" w:lastColumn="0" w:oddVBand="0" w:evenVBand="0" w:oddHBand="1" w:evenHBand="0" w:firstRowFirstColumn="0" w:firstRowLastColumn="0" w:lastRowFirstColumn="0" w:lastRowLastColumn="0"/>
+          <w:cantSplit/>
+          <w:jc w:val="center"/>
+        </w:trPr>
+        <w:tc>
+          <w:tcPr>
+            <w:cnfStyle w:val="001000000000" w:firstRow="0" w:lastRow="0" w:firstColumn="1" w:lastColumn="0" w:oddVBand="0" w:evenVBand="0" w:oddHBand="0" w:evenHBand="0" w:firstRowFirstColumn="0" w:firstRowLastColumn="0" w:lastRowFirstColumn="0" w:lastRowLastColumn="0"/>
+            <w:tcW w:w="4320" w:type="dxa"/>
+          </w:tcPr>
+          <w:p>
+            <w:r>
+              <w:t>Dashboard</w:t>
+            </w:r>
+          </w:p>
+        </w:tc>
+        <w:tc>
+          <w:tcPr>
+            <w:tcW w:w="4320" w:type="dxa"/>
+          </w:tcPr>
+          <w:p>
+            <w:pPr>
+              <w:cnfStyle w:val="000000100000" w:firstRow="0" w:lastRow="0" w:firstColumn="0" w:lastColumn="0" w:oddVBand="0" w:evenVBand="0" w:oddHBand="1" w:evenHBand="0" w:firstRowFirstColumn="0" w:firstRowLastColumn="0" w:lastRowFirstColumn="0" w:lastRowLastColumn="0"/>
+            </w:pPr>
+            <w:r>
+              <w:t>See their active trips, their open invoice balance, and quotes awaiting their action</w:t>
+            </w:r>
+          </w:p>
+        </w:tc>
+      </w:tr>
+      <w:tr>
+        <w:trPr>
+          <w:cnfStyle w:val="000000010000" w:firstRow="0" w:lastRow="0" w:firstColumn="0" w:lastColumn="0" w:oddVBand="0" w:evenVBand="0" w:oddHBand="0" w:evenHBand="1" w:firstRowFirstColumn="0" w:firstRowLastColumn="0" w:lastRowFirstColumn="0" w:lastRowLastColumn="0"/>
+          <w:cantSplit/>
+          <w:jc w:val="center"/>
+        </w:trPr>
+        <w:tc>
+          <w:tcPr>
+            <w:cnfStyle w:val="001000000000" w:firstRow="0" w:lastRow="0" w:firstColumn="1" w:lastColumn="0" w:oddVBand="0" w:evenVBand="0" w:oddHBand="0" w:evenHBand="0" w:firstRowFirstColumn="0" w:firstRowLastColumn="0" w:lastRowFirstColumn="0" w:lastRowLastColumn="0"/>
+            <w:tcW w:w="4320" w:type="dxa"/>
+          </w:tcPr>
+          <w:p>
+            <w:r>
+              <w:t>My Requests</w:t>
+            </w:r>
+          </w:p>
+        </w:tc>
+        <w:tc>
+          <w:tcPr>
+            <w:tcW w:w="4320" w:type="dxa"/>
+          </w:tcPr>
+          <w:p>
+            <w:pPr>
+              <w:cnfStyle w:val="000000010000" w:firstRow="0" w:lastRow="0" w:firstColumn="0" w:lastColumn="0" w:oddVBand="0" w:evenVBand="0" w:oddHBand="0" w:evenHBand="1" w:firstRowFirstColumn="0" w:firstRowLastColumn="0" w:lastRowFirstColumn="0" w:lastRowLastColumn="0"/>
+            </w:pPr>
+            <w:r>
+              <w:t>Submit a new transport request, see your quotes, and accept or reject the latest one (with an optional comment)</w:t>
+            </w:r>
+          </w:p>
+        </w:tc>
+      </w:tr>
+      <w:tr>
+        <w:trPr>
+          <w:cnfStyle w:val="000000100000" w:firstRow="0" w:lastRow="0" w:firstColumn="0" w:lastColumn="0" w:oddVBand="0" w:evenVBand="0" w:oddHBand="1" w:evenHBand="0" w:firstRowFirstColumn="0" w:firstRowLastColumn="0" w:lastRowFirstColumn="0" w:lastRowLastColumn="0"/>
+          <w:cantSplit/>
+          <w:jc w:val="center"/>
+        </w:trPr>
+        <w:tc>
+          <w:tcPr>
+            <w:cnfStyle w:val="001000000000" w:firstRow="0" w:lastRow="0" w:firstColumn="1" w:lastColumn="0" w:oddVBand="0" w:evenVBand="0" w:oddHBand="0" w:evenHBand="0" w:firstRowFirstColumn="0" w:firstRowLastColumn="0" w:lastRowFirstColumn="0" w:lastRowLastColumn="0"/>
+            <w:tcW w:w="4320" w:type="dxa"/>
+          </w:tcPr>
+          <w:p>
+            <w:r>
+              <w:t>My Trips</w:t>
+            </w:r>
+          </w:p>
+        </w:tc>
+        <w:tc>
+          <w:tcPr>
+            <w:tcW w:w="4320" w:type="dxa"/>
+          </w:tcPr>
+          <w:p>
+            <w:pPr>
+              <w:cnfStyle w:val="000000100000" w:firstRow="0" w:lastRow="0" w:firstColumn="0" w:lastColumn="0" w:oddVBand="0" w:evenVBand="0" w:oddHBand="1" w:evenHBand="0" w:firstRowFirstColumn="0" w:firstRowLastColumn="0" w:lastRowFirstColumn="0" w:lastRowLastColumn="0"/>
+            </w:pPr>
+            <w:r>
+              <w:t>Follow each trip’s status and timeline</w:t>
+            </w:r>
+          </w:p>
+        </w:tc>
+      </w:tr>
+      <w:tr>
+        <w:trPr>
+          <w:cnfStyle w:val="000000010000" w:firstRow="0" w:lastRow="0" w:firstColumn="0" w:lastColumn="0" w:oddVBand="0" w:evenVBand="0" w:oddHBand="0" w:evenHBand="1" w:firstRowFirstColumn="0" w:firstRowLastColumn="0" w:lastRowFirstColumn="0" w:lastRowLastColumn="0"/>
+          <w:cantSplit/>
+          <w:jc w:val="center"/>
+        </w:trPr>
+        <w:tc>
+          <w:tcPr>
+            <w:cnfStyle w:val="001000000000" w:firstRow="0" w:lastRow="0" w:firstColumn="1" w:lastColumn="0" w:oddVBand="0" w:evenVBand="0" w:oddHBand="0" w:evenHBand="0" w:firstRowFirstColumn="0" w:firstRowLastColumn="0" w:lastRowFirstColumn="0" w:lastRowLastColumn="0"/>
+            <w:tcW w:w="4320" w:type="dxa"/>
+          </w:tcPr>
+          <w:p>
+            <w:r>
+              <w:t>My Invoices</w:t>
+            </w:r>
+          </w:p>
+        </w:tc>
+        <w:tc>
+          <w:tcPr>
+            <w:tcW w:w="4320" w:type="dxa"/>
+          </w:tcPr>
+          <w:p>
+            <w:pPr>
+              <w:cnfStyle w:val="000000010000" w:firstRow="0" w:lastRow="0" w:firstColumn="0" w:lastColumn="0" w:oddVBand="0" w:evenVBand="0" w:oddHBand="0" w:evenHBand="1" w:firstRowFirstColumn="0" w:firstRowLastColumn="0" w:lastRowFirstColumn="0" w:lastRowLastColumn="0"/>
+            </w:pPr>
+            <w:r>
+              <w:t>See issued invoices with their payments and balance, and download the PDF</w:t>
+            </w:r>
+          </w:p>
+        </w:tc>
+      </w:tr>
+      <w:tr>
+        <w:trPr>
+          <w:cnfStyle w:val="000000100000" w:firstRow="0" w:lastRow="0" w:firstColumn="0" w:lastColumn="0" w:oddVBand="0" w:evenVBand="0" w:oddHBand="1" w:evenHBand="0" w:firstRowFirstColumn="0" w:firstRowLastColumn="0" w:lastRowFirstColumn="0" w:lastRowLastColumn="0"/>
+          <w:cantSplit/>
+          <w:jc w:val="center"/>
+        </w:trPr>
+        <w:tc>
+          <w:tcPr>
+            <w:cnfStyle w:val="001000000000" w:firstRow="0" w:lastRow="0" w:firstColumn="1" w:lastColumn="0" w:oddVBand="0" w:evenVBand="0" w:oddHBand="0" w:evenHBand="0" w:firstRowFirstColumn="0" w:firstRowLastColumn="0" w:lastRowFirstColumn="0" w:lastRowLastColumn="0"/>
+            <w:tcW w:w="4320" w:type="dxa"/>
+          </w:tcPr>
+          <w:p>
+            <w:r>
+              <w:t>Proforma Invoices</w:t>
+            </w:r>
+          </w:p>
+        </w:tc>
+        <w:tc>
+          <w:tcPr>
+            <w:tcW w:w="4320" w:type="dxa"/>
+          </w:tcPr>
+          <w:p>
+            <w:pPr>
+              <w:cnfStyle w:val="000000100000" w:firstRow="0" w:lastRow="0" w:firstColumn="0" w:lastColumn="0" w:oddVBand="0" w:evenVBand="0" w:oddHBand="1" w:evenHBand="0" w:firstRowFirstColumn="0" w:firstRowLastColumn="0" w:lastRowFirstColumn="0" w:lastRowLastColumn="0"/>
+            </w:pPr>
+            <w:r>
+              <w:t>See issued proformas and download the PDF (only if proformas are switched on)</w:t>
+            </w:r>
+          </w:p>
+        </w:tc>
+      </w:tr>
+      <w:tr>
+        <w:trPr>
+          <w:cnfStyle w:val="000000010000" w:firstRow="0" w:lastRow="0" w:firstColumn="0" w:lastColumn="0" w:oddVBand="0" w:evenVBand="0" w:oddHBand="0" w:evenHBand="1" w:firstRowFirstColumn="0" w:firstRowLastColumn="0" w:lastRowFirstColumn="0" w:lastRowLastColumn="0"/>
+          <w:cantSplit/>
+          <w:jc w:val="center"/>
+        </w:trPr>
+        <w:tc>
+          <w:tcPr>
+            <w:cnfStyle w:val="001000000000" w:firstRow="0" w:lastRow="0" w:firstColumn="1" w:lastColumn="0" w:oddVBand="0" w:evenVBand="0" w:oddHBand="0" w:evenHBand="0" w:firstRowFirstColumn="0" w:firstRowLastColumn="0" w:lastRowFirstColumn="0" w:lastRowLastColumn="0"/>
+            <w:tcW w:w="4320" w:type="dxa"/>
+          </w:tcPr>
+          <w:p>
+            <w:r>
+              <w:t>Profile</w:t>
+            </w:r>
+          </w:p>
+        </w:tc>
+        <w:tc>
+          <w:tcPr>
+            <w:tcW w:w="4320" w:type="dxa"/>
+          </w:tcPr>
+          <w:p>
+            <w:pPr>
+              <w:cnfStyle w:val="000000010000" w:firstRow="0" w:lastRow="0" w:firstColumn="0" w:lastColumn="0" w:oddVBand="0" w:evenVBand="0" w:oddHBand="0" w:evenHBand="1" w:firstRowFirstColumn="0" w:firstRowLastColumn="0" w:lastRowFirstColumn="0" w:lastRowLastColumn="0"/>
+            </w:pPr>
+            <w:r>
+              <w:t>Update their details and change their password</w:t>
             </w:r>
           </w:p>
         </w:tc>
       </w:tr>
     </w:tbl>
     <w:p/>
+    <w:tbl>
+      <w:tblPr>
+        <w:tblW w:w="0" w:type="auto"/>
+        <w:tblBorders>
+          <w:top w:val="nil"/>
+          <w:left w:val="nil"/>
+          <w:bottom w:val="nil"/>
+          <w:right w:val="nil"/>
+          <w:insideH w:val="nil"/>
+          <w:insideV w:val="nil"/>
+        </w:tblBorders>
+        <w:tblLook w:val="04A0" w:firstRow="1" w:lastRow="0" w:firstColumn="1" w:lastColumn="0" w:noHBand="0" w:noVBand="1"/>
+      </w:tblPr>
+      <w:tblGrid>
+        <w:gridCol w:w="8640"/>
+      </w:tblGrid>
+      <w:tr>
+        <w:trPr>
+          <w:cantSplit/>
+        </w:trPr>
+        <w:tc>
+          <w:tcPr>
+            <w:tcW w:w="8640" w:type="dxa"/>
+            <w:shd w:val="clear" w:color="auto" w:fill="EAF1FB"/>
+          </w:tcPr>
+          <w:p>
+            <w:r>
+              <w:rPr>
+                <w:b/>
+              </w:rPr>
+              <w:t xml:space="preserve">Note:  </w:t>
+            </w:r>
+            <w:r>
+              <w:t>Clients never see draft invoices or proformas, trip expenses, or anything about other clients. Requests they submit arrive in your Requests list as Pending, with the source “Portal.”</w:t>
+            </w:r>
+          </w:p>
+        </w:tc>
+      </w:tr>
+    </w:tbl>
+    <w:p/>
     <w:p>
       <w:pPr>
         <w:pStyle w:val="Heading1"/>
         <w:pageBreakBefore/>
       </w:pPr>
-      <w:bookmarkStart w:id="75" w:name="_Toc243299973"/>
+      <w:bookmarkStart w:id="76" w:name="_Toc243389821"/>
       <w:r>
         <w:rPr>
           <w:color w:val="1D4E89"/>
         </w:rPr>
         <w:t>Appendix A: Frequently Asked Questions</w:t>
       </w:r>
-      <w:bookmarkEnd w:id="75"/>
+      <w:bookmarkEnd w:id="76"/>
     </w:p>
     <w:p>
       <w:pPr>
         <w:pStyle w:val="Heading3"/>
       </w:pPr>
-      <w:bookmarkStart w:id="76" w:name="_Toc900000075"/>
+      <w:bookmarkStart w:id="77" w:name="_Toc900000075"/>
       <w:r>
         <w:rPr>
           <w:color w:val="1D4E89"/>
         </w:rPr>
         <w:t>I forgot my password. What do I do?</w:t>
       </w:r>
-      <w:bookmarkEnd w:id="76"/>
+      <w:bookmarkEnd w:id="77"/>
     </w:p>
     <w:p>
       <w:r>
@@ -12254,14 +12654,14 @@
       <w:pPr>
         <w:pStyle w:val="Heading3"/>
       </w:pPr>
-      <w:bookmarkStart w:id="77" w:name="_Toc900000076"/>
+      <w:bookmarkStart w:id="78" w:name="_Toc900000076"/>
       <w:r>
         <w:rPr>
           <w:color w:val="1D4E89"/>
         </w:rPr>
         <w:t>My login is locked. Why?</w:t>
       </w:r>
-      <w:bookmarkEnd w:id="77"/>
+      <w:bookmarkEnd w:id="78"/>
     </w:p>
     <w:p>
       <w:r>
@@ -12272,14 +12672,14 @@
       <w:pPr>
         <w:pStyle w:val="Heading3"/>
       </w:pPr>
-      <w:bookmarkStart w:id="78" w:name="_Toc900000077"/>
+      <w:bookmarkStart w:id="79" w:name="_Toc900000077"/>
       <w:r>
         <w:rPr>
           <w:color w:val="1D4E89"/>
         </w:rPr>
         <w:t>I was signed out while working.</w:t>
       </w:r>
-      <w:bookmarkEnd w:id="78"/>
+      <w:bookmarkEnd w:id="79"/>
     </w:p>
     <w:p>
       <w:r>
@@ -12290,14 +12690,14 @@
       <w:pPr>
         <w:pStyle w:val="Heading3"/>
       </w:pPr>
-      <w:bookmarkStart w:id="79" w:name="_Toc900000078"/>
+      <w:bookmarkStart w:id="80" w:name="_Toc900000078"/>
       <w:r>
         <w:rPr>
           <w:color w:val="1D4E89"/>
         </w:rPr>
         <w:t>A menu item I expect to see is missing.</w:t>
       </w:r>
-      <w:bookmarkEnd w:id="79"/>
+      <w:bookmarkEnd w:id="80"/>
     </w:p>
     <w:p>
       <w:r>
@@ -12308,14 +12708,14 @@
       <w:pPr>
         <w:pStyle w:val="Heading3"/>
       </w:pPr>
-      <w:bookmarkStart w:id="80" w:name="_Toc900000079"/>
+      <w:bookmarkStart w:id="81" w:name="_Toc900000079"/>
       <w:r>
         <w:rPr>
           <w:color w:val="1D4E89"/>
         </w:rPr>
         <w:t>Why can’t I see the trip value or profit?</w:t>
       </w:r>
-      <w:bookmarkEnd w:id="80"/>
+      <w:bookmarkEnd w:id="81"/>
     </w:p>
     <w:p>
       <w:r>
@@ -12326,14 +12726,14 @@
       <w:pPr>
         <w:pStyle w:val="Heading3"/>
       </w:pPr>
-      <w:bookmarkStart w:id="81" w:name="_Toc900000080"/>
+      <w:bookmarkStart w:id="82" w:name="_Toc900000080"/>
       <w:r>
         <w:rPr>
           <w:color w:val="1D4E89"/>
         </w:rPr>
         <w:t>A truck or driver isn’t available when I create a trip.</w:t>
       </w:r>
-      <w:bookmarkEnd w:id="81"/>
+      <w:bookmarkEnd w:id="82"/>
     </w:p>
     <w:p>
       <w:r>
@@ -12344,14 +12744,14 @@
       <w:pPr>
         <w:pStyle w:val="Heading3"/>
       </w:pPr>
-      <w:bookmarkStart w:id="82" w:name="_Toc900000081"/>
+      <w:bookmarkStart w:id="83" w:name="_Toc900000081"/>
       <w:r>
         <w:rPr>
           <w:color w:val="1D4E89"/>
         </w:rPr>
         <w:t>I can’t put a truck into maintenance.</w:t>
       </w:r>
-      <w:bookmarkEnd w:id="82"/>
+      <w:bookmarkEnd w:id="83"/>
     </w:p>
     <w:p>
       <w:r>
@@ -12362,14 +12762,14 @@
       <w:pPr>
         <w:pStyle w:val="Heading3"/>
       </w:pPr>
-      <w:bookmarkStart w:id="83" w:name="_Toc900000082"/>
+      <w:bookmarkStart w:id="84" w:name="_Toc900000082"/>
       <w:r>
         <w:rPr>
           <w:color w:val="1D4E89"/>
         </w:rPr>
         <w:t>I can’t cancel a trip.</w:t>
       </w:r>
-      <w:bookmarkEnd w:id="83"/>
+      <w:bookmarkEnd w:id="84"/>
     </w:p>
     <w:p>
       <w:r>
@@ -12380,14 +12780,14 @@
       <w:pPr>
         <w:pStyle w:val="Heading3"/>
       </w:pPr>
-      <w:bookmarkStart w:id="84" w:name="_Toc900000083"/>
+      <w:bookmarkStart w:id="85" w:name="_Toc900000083"/>
       <w:r>
         <w:rPr>
           <w:color w:val="1D4E89"/>
         </w:rPr>
         <w:t>I can’t delete a trip.</w:t>
       </w:r>
-      <w:bookmarkEnd w:id="84"/>
+      <w:bookmarkEnd w:id="85"/>
     </w:p>
     <w:p>
       <w:r>
@@ -12398,14 +12798,14 @@
       <w:pPr>
         <w:pStyle w:val="Heading3"/>
       </w:pPr>
-      <w:bookmarkStart w:id="85" w:name="_Toc900000084"/>
+      <w:bookmarkStart w:id="86" w:name="_Toc900000084"/>
       <w:r>
         <w:rPr>
           <w:color w:val="1D4E89"/>
         </w:rPr>
         <w:t>A trip doesn’t appear when I create an invoice.</w:t>
       </w:r>
-      <w:bookmarkEnd w:id="85"/>
+      <w:bookmarkEnd w:id="86"/>
     </w:p>
     <w:p>
       <w:r>
@@ -12416,14 +12816,14 @@
       <w:pPr>
         <w:pStyle w:val="Heading3"/>
       </w:pPr>
-      <w:bookmarkStart w:id="86" w:name="_Toc900000085"/>
+      <w:bookmarkStart w:id="87" w:name="_Toc900000085"/>
       <w:r>
         <w:rPr>
           <w:color w:val="1D4E89"/>
         </w:rPr>
         <w:t>I can’t cancel an invoice.</w:t>
       </w:r>
-      <w:bookmarkEnd w:id="86"/>
+      <w:bookmarkEnd w:id="87"/>
     </w:p>
     <w:p>
       <w:r>
@@ -12434,14 +12834,14 @@
       <w:pPr>
         <w:pStyle w:val="Heading3"/>
       </w:pPr>
-      <w:bookmarkStart w:id="87" w:name="_Toc900000086"/>
+      <w:bookmarkStart w:id="88" w:name="_Toc900000086"/>
       <w:r>
         <w:rPr>
           <w:color w:val="1D4E89"/>
         </w:rPr>
         <w:t>My client can’t see their invoice in the portal.</w:t>
       </w:r>
-      <w:bookmarkEnd w:id="87"/>
+      <w:bookmarkEnd w:id="88"/>
     </w:p>
     <w:p>
       <w:r>
@@ -12452,14 +12852,14 @@
       <w:pPr>
         <w:pStyle w:val="Heading3"/>
       </w:pPr>
-      <w:bookmarkStart w:id="88" w:name="_Toc900000087"/>
+      <w:bookmarkStart w:id="89" w:name="_Toc900000087"/>
       <w:r>
         <w:rPr>
           <w:color w:val="1D4E89"/>
         </w:rPr>
         <w:t>Proformas is missing from the Finance menu.</w:t>
       </w:r>
-      <w:bookmarkEnd w:id="88"/>
+      <w:bookmarkEnd w:id="89"/>
     </w:p>
     <w:p>
       <w:r>
@@ -12470,18 +12870,50 @@
       <w:pPr>
         <w:pStyle w:val="Heading3"/>
       </w:pPr>
-      <w:bookmarkStart w:id="89" w:name="_Toc900000088"/>
+      <w:bookmarkStart w:id="90" w:name="_Toc900000088"/>
       <w:r>
         <w:rPr>
           <w:color w:val="1D4E89"/>
         </w:rPr>
         <w:t>I can’t delete an account, client, truck or driver.</w:t>
       </w:r>
-      <w:bookmarkEnd w:id="89"/>
+      <w:bookmarkEnd w:id="90"/>
     </w:p>
     <w:p>
       <w:r>
         <w:t>It has history the system must keep. Deactivate it instead; it stops appearing in lists and on forms.</w:t>
+      </w:r>
+    </w:p>
+    <w:p>
+      <w:pPr>
+        <w:pStyle w:val="Heading3"/>
+      </w:pPr>
+      <w:r>
+        <w:rPr>
+          <w:color w:val="1D4E89"/>
+        </w:rPr>
+        <w:t>A currency is missing from the list.</w:t>
+      </w:r>
+    </w:p>
+    <w:p>
+      <w:r>
+        <w:t>An Admin adds it, or activates it again, under Administration → Currencies (section 13.5).</w:t>
+      </w:r>
+    </w:p>
+    <w:p>
+      <w:pPr>
+        <w:pStyle w:val="Heading3"/>
+      </w:pPr>
+      <w:r>
+        <w:rPr>
+          <w:color w:val="1D4E89"/>
+        </w:rPr>
+        <w:t>Why do I have to enter an exchange rate?</w:t>
+      </w:r>
+    </w:p>
+    <w:p>
+      <w:r>
+        <w:t>Any currency other than GHS needs a rate so the system can work out the amount in cedis. If it isn’t filled in for you, no rate has been set for that currency yet (section 13.5).</w:t>
       </w:r>
     </w:p>
     <w:p>
@@ -12489,14 +12921,14 @@
         <w:pStyle w:val="Heading1"/>
         <w:pageBreakBefore/>
       </w:pPr>
-      <w:bookmarkStart w:id="90" w:name="_Toc243299974"/>
+      <w:bookmarkStart w:id="91" w:name="_Toc243389822"/>
       <w:r>
         <w:rPr>
           <w:color w:val="1D4E89"/>
         </w:rPr>
         <w:t>Appendix B: Document Information</w:t>
       </w:r>
-      <w:bookmarkEnd w:id="90"/>
+      <w:bookmarkEnd w:id="91"/>
     </w:p>
     <w:p>
       <w:r>
@@ -12506,6 +12938,11 @@
     <w:p>
       <w:r>
         <w:t>Version 1.0 — October 2026.</w:t>
+      </w:r>
+    </w:p>
+    <w:p>
+      <w:r>
+        <w:t>Version 1.1 — October 2026. Adds the currency list (section 13.5): currencies are chosen from a list, today’s exchange rate is filled in on forms, and invoices have their own currency and exchange rate fields.</w:t>
       </w:r>
     </w:p>
     <w:sectPr>

</xml_diff>

<commit_message>
Help centre: Haulage manual 1.3
Rebuilt from IBS_Haulage_User_Manual.docx 1.3, merged in the haulage
repo: 1.2 shows balances in each invoice's own currency, and 1.3 moves
Currencies under Finance, with dated exchange rates. The client portal
guide was already current.
</commit_message>
<xml_diff>
--- a/help/haulage/IBS_Haulage_User_Manual.docx
+++ b/help/haulage/IBS_Haulage_User_Manual.docx
@@ -40,7 +40,7 @@
         <w:rPr>
           <w:color w:val="333333"/>
         </w:rPr>
-        <w:t>Version 1.1  |  October 2026</w:t>
+        <w:t>Version 1.3  |  October 2026</w:t>
       </w:r>
     </w:p>
     <w:p>
@@ -60,7 +60,7 @@
         <w:pageBreakBefore/>
       </w:pPr>
       <w:bookmarkStart w:id="0" w:name="_Toc900000000"/>
-      <w:bookmarkStart w:id="1" w:name="_Toc243389748"/>
+      <w:bookmarkStart w:id="1" w:name="_Toc243403824"/>
       <w:r>
         <w:rPr>
           <w:color w:val="1D4E89"/>
@@ -96,7 +96,7 @@
       <w:r>
         <w:fldChar w:fldCharType="separate"/>
       </w:r>
-      <w:hyperlink w:anchor="_Toc243389748" w:history="1">
+      <w:hyperlink w:anchor="_Toc243403824" w:history="1">
         <w:r>
           <w:rPr>
             <w:rStyle w:val="Hyperlink"/>
@@ -123,7 +123,7 @@
             <w:noProof/>
             <w:webHidden/>
           </w:rPr>
-          <w:instrText xml:space="preserve"> PAGEREF _Toc243389748 \h </w:instrText>
+          <w:instrText xml:space="preserve"> PAGEREF _Toc243403824 \h </w:instrText>
         </w:r>
         <w:r>
           <w:rPr>
@@ -170,7 +170,7 @@
           <w14:ligatures w14:val="standardContextual"/>
         </w:rPr>
       </w:pPr>
-      <w:hyperlink w:anchor="_Toc243389749" w:history="1">
+      <w:hyperlink w:anchor="_Toc243403825" w:history="1">
         <w:r>
           <w:rPr>
             <w:rStyle w:val="Hyperlink"/>
@@ -197,7 +197,7 @@
             <w:noProof/>
             <w:webHidden/>
           </w:rPr>
-          <w:instrText xml:space="preserve"> PAGEREF _Toc243389749 \h </w:instrText>
+          <w:instrText xml:space="preserve"> PAGEREF _Toc243403825 \h </w:instrText>
         </w:r>
         <w:r>
           <w:rPr>
@@ -244,7 +244,7 @@
           <w14:ligatures w14:val="standardContextual"/>
         </w:rPr>
       </w:pPr>
-      <w:hyperlink w:anchor="_Toc243389750" w:history="1">
+      <w:hyperlink w:anchor="_Toc243403826" w:history="1">
         <w:r>
           <w:rPr>
             <w:rStyle w:val="Hyperlink"/>
@@ -271,7 +271,7 @@
             <w:noProof/>
             <w:webHidden/>
           </w:rPr>
-          <w:instrText xml:space="preserve"> PAGEREF _Toc243389750 \h </w:instrText>
+          <w:instrText xml:space="preserve"> PAGEREF _Toc243403826 \h </w:instrText>
         </w:r>
         <w:r>
           <w:rPr>
@@ -318,7 +318,7 @@
           <w14:ligatures w14:val="standardContextual"/>
         </w:rPr>
       </w:pPr>
-      <w:hyperlink w:anchor="_Toc243389751" w:history="1">
+      <w:hyperlink w:anchor="_Toc243403827" w:history="1">
         <w:r>
           <w:rPr>
             <w:rStyle w:val="Hyperlink"/>
@@ -345,7 +345,7 @@
             <w:noProof/>
             <w:webHidden/>
           </w:rPr>
-          <w:instrText xml:space="preserve"> PAGEREF _Toc243389751 \h </w:instrText>
+          <w:instrText xml:space="preserve"> PAGEREF _Toc243403827 \h </w:instrText>
         </w:r>
         <w:r>
           <w:rPr>
@@ -392,7 +392,7 @@
           <w14:ligatures w14:val="standardContextual"/>
         </w:rPr>
       </w:pPr>
-      <w:hyperlink w:anchor="_Toc243389752" w:history="1">
+      <w:hyperlink w:anchor="_Toc243403828" w:history="1">
         <w:r>
           <w:rPr>
             <w:rStyle w:val="Hyperlink"/>
@@ -419,7 +419,7 @@
             <w:noProof/>
             <w:webHidden/>
           </w:rPr>
-          <w:instrText xml:space="preserve"> PAGEREF _Toc243389752 \h </w:instrText>
+          <w:instrText xml:space="preserve"> PAGEREF _Toc243403828 \h </w:instrText>
         </w:r>
         <w:r>
           <w:rPr>
@@ -466,7 +466,7 @@
           <w14:ligatures w14:val="standardContextual"/>
         </w:rPr>
       </w:pPr>
-      <w:hyperlink w:anchor="_Toc243389753" w:history="1">
+      <w:hyperlink w:anchor="_Toc243403829" w:history="1">
         <w:r>
           <w:rPr>
             <w:rStyle w:val="Hyperlink"/>
@@ -493,7 +493,7 @@
             <w:noProof/>
             <w:webHidden/>
           </w:rPr>
-          <w:instrText xml:space="preserve"> PAGEREF _Toc243389753 \h </w:instrText>
+          <w:instrText xml:space="preserve"> PAGEREF _Toc243403829 \h </w:instrText>
         </w:r>
         <w:r>
           <w:rPr>
@@ -540,7 +540,7 @@
           <w14:ligatures w14:val="standardContextual"/>
         </w:rPr>
       </w:pPr>
-      <w:hyperlink w:anchor="_Toc243389754" w:history="1">
+      <w:hyperlink w:anchor="_Toc243403830" w:history="1">
         <w:r>
           <w:rPr>
             <w:rStyle w:val="Hyperlink"/>
@@ -567,7 +567,7 @@
             <w:noProof/>
             <w:webHidden/>
           </w:rPr>
-          <w:instrText xml:space="preserve"> PAGEREF _Toc243389754 \h </w:instrText>
+          <w:instrText xml:space="preserve"> PAGEREF _Toc243403830 \h </w:instrText>
         </w:r>
         <w:r>
           <w:rPr>
@@ -614,7 +614,7 @@
           <w14:ligatures w14:val="standardContextual"/>
         </w:rPr>
       </w:pPr>
-      <w:hyperlink w:anchor="_Toc243389755" w:history="1">
+      <w:hyperlink w:anchor="_Toc243403831" w:history="1">
         <w:r>
           <w:rPr>
             <w:rStyle w:val="Hyperlink"/>
@@ -641,7 +641,7 @@
             <w:noProof/>
             <w:webHidden/>
           </w:rPr>
-          <w:instrText xml:space="preserve"> PAGEREF _Toc243389755 \h </w:instrText>
+          <w:instrText xml:space="preserve"> PAGEREF _Toc243403831 \h </w:instrText>
         </w:r>
         <w:r>
           <w:rPr>
@@ -688,7 +688,7 @@
           <w14:ligatures w14:val="standardContextual"/>
         </w:rPr>
       </w:pPr>
-      <w:hyperlink w:anchor="_Toc243389756" w:history="1">
+      <w:hyperlink w:anchor="_Toc243403832" w:history="1">
         <w:r>
           <w:rPr>
             <w:rStyle w:val="Hyperlink"/>
@@ -715,7 +715,7 @@
             <w:noProof/>
             <w:webHidden/>
           </w:rPr>
-          <w:instrText xml:space="preserve"> PAGEREF _Toc243389756 \h </w:instrText>
+          <w:instrText xml:space="preserve"> PAGEREF _Toc243403832 \h </w:instrText>
         </w:r>
         <w:r>
           <w:rPr>
@@ -762,7 +762,7 @@
           <w14:ligatures w14:val="standardContextual"/>
         </w:rPr>
       </w:pPr>
-      <w:hyperlink w:anchor="_Toc243389757" w:history="1">
+      <w:hyperlink w:anchor="_Toc243403833" w:history="1">
         <w:r>
           <w:rPr>
             <w:rStyle w:val="Hyperlink"/>
@@ -789,7 +789,7 @@
             <w:noProof/>
             <w:webHidden/>
           </w:rPr>
-          <w:instrText xml:space="preserve"> PAGEREF _Toc243389757 \h </w:instrText>
+          <w:instrText xml:space="preserve"> PAGEREF _Toc243403833 \h </w:instrText>
         </w:r>
         <w:r>
           <w:rPr>
@@ -836,7 +836,7 @@
           <w14:ligatures w14:val="standardContextual"/>
         </w:rPr>
       </w:pPr>
-      <w:hyperlink w:anchor="_Toc243389758" w:history="1">
+      <w:hyperlink w:anchor="_Toc243403834" w:history="1">
         <w:r>
           <w:rPr>
             <w:rStyle w:val="Hyperlink"/>
@@ -863,7 +863,7 @@
             <w:noProof/>
             <w:webHidden/>
           </w:rPr>
-          <w:instrText xml:space="preserve"> PAGEREF _Toc243389758 \h </w:instrText>
+          <w:instrText xml:space="preserve"> PAGEREF _Toc243403834 \h </w:instrText>
         </w:r>
         <w:r>
           <w:rPr>
@@ -910,7 +910,7 @@
           <w14:ligatures w14:val="standardContextual"/>
         </w:rPr>
       </w:pPr>
-      <w:hyperlink w:anchor="_Toc243389759" w:history="1">
+      <w:hyperlink w:anchor="_Toc243403835" w:history="1">
         <w:r>
           <w:rPr>
             <w:rStyle w:val="Hyperlink"/>
@@ -937,7 +937,7 @@
             <w:noProof/>
             <w:webHidden/>
           </w:rPr>
-          <w:instrText xml:space="preserve"> PAGEREF _Toc243389759 \h </w:instrText>
+          <w:instrText xml:space="preserve"> PAGEREF _Toc243403835 \h </w:instrText>
         </w:r>
         <w:r>
           <w:rPr>
@@ -984,7 +984,7 @@
           <w14:ligatures w14:val="standardContextual"/>
         </w:rPr>
       </w:pPr>
-      <w:hyperlink w:anchor="_Toc243389760" w:history="1">
+      <w:hyperlink w:anchor="_Toc243403836" w:history="1">
         <w:r>
           <w:rPr>
             <w:rStyle w:val="Hyperlink"/>
@@ -1011,7 +1011,7 @@
             <w:noProof/>
             <w:webHidden/>
           </w:rPr>
-          <w:instrText xml:space="preserve"> PAGEREF _Toc243389760 \h </w:instrText>
+          <w:instrText xml:space="preserve"> PAGEREF _Toc243403836 \h </w:instrText>
         </w:r>
         <w:r>
           <w:rPr>
@@ -1058,7 +1058,7 @@
           <w14:ligatures w14:val="standardContextual"/>
         </w:rPr>
       </w:pPr>
-      <w:hyperlink w:anchor="_Toc243389761" w:history="1">
+      <w:hyperlink w:anchor="_Toc243403837" w:history="1">
         <w:r>
           <w:rPr>
             <w:rStyle w:val="Hyperlink"/>
@@ -1085,7 +1085,7 @@
             <w:noProof/>
             <w:webHidden/>
           </w:rPr>
-          <w:instrText xml:space="preserve"> PAGEREF _Toc243389761 \h </w:instrText>
+          <w:instrText xml:space="preserve"> PAGEREF _Toc243403837 \h </w:instrText>
         </w:r>
         <w:r>
           <w:rPr>
@@ -1132,7 +1132,7 @@
           <w14:ligatures w14:val="standardContextual"/>
         </w:rPr>
       </w:pPr>
-      <w:hyperlink w:anchor="_Toc243389762" w:history="1">
+      <w:hyperlink w:anchor="_Toc243403838" w:history="1">
         <w:r>
           <w:rPr>
             <w:rStyle w:val="Hyperlink"/>
@@ -1159,7 +1159,7 @@
             <w:noProof/>
             <w:webHidden/>
           </w:rPr>
-          <w:instrText xml:space="preserve"> PAGEREF _Toc243389762 \h </w:instrText>
+          <w:instrText xml:space="preserve"> PAGEREF _Toc243403838 \h </w:instrText>
         </w:r>
         <w:r>
           <w:rPr>
@@ -1206,7 +1206,7 @@
           <w14:ligatures w14:val="standardContextual"/>
         </w:rPr>
       </w:pPr>
-      <w:hyperlink w:anchor="_Toc243389763" w:history="1">
+      <w:hyperlink w:anchor="_Toc243403839" w:history="1">
         <w:r>
           <w:rPr>
             <w:rStyle w:val="Hyperlink"/>
@@ -1233,7 +1233,7 @@
             <w:noProof/>
             <w:webHidden/>
           </w:rPr>
-          <w:instrText xml:space="preserve"> PAGEREF _Toc243389763 \h </w:instrText>
+          <w:instrText xml:space="preserve"> PAGEREF _Toc243403839 \h </w:instrText>
         </w:r>
         <w:r>
           <w:rPr>
@@ -1280,7 +1280,7 @@
           <w14:ligatures w14:val="standardContextual"/>
         </w:rPr>
       </w:pPr>
-      <w:hyperlink w:anchor="_Toc243389764" w:history="1">
+      <w:hyperlink w:anchor="_Toc243403840" w:history="1">
         <w:r>
           <w:rPr>
             <w:rStyle w:val="Hyperlink"/>
@@ -1307,7 +1307,7 @@
             <w:noProof/>
             <w:webHidden/>
           </w:rPr>
-          <w:instrText xml:space="preserve"> PAGEREF _Toc243389764 \h </w:instrText>
+          <w:instrText xml:space="preserve"> PAGEREF _Toc243403840 \h </w:instrText>
         </w:r>
         <w:r>
           <w:rPr>
@@ -1354,7 +1354,7 @@
           <w14:ligatures w14:val="standardContextual"/>
         </w:rPr>
       </w:pPr>
-      <w:hyperlink w:anchor="_Toc243389765" w:history="1">
+      <w:hyperlink w:anchor="_Toc243403841" w:history="1">
         <w:r>
           <w:rPr>
             <w:rStyle w:val="Hyperlink"/>
@@ -1381,7 +1381,7 @@
             <w:noProof/>
             <w:webHidden/>
           </w:rPr>
-          <w:instrText xml:space="preserve"> PAGEREF _Toc243389765 \h </w:instrText>
+          <w:instrText xml:space="preserve"> PAGEREF _Toc243403841 \h </w:instrText>
         </w:r>
         <w:r>
           <w:rPr>
@@ -1428,7 +1428,7 @@
           <w14:ligatures w14:val="standardContextual"/>
         </w:rPr>
       </w:pPr>
-      <w:hyperlink w:anchor="_Toc243389766" w:history="1">
+      <w:hyperlink w:anchor="_Toc243403842" w:history="1">
         <w:r>
           <w:rPr>
             <w:rStyle w:val="Hyperlink"/>
@@ -1455,7 +1455,7 @@
             <w:noProof/>
             <w:webHidden/>
           </w:rPr>
-          <w:instrText xml:space="preserve"> PAGEREF _Toc243389766 \h </w:instrText>
+          <w:instrText xml:space="preserve"> PAGEREF _Toc243403842 \h </w:instrText>
         </w:r>
         <w:r>
           <w:rPr>
@@ -1502,7 +1502,7 @@
           <w14:ligatures w14:val="standardContextual"/>
         </w:rPr>
       </w:pPr>
-      <w:hyperlink w:anchor="_Toc243389767" w:history="1">
+      <w:hyperlink w:anchor="_Toc243403843" w:history="1">
         <w:r>
           <w:rPr>
             <w:rStyle w:val="Hyperlink"/>
@@ -1529,7 +1529,7 @@
             <w:noProof/>
             <w:webHidden/>
           </w:rPr>
-          <w:instrText xml:space="preserve"> PAGEREF _Toc243389767 \h </w:instrText>
+          <w:instrText xml:space="preserve"> PAGEREF _Toc243403843 \h </w:instrText>
         </w:r>
         <w:r>
           <w:rPr>
@@ -1576,7 +1576,7 @@
           <w14:ligatures w14:val="standardContextual"/>
         </w:rPr>
       </w:pPr>
-      <w:hyperlink w:anchor="_Toc243389768" w:history="1">
+      <w:hyperlink w:anchor="_Toc243403844" w:history="1">
         <w:r>
           <w:rPr>
             <w:rStyle w:val="Hyperlink"/>
@@ -1603,7 +1603,7 @@
             <w:noProof/>
             <w:webHidden/>
           </w:rPr>
-          <w:instrText xml:space="preserve"> PAGEREF _Toc243389768 \h </w:instrText>
+          <w:instrText xml:space="preserve"> PAGEREF _Toc243403844 \h </w:instrText>
         </w:r>
         <w:r>
           <w:rPr>
@@ -1650,7 +1650,7 @@
           <w14:ligatures w14:val="standardContextual"/>
         </w:rPr>
       </w:pPr>
-      <w:hyperlink w:anchor="_Toc243389769" w:history="1">
+      <w:hyperlink w:anchor="_Toc243403845" w:history="1">
         <w:r>
           <w:rPr>
             <w:rStyle w:val="Hyperlink"/>
@@ -1677,7 +1677,7 @@
             <w:noProof/>
             <w:webHidden/>
           </w:rPr>
-          <w:instrText xml:space="preserve"> PAGEREF _Toc243389769 \h </w:instrText>
+          <w:instrText xml:space="preserve"> PAGEREF _Toc243403845 \h </w:instrText>
         </w:r>
         <w:r>
           <w:rPr>
@@ -1724,7 +1724,7 @@
           <w14:ligatures w14:val="standardContextual"/>
         </w:rPr>
       </w:pPr>
-      <w:hyperlink w:anchor="_Toc243389770" w:history="1">
+      <w:hyperlink w:anchor="_Toc243403846" w:history="1">
         <w:r>
           <w:rPr>
             <w:rStyle w:val="Hyperlink"/>
@@ -1751,7 +1751,7 @@
             <w:noProof/>
             <w:webHidden/>
           </w:rPr>
-          <w:instrText xml:space="preserve"> PAGEREF _Toc243389770 \h </w:instrText>
+          <w:instrText xml:space="preserve"> PAGEREF _Toc243403846 \h </w:instrText>
         </w:r>
         <w:r>
           <w:rPr>
@@ -1798,7 +1798,7 @@
           <w14:ligatures w14:val="standardContextual"/>
         </w:rPr>
       </w:pPr>
-      <w:hyperlink w:anchor="_Toc243389771" w:history="1">
+      <w:hyperlink w:anchor="_Toc243403847" w:history="1">
         <w:r>
           <w:rPr>
             <w:rStyle w:val="Hyperlink"/>
@@ -1825,7 +1825,7 @@
             <w:noProof/>
             <w:webHidden/>
           </w:rPr>
-          <w:instrText xml:space="preserve"> PAGEREF _Toc243389771 \h </w:instrText>
+          <w:instrText xml:space="preserve"> PAGEREF _Toc243403847 \h </w:instrText>
         </w:r>
         <w:r>
           <w:rPr>
@@ -1872,7 +1872,7 @@
           <w14:ligatures w14:val="standardContextual"/>
         </w:rPr>
       </w:pPr>
-      <w:hyperlink w:anchor="_Toc243389772" w:history="1">
+      <w:hyperlink w:anchor="_Toc243403848" w:history="1">
         <w:r>
           <w:rPr>
             <w:rStyle w:val="Hyperlink"/>
@@ -1899,7 +1899,7 @@
             <w:noProof/>
             <w:webHidden/>
           </w:rPr>
-          <w:instrText xml:space="preserve"> PAGEREF _Toc243389772 \h </w:instrText>
+          <w:instrText xml:space="preserve"> PAGEREF _Toc243403848 \h </w:instrText>
         </w:r>
         <w:r>
           <w:rPr>
@@ -1946,7 +1946,7 @@
           <w14:ligatures w14:val="standardContextual"/>
         </w:rPr>
       </w:pPr>
-      <w:hyperlink w:anchor="_Toc243389773" w:history="1">
+      <w:hyperlink w:anchor="_Toc243403849" w:history="1">
         <w:r>
           <w:rPr>
             <w:rStyle w:val="Hyperlink"/>
@@ -1973,7 +1973,7 @@
             <w:noProof/>
             <w:webHidden/>
           </w:rPr>
-          <w:instrText xml:space="preserve"> PAGEREF _Toc243389773 \h </w:instrText>
+          <w:instrText xml:space="preserve"> PAGEREF _Toc243403849 \h </w:instrText>
         </w:r>
         <w:r>
           <w:rPr>
@@ -2020,7 +2020,7 @@
           <w14:ligatures w14:val="standardContextual"/>
         </w:rPr>
       </w:pPr>
-      <w:hyperlink w:anchor="_Toc243389774" w:history="1">
+      <w:hyperlink w:anchor="_Toc243403850" w:history="1">
         <w:r>
           <w:rPr>
             <w:rStyle w:val="Hyperlink"/>
@@ -2047,7 +2047,7 @@
             <w:noProof/>
             <w:webHidden/>
           </w:rPr>
-          <w:instrText xml:space="preserve"> PAGEREF _Toc243389774 \h </w:instrText>
+          <w:instrText xml:space="preserve"> PAGEREF _Toc243403850 \h </w:instrText>
         </w:r>
         <w:r>
           <w:rPr>
@@ -2094,7 +2094,7 @@
           <w14:ligatures w14:val="standardContextual"/>
         </w:rPr>
       </w:pPr>
-      <w:hyperlink w:anchor="_Toc243389775" w:history="1">
+      <w:hyperlink w:anchor="_Toc243403851" w:history="1">
         <w:r>
           <w:rPr>
             <w:rStyle w:val="Hyperlink"/>
@@ -2121,7 +2121,7 @@
             <w:noProof/>
             <w:webHidden/>
           </w:rPr>
-          <w:instrText xml:space="preserve"> PAGEREF _Toc243389775 \h </w:instrText>
+          <w:instrText xml:space="preserve"> PAGEREF _Toc243403851 \h </w:instrText>
         </w:r>
         <w:r>
           <w:rPr>
@@ -2168,7 +2168,7 @@
           <w14:ligatures w14:val="standardContextual"/>
         </w:rPr>
       </w:pPr>
-      <w:hyperlink w:anchor="_Toc243389776" w:history="1">
+      <w:hyperlink w:anchor="_Toc243403852" w:history="1">
         <w:r>
           <w:rPr>
             <w:rStyle w:val="Hyperlink"/>
@@ -2195,7 +2195,7 @@
             <w:noProof/>
             <w:webHidden/>
           </w:rPr>
-          <w:instrText xml:space="preserve"> PAGEREF _Toc243389776 \h </w:instrText>
+          <w:instrText xml:space="preserve"> PAGEREF _Toc243403852 \h </w:instrText>
         </w:r>
         <w:r>
           <w:rPr>
@@ -2242,7 +2242,7 @@
           <w14:ligatures w14:val="standardContextual"/>
         </w:rPr>
       </w:pPr>
-      <w:hyperlink w:anchor="_Toc243389777" w:history="1">
+      <w:hyperlink w:anchor="_Toc243403853" w:history="1">
         <w:r>
           <w:rPr>
             <w:rStyle w:val="Hyperlink"/>
@@ -2269,7 +2269,7 @@
             <w:noProof/>
             <w:webHidden/>
           </w:rPr>
-          <w:instrText xml:space="preserve"> PAGEREF _Toc243389777 \h </w:instrText>
+          <w:instrText xml:space="preserve"> PAGEREF _Toc243403853 \h </w:instrText>
         </w:r>
         <w:r>
           <w:rPr>
@@ -2316,7 +2316,7 @@
           <w14:ligatures w14:val="standardContextual"/>
         </w:rPr>
       </w:pPr>
-      <w:hyperlink w:anchor="_Toc243389778" w:history="1">
+      <w:hyperlink w:anchor="_Toc243403854" w:history="1">
         <w:r>
           <w:rPr>
             <w:rStyle w:val="Hyperlink"/>
@@ -2343,7 +2343,7 @@
             <w:noProof/>
             <w:webHidden/>
           </w:rPr>
-          <w:instrText xml:space="preserve"> PAGEREF _Toc243389778 \h </w:instrText>
+          <w:instrText xml:space="preserve"> PAGEREF _Toc243403854 \h </w:instrText>
         </w:r>
         <w:r>
           <w:rPr>
@@ -2390,7 +2390,7 @@
           <w14:ligatures w14:val="standardContextual"/>
         </w:rPr>
       </w:pPr>
-      <w:hyperlink w:anchor="_Toc243389779" w:history="1">
+      <w:hyperlink w:anchor="_Toc243403855" w:history="1">
         <w:r>
           <w:rPr>
             <w:rStyle w:val="Hyperlink"/>
@@ -2417,7 +2417,7 @@
             <w:noProof/>
             <w:webHidden/>
           </w:rPr>
-          <w:instrText xml:space="preserve"> PAGEREF _Toc243389779 \h </w:instrText>
+          <w:instrText xml:space="preserve"> PAGEREF _Toc243403855 \h </w:instrText>
         </w:r>
         <w:r>
           <w:rPr>
@@ -2464,7 +2464,7 @@
           <w14:ligatures w14:val="standardContextual"/>
         </w:rPr>
       </w:pPr>
-      <w:hyperlink w:anchor="_Toc243389780" w:history="1">
+      <w:hyperlink w:anchor="_Toc243403856" w:history="1">
         <w:r>
           <w:rPr>
             <w:rStyle w:val="Hyperlink"/>
@@ -2491,7 +2491,7 @@
             <w:noProof/>
             <w:webHidden/>
           </w:rPr>
-          <w:instrText xml:space="preserve"> PAGEREF _Toc243389780 \h </w:instrText>
+          <w:instrText xml:space="preserve"> PAGEREF _Toc243403856 \h </w:instrText>
         </w:r>
         <w:r>
           <w:rPr>
@@ -2538,7 +2538,7 @@
           <w14:ligatures w14:val="standardContextual"/>
         </w:rPr>
       </w:pPr>
-      <w:hyperlink w:anchor="_Toc243389781" w:history="1">
+      <w:hyperlink w:anchor="_Toc243403857" w:history="1">
         <w:r>
           <w:rPr>
             <w:rStyle w:val="Hyperlink"/>
@@ -2565,7 +2565,7 @@
             <w:noProof/>
             <w:webHidden/>
           </w:rPr>
-          <w:instrText xml:space="preserve"> PAGEREF _Toc243389781 \h </w:instrText>
+          <w:instrText xml:space="preserve"> PAGEREF _Toc243403857 \h </w:instrText>
         </w:r>
         <w:r>
           <w:rPr>
@@ -2612,7 +2612,7 @@
           <w14:ligatures w14:val="standardContextual"/>
         </w:rPr>
       </w:pPr>
-      <w:hyperlink w:anchor="_Toc243389782" w:history="1">
+      <w:hyperlink w:anchor="_Toc243403858" w:history="1">
         <w:r>
           <w:rPr>
             <w:rStyle w:val="Hyperlink"/>
@@ -2639,7 +2639,7 @@
             <w:noProof/>
             <w:webHidden/>
           </w:rPr>
-          <w:instrText xml:space="preserve"> PAGEREF _Toc243389782 \h </w:instrText>
+          <w:instrText xml:space="preserve"> PAGEREF _Toc243403858 \h </w:instrText>
         </w:r>
         <w:r>
           <w:rPr>
@@ -2686,7 +2686,7 @@
           <w14:ligatures w14:val="standardContextual"/>
         </w:rPr>
       </w:pPr>
-      <w:hyperlink w:anchor="_Toc243389783" w:history="1">
+      <w:hyperlink w:anchor="_Toc243403859" w:history="1">
         <w:r>
           <w:rPr>
             <w:rStyle w:val="Hyperlink"/>
@@ -2713,7 +2713,7 @@
             <w:noProof/>
             <w:webHidden/>
           </w:rPr>
-          <w:instrText xml:space="preserve"> PAGEREF _Toc243389783 \h </w:instrText>
+          <w:instrText xml:space="preserve"> PAGEREF _Toc243403859 \h </w:instrText>
         </w:r>
         <w:r>
           <w:rPr>
@@ -2760,7 +2760,7 @@
           <w14:ligatures w14:val="standardContextual"/>
         </w:rPr>
       </w:pPr>
-      <w:hyperlink w:anchor="_Toc243389784" w:history="1">
+      <w:hyperlink w:anchor="_Toc243403860" w:history="1">
         <w:r>
           <w:rPr>
             <w:rStyle w:val="Hyperlink"/>
@@ -2787,7 +2787,7 @@
             <w:noProof/>
             <w:webHidden/>
           </w:rPr>
-          <w:instrText xml:space="preserve"> PAGEREF _Toc243389784 \h </w:instrText>
+          <w:instrText xml:space="preserve"> PAGEREF _Toc243403860 \h </w:instrText>
         </w:r>
         <w:r>
           <w:rPr>
@@ -2834,7 +2834,7 @@
           <w14:ligatures w14:val="standardContextual"/>
         </w:rPr>
       </w:pPr>
-      <w:hyperlink w:anchor="_Toc243389785" w:history="1">
+      <w:hyperlink w:anchor="_Toc243403861" w:history="1">
         <w:r>
           <w:rPr>
             <w:rStyle w:val="Hyperlink"/>
@@ -2861,7 +2861,7 @@
             <w:noProof/>
             <w:webHidden/>
           </w:rPr>
-          <w:instrText xml:space="preserve"> PAGEREF _Toc243389785 \h </w:instrText>
+          <w:instrText xml:space="preserve"> PAGEREF _Toc243403861 \h </w:instrText>
         </w:r>
         <w:r>
           <w:rPr>
@@ -2908,7 +2908,7 @@
           <w14:ligatures w14:val="standardContextual"/>
         </w:rPr>
       </w:pPr>
-      <w:hyperlink w:anchor="_Toc243389786" w:history="1">
+      <w:hyperlink w:anchor="_Toc243403862" w:history="1">
         <w:r>
           <w:rPr>
             <w:rStyle w:val="Hyperlink"/>
@@ -2935,7 +2935,7 @@
             <w:noProof/>
             <w:webHidden/>
           </w:rPr>
-          <w:instrText xml:space="preserve"> PAGEREF _Toc243389786 \h </w:instrText>
+          <w:instrText xml:space="preserve"> PAGEREF _Toc243403862 \h </w:instrText>
         </w:r>
         <w:r>
           <w:rPr>
@@ -2955,7 +2955,7 @@
             <w:noProof/>
             <w:webHidden/>
           </w:rPr>
-          <w:t>16</w:t>
+          <w:t>17</w:t>
         </w:r>
         <w:r>
           <w:rPr>
@@ -2982,7 +2982,7 @@
           <w14:ligatures w14:val="standardContextual"/>
         </w:rPr>
       </w:pPr>
-      <w:hyperlink w:anchor="_Toc243389787" w:history="1">
+      <w:hyperlink w:anchor="_Toc243403863" w:history="1">
         <w:r>
           <w:rPr>
             <w:rStyle w:val="Hyperlink"/>
@@ -3009,7 +3009,7 @@
             <w:noProof/>
             <w:webHidden/>
           </w:rPr>
-          <w:instrText xml:space="preserve"> PAGEREF _Toc243389787 \h </w:instrText>
+          <w:instrText xml:space="preserve"> PAGEREF _Toc243403863 \h </w:instrText>
         </w:r>
         <w:r>
           <w:rPr>
@@ -3029,7 +3029,7 @@
             <w:noProof/>
             <w:webHidden/>
           </w:rPr>
-          <w:t>17</w:t>
+          <w:t>18</w:t>
         </w:r>
         <w:r>
           <w:rPr>
@@ -3056,7 +3056,7 @@
           <w14:ligatures w14:val="standardContextual"/>
         </w:rPr>
       </w:pPr>
-      <w:hyperlink w:anchor="_Toc243389788" w:history="1">
+      <w:hyperlink w:anchor="_Toc243403864" w:history="1">
         <w:r>
           <w:rPr>
             <w:rStyle w:val="Hyperlink"/>
@@ -3083,7 +3083,7 @@
             <w:noProof/>
             <w:webHidden/>
           </w:rPr>
-          <w:instrText xml:space="preserve"> PAGEREF _Toc243389788 \h </w:instrText>
+          <w:instrText xml:space="preserve"> PAGEREF _Toc243403864 \h </w:instrText>
         </w:r>
         <w:r>
           <w:rPr>
@@ -3103,7 +3103,7 @@
             <w:noProof/>
             <w:webHidden/>
           </w:rPr>
-          <w:t>17</w:t>
+          <w:t>18</w:t>
         </w:r>
         <w:r>
           <w:rPr>
@@ -3130,7 +3130,7 @@
           <w14:ligatures w14:val="standardContextual"/>
         </w:rPr>
       </w:pPr>
-      <w:hyperlink w:anchor="_Toc243389789" w:history="1">
+      <w:hyperlink w:anchor="_Toc243403865" w:history="1">
         <w:r>
           <w:rPr>
             <w:rStyle w:val="Hyperlink"/>
@@ -3157,7 +3157,7 @@
             <w:noProof/>
             <w:webHidden/>
           </w:rPr>
-          <w:instrText xml:space="preserve"> PAGEREF _Toc243389789 \h </w:instrText>
+          <w:instrText xml:space="preserve"> PAGEREF _Toc243403865 \h </w:instrText>
         </w:r>
         <w:r>
           <w:rPr>
@@ -3177,7 +3177,7 @@
             <w:noProof/>
             <w:webHidden/>
           </w:rPr>
-          <w:t>17</w:t>
+          <w:t>18</w:t>
         </w:r>
         <w:r>
           <w:rPr>
@@ -3204,7 +3204,7 @@
           <w14:ligatures w14:val="standardContextual"/>
         </w:rPr>
       </w:pPr>
-      <w:hyperlink w:anchor="_Toc243389790" w:history="1">
+      <w:hyperlink w:anchor="_Toc243403866" w:history="1">
         <w:r>
           <w:rPr>
             <w:rStyle w:val="Hyperlink"/>
@@ -3231,7 +3231,7 @@
             <w:noProof/>
             <w:webHidden/>
           </w:rPr>
-          <w:instrText xml:space="preserve"> PAGEREF _Toc243389790 \h </w:instrText>
+          <w:instrText xml:space="preserve"> PAGEREF _Toc243403866 \h </w:instrText>
         </w:r>
         <w:r>
           <w:rPr>
@@ -3251,7 +3251,7 @@
             <w:noProof/>
             <w:webHidden/>
           </w:rPr>
-          <w:t>18</w:t>
+          <w:t>19</w:t>
         </w:r>
         <w:r>
           <w:rPr>
@@ -3278,7 +3278,7 @@
           <w14:ligatures w14:val="standardContextual"/>
         </w:rPr>
       </w:pPr>
-      <w:hyperlink w:anchor="_Toc243389791" w:history="1">
+      <w:hyperlink w:anchor="_Toc243403867" w:history="1">
         <w:r>
           <w:rPr>
             <w:rStyle w:val="Hyperlink"/>
@@ -3305,7 +3305,7 @@
             <w:noProof/>
             <w:webHidden/>
           </w:rPr>
-          <w:instrText xml:space="preserve"> PAGEREF _Toc243389791 \h </w:instrText>
+          <w:instrText xml:space="preserve"> PAGEREF _Toc243403867 \h </w:instrText>
         </w:r>
         <w:r>
           <w:rPr>
@@ -3325,7 +3325,7 @@
             <w:noProof/>
             <w:webHidden/>
           </w:rPr>
-          <w:t>18</w:t>
+          <w:t>19</w:t>
         </w:r>
         <w:r>
           <w:rPr>
@@ -3352,7 +3352,7 @@
           <w14:ligatures w14:val="standardContextual"/>
         </w:rPr>
       </w:pPr>
-      <w:hyperlink w:anchor="_Toc243389792" w:history="1">
+      <w:hyperlink w:anchor="_Toc243403868" w:history="1">
         <w:r>
           <w:rPr>
             <w:rStyle w:val="Hyperlink"/>
@@ -3379,7 +3379,7 @@
             <w:noProof/>
             <w:webHidden/>
           </w:rPr>
-          <w:instrText xml:space="preserve"> PAGEREF _Toc243389792 \h </w:instrText>
+          <w:instrText xml:space="preserve"> PAGEREF _Toc243403868 \h </w:instrText>
         </w:r>
         <w:r>
           <w:rPr>
@@ -3399,7 +3399,7 @@
             <w:noProof/>
             <w:webHidden/>
           </w:rPr>
-          <w:t>19</w:t>
+          <w:t>20</w:t>
         </w:r>
         <w:r>
           <w:rPr>
@@ -3426,7 +3426,7 @@
           <w14:ligatures w14:val="standardContextual"/>
         </w:rPr>
       </w:pPr>
-      <w:hyperlink w:anchor="_Toc243389793" w:history="1">
+      <w:hyperlink w:anchor="_Toc243403869" w:history="1">
         <w:r>
           <w:rPr>
             <w:rStyle w:val="Hyperlink"/>
@@ -3453,7 +3453,7 @@
             <w:noProof/>
             <w:webHidden/>
           </w:rPr>
-          <w:instrText xml:space="preserve"> PAGEREF _Toc243389793 \h </w:instrText>
+          <w:instrText xml:space="preserve"> PAGEREF _Toc243403869 \h </w:instrText>
         </w:r>
         <w:r>
           <w:rPr>
@@ -3473,7 +3473,7 @@
             <w:noProof/>
             <w:webHidden/>
           </w:rPr>
-          <w:t>19</w:t>
+          <w:t>20</w:t>
         </w:r>
         <w:r>
           <w:rPr>
@@ -3500,7 +3500,7 @@
           <w14:ligatures w14:val="standardContextual"/>
         </w:rPr>
       </w:pPr>
-      <w:hyperlink w:anchor="_Toc243389794" w:history="1">
+      <w:hyperlink w:anchor="_Toc243403870" w:history="1">
         <w:r>
           <w:rPr>
             <w:rStyle w:val="Hyperlink"/>
@@ -3527,7 +3527,7 @@
             <w:noProof/>
             <w:webHidden/>
           </w:rPr>
-          <w:instrText xml:space="preserve"> PAGEREF _Toc243389794 \h </w:instrText>
+          <w:instrText xml:space="preserve"> PAGEREF _Toc243403870 \h </w:instrText>
         </w:r>
         <w:r>
           <w:rPr>
@@ -3547,7 +3547,7 @@
             <w:noProof/>
             <w:webHidden/>
           </w:rPr>
-          <w:t>19</w:t>
+          <w:t>20</w:t>
         </w:r>
         <w:r>
           <w:rPr>
@@ -3574,7 +3574,7 @@
           <w14:ligatures w14:val="standardContextual"/>
         </w:rPr>
       </w:pPr>
-      <w:hyperlink w:anchor="_Toc243389795" w:history="1">
+      <w:hyperlink w:anchor="_Toc243403871" w:history="1">
         <w:r>
           <w:rPr>
             <w:rStyle w:val="Hyperlink"/>
@@ -3601,7 +3601,7 @@
             <w:noProof/>
             <w:webHidden/>
           </w:rPr>
-          <w:instrText xml:space="preserve"> PAGEREF _Toc243389795 \h </w:instrText>
+          <w:instrText xml:space="preserve"> PAGEREF _Toc243403871 \h </w:instrText>
         </w:r>
         <w:r>
           <w:rPr>
@@ -3621,7 +3621,7 @@
             <w:noProof/>
             <w:webHidden/>
           </w:rPr>
-          <w:t>19</w:t>
+          <w:t>20</w:t>
         </w:r>
         <w:r>
           <w:rPr>
@@ -3648,7 +3648,7 @@
           <w14:ligatures w14:val="standardContextual"/>
         </w:rPr>
       </w:pPr>
-      <w:hyperlink w:anchor="_Toc243389796" w:history="1">
+      <w:hyperlink w:anchor="_Toc243403872" w:history="1">
         <w:r>
           <w:rPr>
             <w:rStyle w:val="Hyperlink"/>
@@ -3675,7 +3675,7 @@
             <w:noProof/>
             <w:webHidden/>
           </w:rPr>
-          <w:instrText xml:space="preserve"> PAGEREF _Toc243389796 \h </w:instrText>
+          <w:instrText xml:space="preserve"> PAGEREF _Toc243403872 \h </w:instrText>
         </w:r>
         <w:r>
           <w:rPr>
@@ -3695,7 +3695,7 @@
             <w:noProof/>
             <w:webHidden/>
           </w:rPr>
-          <w:t>20</w:t>
+          <w:t>21</w:t>
         </w:r>
         <w:r>
           <w:rPr>
@@ -3722,7 +3722,7 @@
           <w14:ligatures w14:val="standardContextual"/>
         </w:rPr>
       </w:pPr>
-      <w:hyperlink w:anchor="_Toc243389797" w:history="1">
+      <w:hyperlink w:anchor="_Toc243403873" w:history="1">
         <w:r>
           <w:rPr>
             <w:rStyle w:val="Hyperlink"/>
@@ -3749,7 +3749,7 @@
             <w:noProof/>
             <w:webHidden/>
           </w:rPr>
-          <w:instrText xml:space="preserve"> PAGEREF _Toc243389797 \h </w:instrText>
+          <w:instrText xml:space="preserve"> PAGEREF _Toc243403873 \h </w:instrText>
         </w:r>
         <w:r>
           <w:rPr>
@@ -3769,7 +3769,7 @@
             <w:noProof/>
             <w:webHidden/>
           </w:rPr>
-          <w:t>20</w:t>
+          <w:t>21</w:t>
         </w:r>
         <w:r>
           <w:rPr>
@@ -3796,7 +3796,7 @@
           <w14:ligatures w14:val="standardContextual"/>
         </w:rPr>
       </w:pPr>
-      <w:hyperlink w:anchor="_Toc243389798" w:history="1">
+      <w:hyperlink w:anchor="_Toc243403874" w:history="1">
         <w:r>
           <w:rPr>
             <w:rStyle w:val="Hyperlink"/>
@@ -3823,7 +3823,7 @@
             <w:noProof/>
             <w:webHidden/>
           </w:rPr>
-          <w:instrText xml:space="preserve"> PAGEREF _Toc243389798 \h </w:instrText>
+          <w:instrText xml:space="preserve"> PAGEREF _Toc243403874 \h </w:instrText>
         </w:r>
         <w:r>
           <w:rPr>
@@ -3843,7 +3843,7 @@
             <w:noProof/>
             <w:webHidden/>
           </w:rPr>
-          <w:t>20</w:t>
+          <w:t>21</w:t>
         </w:r>
         <w:r>
           <w:rPr>
@@ -3870,7 +3870,7 @@
           <w14:ligatures w14:val="standardContextual"/>
         </w:rPr>
       </w:pPr>
-      <w:hyperlink w:anchor="_Toc243389799" w:history="1">
+      <w:hyperlink w:anchor="_Toc243403875" w:history="1">
         <w:r>
           <w:rPr>
             <w:rStyle w:val="Hyperlink"/>
@@ -3897,7 +3897,7 @@
             <w:noProof/>
             <w:webHidden/>
           </w:rPr>
-          <w:instrText xml:space="preserve"> PAGEREF _Toc243389799 \h </w:instrText>
+          <w:instrText xml:space="preserve"> PAGEREF _Toc243403875 \h </w:instrText>
         </w:r>
         <w:r>
           <w:rPr>
@@ -3917,7 +3917,7 @@
             <w:noProof/>
             <w:webHidden/>
           </w:rPr>
-          <w:t>20</w:t>
+          <w:t>21</w:t>
         </w:r>
         <w:r>
           <w:rPr>
@@ -3944,7 +3944,7 @@
           <w14:ligatures w14:val="standardContextual"/>
         </w:rPr>
       </w:pPr>
-      <w:hyperlink w:anchor="_Toc243389800" w:history="1">
+      <w:hyperlink w:anchor="_Toc243403876" w:history="1">
         <w:r>
           <w:rPr>
             <w:rStyle w:val="Hyperlink"/>
@@ -3971,7 +3971,7 @@
             <w:noProof/>
             <w:webHidden/>
           </w:rPr>
-          <w:instrText xml:space="preserve"> PAGEREF _Toc243389800 \h </w:instrText>
+          <w:instrText xml:space="preserve"> PAGEREF _Toc243403876 \h </w:instrText>
         </w:r>
         <w:r>
           <w:rPr>
@@ -3991,7 +3991,7 @@
             <w:noProof/>
             <w:webHidden/>
           </w:rPr>
-          <w:t>20</w:t>
+          <w:t>21</w:t>
         </w:r>
         <w:r>
           <w:rPr>
@@ -4018,7 +4018,7 @@
           <w14:ligatures w14:val="standardContextual"/>
         </w:rPr>
       </w:pPr>
-      <w:hyperlink w:anchor="_Toc243389801" w:history="1">
+      <w:hyperlink w:anchor="_Toc243403877" w:history="1">
         <w:r>
           <w:rPr>
             <w:rStyle w:val="Hyperlink"/>
@@ -4045,7 +4045,7 @@
             <w:noProof/>
             <w:webHidden/>
           </w:rPr>
-          <w:instrText xml:space="preserve"> PAGEREF _Toc243389801 \h </w:instrText>
+          <w:instrText xml:space="preserve"> PAGEREF _Toc243403877 \h </w:instrText>
         </w:r>
         <w:r>
           <w:rPr>
@@ -4065,7 +4065,7 @@
             <w:noProof/>
             <w:webHidden/>
           </w:rPr>
-          <w:t>20</w:t>
+          <w:t>21</w:t>
         </w:r>
         <w:r>
           <w:rPr>
@@ -4092,7 +4092,7 @@
           <w14:ligatures w14:val="standardContextual"/>
         </w:rPr>
       </w:pPr>
-      <w:hyperlink w:anchor="_Toc243389802" w:history="1">
+      <w:hyperlink w:anchor="_Toc243403878" w:history="1">
         <w:r>
           <w:rPr>
             <w:rStyle w:val="Hyperlink"/>
@@ -4119,7 +4119,7 @@
             <w:noProof/>
             <w:webHidden/>
           </w:rPr>
-          <w:instrText xml:space="preserve"> PAGEREF _Toc243389802 \h </w:instrText>
+          <w:instrText xml:space="preserve"> PAGEREF _Toc243403878 \h </w:instrText>
         </w:r>
         <w:r>
           <w:rPr>
@@ -4139,7 +4139,7 @@
             <w:noProof/>
             <w:webHidden/>
           </w:rPr>
-          <w:t>22</w:t>
+          <w:t>23</w:t>
         </w:r>
         <w:r>
           <w:rPr>
@@ -4166,7 +4166,7 @@
           <w14:ligatures w14:val="standardContextual"/>
         </w:rPr>
       </w:pPr>
-      <w:hyperlink w:anchor="_Toc243389803" w:history="1">
+      <w:hyperlink w:anchor="_Toc243403879" w:history="1">
         <w:r>
           <w:rPr>
             <w:rStyle w:val="Hyperlink"/>
@@ -4193,7 +4193,7 @@
             <w:noProof/>
             <w:webHidden/>
           </w:rPr>
-          <w:instrText xml:space="preserve"> PAGEREF _Toc243389803 \h </w:instrText>
+          <w:instrText xml:space="preserve"> PAGEREF _Toc243403879 \h </w:instrText>
         </w:r>
         <w:r>
           <w:rPr>
@@ -4213,7 +4213,7 @@
             <w:noProof/>
             <w:webHidden/>
           </w:rPr>
-          <w:t>22</w:t>
+          <w:t>23</w:t>
         </w:r>
         <w:r>
           <w:rPr>
@@ -4240,7 +4240,7 @@
           <w14:ligatures w14:val="standardContextual"/>
         </w:rPr>
       </w:pPr>
-      <w:hyperlink w:anchor="_Toc243389804" w:history="1">
+      <w:hyperlink w:anchor="_Toc243403880" w:history="1">
         <w:r>
           <w:rPr>
             <w:rStyle w:val="Hyperlink"/>
@@ -4267,7 +4267,7 @@
             <w:noProof/>
             <w:webHidden/>
           </w:rPr>
-          <w:instrText xml:space="preserve"> PAGEREF _Toc243389804 \h </w:instrText>
+          <w:instrText xml:space="preserve"> PAGEREF _Toc243403880 \h </w:instrText>
         </w:r>
         <w:r>
           <w:rPr>
@@ -4287,7 +4287,7 @@
             <w:noProof/>
             <w:webHidden/>
           </w:rPr>
-          <w:t>22</w:t>
+          <w:t>23</w:t>
         </w:r>
         <w:r>
           <w:rPr>
@@ -4314,7 +4314,7 @@
           <w14:ligatures w14:val="standardContextual"/>
         </w:rPr>
       </w:pPr>
-      <w:hyperlink w:anchor="_Toc243389805" w:history="1">
+      <w:hyperlink w:anchor="_Toc243403881" w:history="1">
         <w:r>
           <w:rPr>
             <w:rStyle w:val="Hyperlink"/>
@@ -4341,7 +4341,7 @@
             <w:noProof/>
             <w:webHidden/>
           </w:rPr>
-          <w:instrText xml:space="preserve"> PAGEREF _Toc243389805 \h </w:instrText>
+          <w:instrText xml:space="preserve"> PAGEREF _Toc243403881 \h </w:instrText>
         </w:r>
         <w:r>
           <w:rPr>
@@ -4361,7 +4361,7 @@
             <w:noProof/>
             <w:webHidden/>
           </w:rPr>
-          <w:t>22</w:t>
+          <w:t>23</w:t>
         </w:r>
         <w:r>
           <w:rPr>
@@ -4388,7 +4388,7 @@
           <w14:ligatures w14:val="standardContextual"/>
         </w:rPr>
       </w:pPr>
-      <w:hyperlink w:anchor="_Toc243389806" w:history="1">
+      <w:hyperlink w:anchor="_Toc243403882" w:history="1">
         <w:r>
           <w:rPr>
             <w:rStyle w:val="Hyperlink"/>
@@ -4415,7 +4415,7 @@
             <w:noProof/>
             <w:webHidden/>
           </w:rPr>
-          <w:instrText xml:space="preserve"> PAGEREF _Toc243389806 \h </w:instrText>
+          <w:instrText xml:space="preserve"> PAGEREF _Toc243403882 \h </w:instrText>
         </w:r>
         <w:r>
           <w:rPr>
@@ -4435,7 +4435,7 @@
             <w:noProof/>
             <w:webHidden/>
           </w:rPr>
-          <w:t>22</w:t>
+          <w:t>23</w:t>
         </w:r>
         <w:r>
           <w:rPr>
@@ -4462,7 +4462,7 @@
           <w14:ligatures w14:val="standardContextual"/>
         </w:rPr>
       </w:pPr>
-      <w:hyperlink w:anchor="_Toc243389807" w:history="1">
+      <w:hyperlink w:anchor="_Toc243403883" w:history="1">
         <w:r>
           <w:rPr>
             <w:rStyle w:val="Hyperlink"/>
@@ -4489,7 +4489,7 @@
             <w:noProof/>
             <w:webHidden/>
           </w:rPr>
-          <w:instrText xml:space="preserve"> PAGEREF _Toc243389807 \h </w:instrText>
+          <w:instrText xml:space="preserve"> PAGEREF _Toc243403883 \h </w:instrText>
         </w:r>
         <w:r>
           <w:rPr>
@@ -4509,7 +4509,7 @@
             <w:noProof/>
             <w:webHidden/>
           </w:rPr>
-          <w:t>23</w:t>
+          <w:t>24</w:t>
         </w:r>
         <w:r>
           <w:rPr>
@@ -4536,7 +4536,7 @@
           <w14:ligatures w14:val="standardContextual"/>
         </w:rPr>
       </w:pPr>
-      <w:hyperlink w:anchor="_Toc243389808" w:history="1">
+      <w:hyperlink w:anchor="_Toc243403884" w:history="1">
         <w:r>
           <w:rPr>
             <w:rStyle w:val="Hyperlink"/>
@@ -4563,7 +4563,7 @@
             <w:noProof/>
             <w:webHidden/>
           </w:rPr>
-          <w:instrText xml:space="preserve"> PAGEREF _Toc243389808 \h </w:instrText>
+          <w:instrText xml:space="preserve"> PAGEREF _Toc243403884 \h </w:instrText>
         </w:r>
         <w:r>
           <w:rPr>
@@ -4583,7 +4583,81 @@
             <w:noProof/>
             <w:webHidden/>
           </w:rPr>
-          <w:t>23</w:t>
+          <w:t>24</w:t>
+        </w:r>
+        <w:r>
+          <w:rPr>
+            <w:noProof/>
+            <w:webHidden/>
+          </w:rPr>
+          <w:fldChar w:fldCharType="end"/>
+        </w:r>
+      </w:hyperlink>
+    </w:p>
+    <w:p>
+      <w:pPr>
+        <w:pStyle w:val="TOC2"/>
+        <w:tabs>
+          <w:tab w:val="right" w:leader="dot" w:pos="8630"/>
+        </w:tabs>
+        <w:rPr>
+          <w:rFonts w:asciiTheme="minorHAnsi" w:hAnsiTheme="minorHAnsi"/>
+          <w:noProof/>
+          <w:kern w:val="2"/>
+          <w:sz w:val="24"/>
+          <w:szCs w:val="24"/>
+          <w:lang w:val="en-GB" w:eastAsia="en-GB"/>
+          <w14:ligatures w14:val="standardContextual"/>
+        </w:rPr>
+      </w:pPr>
+      <w:hyperlink w:anchor="_Toc243403885" w:history="1">
+        <w:r>
+          <w:rPr>
+            <w:rStyle w:val="Hyperlink"/>
+            <w:noProof/>
+          </w:rPr>
+          <w:t>11.7 Currencies and exchange rates</w:t>
+        </w:r>
+        <w:r>
+          <w:rPr>
+            <w:noProof/>
+            <w:webHidden/>
+          </w:rPr>
+          <w:tab/>
+        </w:r>
+        <w:r>
+          <w:rPr>
+            <w:noProof/>
+            <w:webHidden/>
+          </w:rPr>
+          <w:fldChar w:fldCharType="begin"/>
+        </w:r>
+        <w:r>
+          <w:rPr>
+            <w:noProof/>
+            <w:webHidden/>
+          </w:rPr>
+          <w:instrText xml:space="preserve"> PAGEREF _Toc243403885 \h </w:instrText>
+        </w:r>
+        <w:r>
+          <w:rPr>
+            <w:noProof/>
+            <w:webHidden/>
+          </w:rPr>
+        </w:r>
+        <w:r>
+          <w:rPr>
+            <w:noProof/>
+            <w:webHidden/>
+          </w:rPr>
+          <w:fldChar w:fldCharType="separate"/>
+        </w:r>
+        <w:r>
+          <w:rPr>
+            <w:noProof/>
+            <w:webHidden/>
+          </w:rPr>
+          <w:t>24</w:t>
         </w:r>
         <w:r>
           <w:rPr>
@@ -4610,7 +4684,7 @@
           <w14:ligatures w14:val="standardContextual"/>
         </w:rPr>
       </w:pPr>
-      <w:hyperlink w:anchor="_Toc243389809" w:history="1">
+      <w:hyperlink w:anchor="_Toc243403886" w:history="1">
         <w:r>
           <w:rPr>
             <w:rStyle w:val="Hyperlink"/>
@@ -4637,7 +4711,7 @@
             <w:noProof/>
             <w:webHidden/>
           </w:rPr>
-          <w:instrText xml:space="preserve"> PAGEREF _Toc243389809 \h </w:instrText>
+          <w:instrText xml:space="preserve"> PAGEREF _Toc243403886 \h </w:instrText>
         </w:r>
         <w:r>
           <w:rPr>
@@ -4657,7 +4731,7 @@
             <w:noProof/>
             <w:webHidden/>
           </w:rPr>
-          <w:t>24</w:t>
+          <w:t>26</w:t>
         </w:r>
         <w:r>
           <w:rPr>
@@ -4684,7 +4758,7 @@
           <w14:ligatures w14:val="standardContextual"/>
         </w:rPr>
       </w:pPr>
-      <w:hyperlink w:anchor="_Toc243389810" w:history="1">
+      <w:hyperlink w:anchor="_Toc243403887" w:history="1">
         <w:r>
           <w:rPr>
             <w:rStyle w:val="Hyperlink"/>
@@ -4711,7 +4785,7 @@
             <w:noProof/>
             <w:webHidden/>
           </w:rPr>
-          <w:instrText xml:space="preserve"> PAGEREF _Toc243389810 \h </w:instrText>
+          <w:instrText xml:space="preserve"> PAGEREF _Toc243403887 \h </w:instrText>
         </w:r>
         <w:r>
           <w:rPr>
@@ -4731,7 +4805,7 @@
             <w:noProof/>
             <w:webHidden/>
           </w:rPr>
-          <w:t>24</w:t>
+          <w:t>26</w:t>
         </w:r>
         <w:r>
           <w:rPr>
@@ -4758,7 +4832,7 @@
           <w14:ligatures w14:val="standardContextual"/>
         </w:rPr>
       </w:pPr>
-      <w:hyperlink w:anchor="_Toc243389811" w:history="1">
+      <w:hyperlink w:anchor="_Toc243403888" w:history="1">
         <w:r>
           <w:rPr>
             <w:rStyle w:val="Hyperlink"/>
@@ -4785,7 +4859,7 @@
             <w:noProof/>
             <w:webHidden/>
           </w:rPr>
-          <w:instrText xml:space="preserve"> PAGEREF _Toc243389811 \h </w:instrText>
+          <w:instrText xml:space="preserve"> PAGEREF _Toc243403888 \h </w:instrText>
         </w:r>
         <w:r>
           <w:rPr>
@@ -4805,7 +4879,7 @@
             <w:noProof/>
             <w:webHidden/>
           </w:rPr>
-          <w:t>24</w:t>
+          <w:t>26</w:t>
         </w:r>
         <w:r>
           <w:rPr>
@@ -4832,7 +4906,7 @@
           <w14:ligatures w14:val="standardContextual"/>
         </w:rPr>
       </w:pPr>
-      <w:hyperlink w:anchor="_Toc243389812" w:history="1">
+      <w:hyperlink w:anchor="_Toc243403889" w:history="1">
         <w:r>
           <w:rPr>
             <w:rStyle w:val="Hyperlink"/>
@@ -4859,7 +4933,7 @@
             <w:noProof/>
             <w:webHidden/>
           </w:rPr>
-          <w:instrText xml:space="preserve"> PAGEREF _Toc243389812 \h </w:instrText>
+          <w:instrText xml:space="preserve"> PAGEREF _Toc243403889 \h </w:instrText>
         </w:r>
         <w:r>
           <w:rPr>
@@ -4879,7 +4953,7 @@
             <w:noProof/>
             <w:webHidden/>
           </w:rPr>
-          <w:t>25</w:t>
+          <w:t>27</w:t>
         </w:r>
         <w:r>
           <w:rPr>
@@ -4906,7 +4980,7 @@
           <w14:ligatures w14:val="standardContextual"/>
         </w:rPr>
       </w:pPr>
-      <w:hyperlink w:anchor="_Toc243389813" w:history="1">
+      <w:hyperlink w:anchor="_Toc243403890" w:history="1">
         <w:r>
           <w:rPr>
             <w:rStyle w:val="Hyperlink"/>
@@ -4933,7 +5007,7 @@
             <w:noProof/>
             <w:webHidden/>
           </w:rPr>
-          <w:instrText xml:space="preserve"> PAGEREF _Toc243389813 \h </w:instrText>
+          <w:instrText xml:space="preserve"> PAGEREF _Toc243403890 \h </w:instrText>
         </w:r>
         <w:r>
           <w:rPr>
@@ -4953,7 +5027,7 @@
             <w:noProof/>
             <w:webHidden/>
           </w:rPr>
-          <w:t>25</w:t>
+          <w:t>27</w:t>
         </w:r>
         <w:r>
           <w:rPr>
@@ -4980,7 +5054,7 @@
           <w14:ligatures w14:val="standardContextual"/>
         </w:rPr>
       </w:pPr>
-      <w:hyperlink w:anchor="_Toc243389814" w:history="1">
+      <w:hyperlink w:anchor="_Toc243403891" w:history="1">
         <w:r>
           <w:rPr>
             <w:rStyle w:val="Hyperlink"/>
@@ -5007,7 +5081,7 @@
             <w:noProof/>
             <w:webHidden/>
           </w:rPr>
-          <w:instrText xml:space="preserve"> PAGEREF _Toc243389814 \h </w:instrText>
+          <w:instrText xml:space="preserve"> PAGEREF _Toc243403891 \h </w:instrText>
         </w:r>
         <w:r>
           <w:rPr>
@@ -5027,7 +5101,7 @@
             <w:noProof/>
             <w:webHidden/>
           </w:rPr>
-          <w:t>25</w:t>
+          <w:t>27</w:t>
         </w:r>
         <w:r>
           <w:rPr>
@@ -5054,7 +5128,7 @@
           <w14:ligatures w14:val="standardContextual"/>
         </w:rPr>
       </w:pPr>
-      <w:hyperlink w:anchor="_Toc243389815" w:history="1">
+      <w:hyperlink w:anchor="_Toc243403892" w:history="1">
         <w:r>
           <w:rPr>
             <w:rStyle w:val="Hyperlink"/>
@@ -5081,7 +5155,7 @@
             <w:noProof/>
             <w:webHidden/>
           </w:rPr>
-          <w:instrText xml:space="preserve"> PAGEREF _Toc243389815 \h </w:instrText>
+          <w:instrText xml:space="preserve"> PAGEREF _Toc243403892 \h </w:instrText>
         </w:r>
         <w:r>
           <w:rPr>
@@ -5101,7 +5175,7 @@
             <w:noProof/>
             <w:webHidden/>
           </w:rPr>
-          <w:t>26</w:t>
+          <w:t>28</w:t>
         </w:r>
         <w:r>
           <w:rPr>
@@ -5128,7 +5202,7 @@
           <w14:ligatures w14:val="standardContextual"/>
         </w:rPr>
       </w:pPr>
-      <w:hyperlink w:anchor="_Toc243389816" w:history="1">
+      <w:hyperlink w:anchor="_Toc243403893" w:history="1">
         <w:r>
           <w:rPr>
             <w:rStyle w:val="Hyperlink"/>
@@ -5155,7 +5229,7 @@
             <w:noProof/>
             <w:webHidden/>
           </w:rPr>
-          <w:instrText xml:space="preserve"> PAGEREF _Toc243389816 \h </w:instrText>
+          <w:instrText xml:space="preserve"> PAGEREF _Toc243403893 \h </w:instrText>
         </w:r>
         <w:r>
           <w:rPr>
@@ -5175,7 +5249,81 @@
             <w:noProof/>
             <w:webHidden/>
           </w:rPr>
-          <w:t>26</w:t>
+          <w:t>28</w:t>
+        </w:r>
+        <w:r>
+          <w:rPr>
+            <w:noProof/>
+            <w:webHidden/>
+          </w:rPr>
+          <w:fldChar w:fldCharType="end"/>
+        </w:r>
+      </w:hyperlink>
+    </w:p>
+    <w:p>
+      <w:pPr>
+        <w:pStyle w:val="TOC1"/>
+        <w:tabs>
+          <w:tab w:val="right" w:leader="dot" w:pos="8630"/>
+        </w:tabs>
+        <w:rPr>
+          <w:rFonts w:asciiTheme="minorHAnsi" w:hAnsiTheme="minorHAnsi"/>
+          <w:noProof/>
+          <w:kern w:val="2"/>
+          <w:sz w:val="24"/>
+          <w:szCs w:val="24"/>
+          <w:lang w:val="en-GB" w:eastAsia="en-GB"/>
+          <w14:ligatures w14:val="standardContextual"/>
+        </w:rPr>
+      </w:pPr>
+      <w:hyperlink w:anchor="_Toc243403894" w:history="1">
+        <w:r>
+          <w:rPr>
+            <w:rStyle w:val="Hyperlink"/>
+            <w:noProof/>
+          </w:rPr>
+          <w:t>14. The Client Portal</w:t>
+        </w:r>
+        <w:r>
+          <w:rPr>
+            <w:noProof/>
+            <w:webHidden/>
+          </w:rPr>
+          <w:tab/>
+        </w:r>
+        <w:r>
+          <w:rPr>
+            <w:noProof/>
+            <w:webHidden/>
+          </w:rPr>
+          <w:fldChar w:fldCharType="begin"/>
+        </w:r>
+        <w:r>
+          <w:rPr>
+            <w:noProof/>
+            <w:webHidden/>
+          </w:rPr>
+          <w:instrText xml:space="preserve"> PAGEREF _Toc243403894 \h </w:instrText>
+        </w:r>
+        <w:r>
+          <w:rPr>
+            <w:noProof/>
+            <w:webHidden/>
+          </w:rPr>
+        </w:r>
+        <w:r>
+          <w:rPr>
+            <w:noProof/>
+            <w:webHidden/>
+          </w:rPr>
+          <w:fldChar w:fldCharType="separate"/>
+        </w:r>
+        <w:r>
+          <w:rPr>
+            <w:noProof/>
+            <w:webHidden/>
+          </w:rPr>
+          <w:t>29</w:t>
         </w:r>
         <w:r>
           <w:rPr>
@@ -5202,13 +5350,13 @@
           <w14:ligatures w14:val="standardContextual"/>
         </w:rPr>
       </w:pPr>
-      <w:hyperlink w:anchor="_Toc243389817" w:history="1">
+      <w:hyperlink w:anchor="_Toc243403895" w:history="1">
         <w:r>
           <w:rPr>
             <w:rStyle w:val="Hyperlink"/>
             <w:noProof/>
           </w:rPr>
-          <w:t>13.5 Currencies</w:t>
+          <w:t>14.1 Signing in</w:t>
         </w:r>
         <w:r>
           <w:rPr>
@@ -5229,7 +5377,7 @@
             <w:noProof/>
             <w:webHidden/>
           </w:rPr>
-          <w:instrText xml:space="preserve"> PAGEREF _Toc243389817 \h </w:instrText>
+          <w:instrText xml:space="preserve"> PAGEREF _Toc243403895 \h </w:instrText>
         </w:r>
         <w:r>
           <w:rPr>
@@ -5249,7 +5397,81 @@
             <w:noProof/>
             <w:webHidden/>
           </w:rPr>
-          <w:t>26</w:t>
+          <w:t>29</w:t>
+        </w:r>
+        <w:r>
+          <w:rPr>
+            <w:noProof/>
+            <w:webHidden/>
+          </w:rPr>
+          <w:fldChar w:fldCharType="end"/>
+        </w:r>
+      </w:hyperlink>
+    </w:p>
+    <w:p>
+      <w:pPr>
+        <w:pStyle w:val="TOC2"/>
+        <w:tabs>
+          <w:tab w:val="right" w:leader="dot" w:pos="8630"/>
+        </w:tabs>
+        <w:rPr>
+          <w:rFonts w:asciiTheme="minorHAnsi" w:hAnsiTheme="minorHAnsi"/>
+          <w:noProof/>
+          <w:kern w:val="2"/>
+          <w:sz w:val="24"/>
+          <w:szCs w:val="24"/>
+          <w:lang w:val="en-GB" w:eastAsia="en-GB"/>
+          <w14:ligatures w14:val="standardContextual"/>
+        </w:rPr>
+      </w:pPr>
+      <w:hyperlink w:anchor="_Toc243403896" w:history="1">
+        <w:r>
+          <w:rPr>
+            <w:rStyle w:val="Hyperlink"/>
+            <w:noProof/>
+          </w:rPr>
+          <w:t>14.2 What clients can do</w:t>
+        </w:r>
+        <w:r>
+          <w:rPr>
+            <w:noProof/>
+            <w:webHidden/>
+          </w:rPr>
+          <w:tab/>
+        </w:r>
+        <w:r>
+          <w:rPr>
+            <w:noProof/>
+            <w:webHidden/>
+          </w:rPr>
+          <w:fldChar w:fldCharType="begin"/>
+        </w:r>
+        <w:r>
+          <w:rPr>
+            <w:noProof/>
+            <w:webHidden/>
+          </w:rPr>
+          <w:instrText xml:space="preserve"> PAGEREF _Toc243403896 \h </w:instrText>
+        </w:r>
+        <w:r>
+          <w:rPr>
+            <w:noProof/>
+            <w:webHidden/>
+          </w:rPr>
+        </w:r>
+        <w:r>
+          <w:rPr>
+            <w:noProof/>
+            <w:webHidden/>
+          </w:rPr>
+          <w:fldChar w:fldCharType="separate"/>
+        </w:r>
+        <w:r>
+          <w:rPr>
+            <w:noProof/>
+            <w:webHidden/>
+          </w:rPr>
+          <w:t>29</w:t>
         </w:r>
         <w:r>
           <w:rPr>
@@ -5276,13 +5498,13 @@
           <w14:ligatures w14:val="standardContextual"/>
         </w:rPr>
       </w:pPr>
-      <w:hyperlink w:anchor="_Toc243389818" w:history="1">
+      <w:hyperlink w:anchor="_Toc243403897" w:history="1">
         <w:r>
           <w:rPr>
             <w:rStyle w:val="Hyperlink"/>
             <w:noProof/>
           </w:rPr>
-          <w:t>14. The Client Portal</w:t>
+          <w:t>Appendix A: Frequently Asked Questions</w:t>
         </w:r>
         <w:r>
           <w:rPr>
@@ -5303,7 +5525,7 @@
             <w:noProof/>
             <w:webHidden/>
           </w:rPr>
-          <w:instrText xml:space="preserve"> PAGEREF _Toc243389818 \h </w:instrText>
+          <w:instrText xml:space="preserve"> PAGEREF _Toc243403897 \h </w:instrText>
         </w:r>
         <w:r>
           <w:rPr>
@@ -5323,155 +5545,7 @@
             <w:noProof/>
             <w:webHidden/>
           </w:rPr>
-          <w:t>28</w:t>
-        </w:r>
-        <w:r>
-          <w:rPr>
-            <w:noProof/>
-            <w:webHidden/>
-          </w:rPr>
-          <w:fldChar w:fldCharType="end"/>
-        </w:r>
-      </w:hyperlink>
-    </w:p>
-    <w:p>
-      <w:pPr>
-        <w:pStyle w:val="TOC2"/>
-        <w:tabs>
-          <w:tab w:val="right" w:leader="dot" w:pos="8630"/>
-        </w:tabs>
-        <w:rPr>
-          <w:rFonts w:asciiTheme="minorHAnsi" w:hAnsiTheme="minorHAnsi"/>
-          <w:noProof/>
-          <w:kern w:val="2"/>
-          <w:sz w:val="24"/>
-          <w:szCs w:val="24"/>
-          <w:lang w:val="en-GB" w:eastAsia="en-GB"/>
-          <w14:ligatures w14:val="standardContextual"/>
-        </w:rPr>
-      </w:pPr>
-      <w:hyperlink w:anchor="_Toc243389819" w:history="1">
-        <w:r>
-          <w:rPr>
-            <w:rStyle w:val="Hyperlink"/>
-            <w:noProof/>
-          </w:rPr>
-          <w:t>14.1 Signing in</w:t>
-        </w:r>
-        <w:r>
-          <w:rPr>
-            <w:noProof/>
-            <w:webHidden/>
-          </w:rPr>
-          <w:tab/>
-        </w:r>
-        <w:r>
-          <w:rPr>
-            <w:noProof/>
-            <w:webHidden/>
-          </w:rPr>
-          <w:fldChar w:fldCharType="begin"/>
-        </w:r>
-        <w:r>
-          <w:rPr>
-            <w:noProof/>
-            <w:webHidden/>
-          </w:rPr>
-          <w:instrText xml:space="preserve"> PAGEREF _Toc243389819 \h </w:instrText>
-        </w:r>
-        <w:r>
-          <w:rPr>
-            <w:noProof/>
-            <w:webHidden/>
-          </w:rPr>
-        </w:r>
-        <w:r>
-          <w:rPr>
-            <w:noProof/>
-            <w:webHidden/>
-          </w:rPr>
-          <w:fldChar w:fldCharType="separate"/>
-        </w:r>
-        <w:r>
-          <w:rPr>
-            <w:noProof/>
-            <w:webHidden/>
-          </w:rPr>
-          <w:t>28</w:t>
-        </w:r>
-        <w:r>
-          <w:rPr>
-            <w:noProof/>
-            <w:webHidden/>
-          </w:rPr>
-          <w:fldChar w:fldCharType="end"/>
-        </w:r>
-      </w:hyperlink>
-    </w:p>
-    <w:p>
-      <w:pPr>
-        <w:pStyle w:val="TOC2"/>
-        <w:tabs>
-          <w:tab w:val="right" w:leader="dot" w:pos="8630"/>
-        </w:tabs>
-        <w:rPr>
-          <w:rFonts w:asciiTheme="minorHAnsi" w:hAnsiTheme="minorHAnsi"/>
-          <w:noProof/>
-          <w:kern w:val="2"/>
-          <w:sz w:val="24"/>
-          <w:szCs w:val="24"/>
-          <w:lang w:val="en-GB" w:eastAsia="en-GB"/>
-          <w14:ligatures w14:val="standardContextual"/>
-        </w:rPr>
-      </w:pPr>
-      <w:hyperlink w:anchor="_Toc243389820" w:history="1">
-        <w:r>
-          <w:rPr>
-            <w:rStyle w:val="Hyperlink"/>
-            <w:noProof/>
-          </w:rPr>
-          <w:t>14.2 What clients can do</w:t>
-        </w:r>
-        <w:r>
-          <w:rPr>
-            <w:noProof/>
-            <w:webHidden/>
-          </w:rPr>
-          <w:tab/>
-        </w:r>
-        <w:r>
-          <w:rPr>
-            <w:noProof/>
-            <w:webHidden/>
-          </w:rPr>
-          <w:fldChar w:fldCharType="begin"/>
-        </w:r>
-        <w:r>
-          <w:rPr>
-            <w:noProof/>
-            <w:webHidden/>
-          </w:rPr>
-          <w:instrText xml:space="preserve"> PAGEREF _Toc243389820 \h </w:instrText>
-        </w:r>
-        <w:r>
-          <w:rPr>
-            <w:noProof/>
-            <w:webHidden/>
-          </w:rPr>
-        </w:r>
-        <w:r>
-          <w:rPr>
-            <w:noProof/>
-            <w:webHidden/>
-          </w:rPr>
-          <w:fldChar w:fldCharType="separate"/>
-        </w:r>
-        <w:r>
-          <w:rPr>
-            <w:noProof/>
-            <w:webHidden/>
-          </w:rPr>
-          <w:t>28</w:t>
+          <w:t>30</w:t>
         </w:r>
         <w:r>
           <w:rPr>
@@ -5498,13 +5572,13 @@
           <w14:ligatures w14:val="standardContextual"/>
         </w:rPr>
       </w:pPr>
-      <w:hyperlink w:anchor="_Toc243389821" w:history="1">
+      <w:hyperlink w:anchor="_Toc243403898" w:history="1">
         <w:r>
           <w:rPr>
             <w:rStyle w:val="Hyperlink"/>
             <w:noProof/>
           </w:rPr>
-          <w:t>Appendix A: Frequently Asked Questions</w:t>
+          <w:t>Appendix B: Document Information</w:t>
         </w:r>
         <w:r>
           <w:rPr>
@@ -5525,7 +5599,7 @@
             <w:noProof/>
             <w:webHidden/>
           </w:rPr>
-          <w:instrText xml:space="preserve"> PAGEREF _Toc243389821 \h </w:instrText>
+          <w:instrText xml:space="preserve"> PAGEREF _Toc243403898 \h </w:instrText>
         </w:r>
         <w:r>
           <w:rPr>
@@ -5545,7 +5619,7 @@
             <w:noProof/>
             <w:webHidden/>
           </w:rPr>
-          <w:t>29</w:t>
+          <w:t>32</w:t>
         </w:r>
         <w:r>
           <w:rPr>
@@ -5562,80 +5636,6 @@
         <w:tabs>
           <w:tab w:val="right" w:leader="dot" w:pos="8630"/>
         </w:tabs>
-        <w:rPr>
-          <w:rFonts w:asciiTheme="minorHAnsi" w:hAnsiTheme="minorHAnsi"/>
-          <w:noProof/>
-          <w:kern w:val="2"/>
-          <w:sz w:val="24"/>
-          <w:szCs w:val="24"/>
-          <w:lang w:val="en-GB" w:eastAsia="en-GB"/>
-          <w14:ligatures w14:val="standardContextual"/>
-        </w:rPr>
-      </w:pPr>
-      <w:hyperlink w:anchor="_Toc243389822" w:history="1">
-        <w:r>
-          <w:rPr>
-            <w:rStyle w:val="Hyperlink"/>
-            <w:noProof/>
-          </w:rPr>
-          <w:t>Appendix B: Document Information</w:t>
-        </w:r>
-        <w:r>
-          <w:rPr>
-            <w:noProof/>
-            <w:webHidden/>
-          </w:rPr>
-          <w:tab/>
-        </w:r>
-        <w:r>
-          <w:rPr>
-            <w:noProof/>
-            <w:webHidden/>
-          </w:rPr>
-          <w:fldChar w:fldCharType="begin"/>
-        </w:r>
-        <w:r>
-          <w:rPr>
-            <w:noProof/>
-            <w:webHidden/>
-          </w:rPr>
-          <w:instrText xml:space="preserve"> PAGEREF _Toc243389822 \h </w:instrText>
-        </w:r>
-        <w:r>
-          <w:rPr>
-            <w:noProof/>
-            <w:webHidden/>
-          </w:rPr>
-        </w:r>
-        <w:r>
-          <w:rPr>
-            <w:noProof/>
-            <w:webHidden/>
-          </w:rPr>
-          <w:fldChar w:fldCharType="separate"/>
-        </w:r>
-        <w:r>
-          <w:rPr>
-            <w:noProof/>
-            <w:webHidden/>
-          </w:rPr>
-          <w:t>31</w:t>
-        </w:r>
-        <w:r>
-          <w:rPr>
-            <w:noProof/>
-            <w:webHidden/>
-          </w:rPr>
-          <w:fldChar w:fldCharType="end"/>
-        </w:r>
-      </w:hyperlink>
-    </w:p>
-    <w:p>
-      <w:pPr>
-        <w:pStyle w:val="TOC1"/>
-        <w:tabs>
-          <w:tab w:val="right" w:leader="dot" w:pos="8630"/>
-        </w:tabs>
       </w:pPr>
       <w:r>
         <w:fldChar w:fldCharType="end"/>
@@ -5646,7 +5646,7 @@
         <w:pStyle w:val="Heading1"/>
         <w:pageBreakBefore/>
       </w:pPr>
-      <w:bookmarkStart w:id="2" w:name="_Toc243389749"/>
+      <w:bookmarkStart w:id="2" w:name="_Toc243403825"/>
       <w:r>
         <w:rPr>
           <w:color w:val="1D4E89"/>
@@ -5659,7 +5659,7 @@
       <w:pPr>
         <w:pStyle w:val="Heading2"/>
       </w:pPr>
-      <w:bookmarkStart w:id="3" w:name="_Toc243389750"/>
+      <w:bookmarkStart w:id="3" w:name="_Toc243403826"/>
       <w:r>
         <w:rPr>
           <w:color w:val="1D4E89"/>
@@ -5762,7 +5762,7 @@
       <w:pPr>
         <w:pStyle w:val="Heading2"/>
       </w:pPr>
-      <w:bookmarkStart w:id="4" w:name="_Toc243389751"/>
+      <w:bookmarkStart w:id="4" w:name="_Toc243403827"/>
       <w:r>
         <w:rPr>
           <w:color w:val="1D4E89"/>
@@ -5780,7 +5780,7 @@
       <w:pPr>
         <w:pStyle w:val="Heading2"/>
       </w:pPr>
-      <w:bookmarkStart w:id="5" w:name="_Toc243389752"/>
+      <w:bookmarkStart w:id="5" w:name="_Toc243403828"/>
       <w:r>
         <w:rPr>
           <w:color w:val="1D4E89"/>
@@ -5798,7 +5798,7 @@
       <w:pPr>
         <w:pStyle w:val="Heading2"/>
       </w:pPr>
-      <w:bookmarkStart w:id="6" w:name="_Toc243389753"/>
+      <w:bookmarkStart w:id="6" w:name="_Toc243403829"/>
       <w:r>
         <w:rPr>
           <w:color w:val="1D4E89"/>
@@ -5859,7 +5859,7 @@
       <w:pPr>
         <w:pStyle w:val="Heading2"/>
       </w:pPr>
-      <w:bookmarkStart w:id="7" w:name="_Toc243389754"/>
+      <w:bookmarkStart w:id="7" w:name="_Toc243403830"/>
       <w:r>
         <w:rPr>
           <w:color w:val="1D4E89"/>
@@ -6470,7 +6470,7 @@
           </w:tcPr>
           <w:p>
             <w:r>
-              <w:t>Reports</w:t>
+              <w:t>Currencies and exchange rates</w:t>
             </w:r>
           </w:p>
         </w:tc>
@@ -6527,7 +6527,7 @@
           </w:tcPr>
           <w:p>
             <w:r>
-              <w:t>Users, settings, currencies, expense categories, audit log</w:t>
+              <w:t>Reports</w:t>
             </w:r>
           </w:p>
         </w:tc>
@@ -6564,6 +6564,63 @@
           <w:p>
             <w:pPr>
               <w:cnfStyle w:val="000000100000" w:firstRow="0" w:lastRow="0" w:firstColumn="0" w:lastColumn="0" w:oddVBand="0" w:evenVBand="0" w:oddHBand="1" w:evenHBand="0" w:firstRowFirstColumn="0" w:firstRowLastColumn="0" w:lastRowFirstColumn="0" w:lastRowLastColumn="0"/>
+            </w:pPr>
+            <w:r>
+              <w:t>Yes</w:t>
+            </w:r>
+          </w:p>
+        </w:tc>
+      </w:tr>
+      <w:tr>
+        <w:trPr>
+          <w:cnfStyle w:val="000000010000" w:firstRow="0" w:lastRow="0" w:firstColumn="0" w:lastColumn="0" w:oddVBand="0" w:evenVBand="0" w:oddHBand="0" w:evenHBand="1" w:firstRowFirstColumn="0" w:firstRowLastColumn="0" w:lastRowFirstColumn="0" w:lastRowLastColumn="0"/>
+          <w:cantSplit/>
+          <w:jc w:val="center"/>
+        </w:trPr>
+        <w:tc>
+          <w:tcPr>
+            <w:cnfStyle w:val="001000000000" w:firstRow="0" w:lastRow="0" w:firstColumn="1" w:lastColumn="0" w:oddVBand="0" w:evenVBand="0" w:oddHBand="0" w:evenHBand="0" w:firstRowFirstColumn="0" w:firstRowLastColumn="0" w:lastRowFirstColumn="0" w:lastRowLastColumn="0"/>
+            <w:tcW w:w="2160" w:type="dxa"/>
+          </w:tcPr>
+          <w:p>
+            <w:r>
+              <w:t>Users, settings, expense categories, audit log</w:t>
+            </w:r>
+          </w:p>
+        </w:tc>
+        <w:tc>
+          <w:tcPr>
+            <w:tcW w:w="2160" w:type="dxa"/>
+          </w:tcPr>
+          <w:p>
+            <w:pPr>
+              <w:cnfStyle w:val="000000010000" w:firstRow="0" w:lastRow="0" w:firstColumn="0" w:lastColumn="0" w:oddVBand="0" w:evenVBand="0" w:oddHBand="0" w:evenHBand="1" w:firstRowFirstColumn="0" w:firstRowLastColumn="0" w:lastRowFirstColumn="0" w:lastRowLastColumn="0"/>
+            </w:pPr>
+            <w:r>
+              <w:t>Yes</w:t>
+            </w:r>
+          </w:p>
+        </w:tc>
+        <w:tc>
+          <w:tcPr>
+            <w:tcW w:w="2160" w:type="dxa"/>
+          </w:tcPr>
+          <w:p>
+            <w:pPr>
+              <w:cnfStyle w:val="000000010000" w:firstRow="0" w:lastRow="0" w:firstColumn="0" w:lastColumn="0" w:oddVBand="0" w:evenVBand="0" w:oddHBand="0" w:evenHBand="1" w:firstRowFirstColumn="0" w:firstRowLastColumn="0" w:lastRowFirstColumn="0" w:lastRowLastColumn="0"/>
+            </w:pPr>
+            <w:r>
+              <w:t>—</w:t>
+            </w:r>
+          </w:p>
+        </w:tc>
+        <w:tc>
+          <w:tcPr>
+            <w:tcW w:w="2160" w:type="dxa"/>
+          </w:tcPr>
+          <w:p>
+            <w:pPr>
+              <w:cnfStyle w:val="000000010000" w:firstRow="0" w:lastRow="0" w:firstColumn="0" w:lastColumn="0" w:oddVBand="0" w:evenVBand="0" w:oddHBand="0" w:evenHBand="1" w:firstRowFirstColumn="0" w:firstRowLastColumn="0" w:lastRowFirstColumn="0" w:lastRowLastColumn="0"/>
             </w:pPr>
             <w:r>
               <w:t>—</w:t>
@@ -6618,7 +6675,7 @@
         <w:pStyle w:val="Heading1"/>
         <w:pageBreakBefore/>
       </w:pPr>
-      <w:bookmarkStart w:id="8" w:name="_Toc243389755"/>
+      <w:bookmarkStart w:id="8" w:name="_Toc243403831"/>
       <w:r>
         <w:rPr>
           <w:color w:val="1D4E89"/>
@@ -6631,7 +6688,7 @@
       <w:pPr>
         <w:pStyle w:val="Heading2"/>
       </w:pPr>
-      <w:bookmarkStart w:id="9" w:name="_Toc243389756"/>
+      <w:bookmarkStart w:id="9" w:name="_Toc243403832"/>
       <w:r>
         <w:rPr>
           <w:color w:val="1D4E89"/>
@@ -6730,7 +6787,7 @@
       <w:pPr>
         <w:pStyle w:val="Heading2"/>
       </w:pPr>
-      <w:bookmarkStart w:id="10" w:name="_Toc243389757"/>
+      <w:bookmarkStart w:id="10" w:name="_Toc243403833"/>
       <w:r>
         <w:rPr>
           <w:color w:val="1D4E89"/>
@@ -6767,7 +6824,7 @@
       <w:pPr>
         <w:pStyle w:val="Heading2"/>
       </w:pPr>
-      <w:bookmarkStart w:id="11" w:name="_Toc243389758"/>
+      <w:bookmarkStart w:id="11" w:name="_Toc243403834"/>
       <w:r>
         <w:rPr>
           <w:color w:val="1D4E89"/>
@@ -6952,7 +7009,7 @@
               <w:cnfStyle w:val="000000100000" w:firstRow="0" w:lastRow="0" w:firstColumn="0" w:lastColumn="0" w:oddVBand="0" w:evenVBand="0" w:oddHBand="1" w:evenHBand="0" w:firstRowFirstColumn="0" w:firstRowLastColumn="0" w:lastRowFirstColumn="0" w:lastRowLastColumn="0"/>
             </w:pPr>
             <w:r>
-              <w:t>Clients, Invoices, Proformas, Payments, Accounts</w:t>
+              <w:t>Clients, Invoices, Proformas, Payments, Accounts, Currencies</w:t>
             </w:r>
           </w:p>
         </w:tc>
@@ -7040,7 +7097,7 @@
               <w:cnfStyle w:val="000000100000" w:firstRow="0" w:lastRow="0" w:firstColumn="0" w:lastColumn="0" w:oddVBand="0" w:evenVBand="0" w:oddHBand="1" w:evenHBand="0" w:firstRowFirstColumn="0" w:firstRowLastColumn="0" w:lastRowFirstColumn="0" w:lastRowLastColumn="0"/>
             </w:pPr>
             <w:r>
-              <w:t>Currencies, Expense Categories, Users, Settings, Audit Log</w:t>
+              <w:t>Expense Categories, Users, Settings, Audit Log</w:t>
             </w:r>
           </w:p>
         </w:tc>
@@ -7088,7 +7145,7 @@
       <w:pPr>
         <w:pStyle w:val="Heading2"/>
       </w:pPr>
-      <w:bookmarkStart w:id="12" w:name="_Toc243389759"/>
+      <w:bookmarkStart w:id="12" w:name="_Toc243403835"/>
       <w:r>
         <w:rPr>
           <w:color w:val="1D4E89"/>
@@ -7284,7 +7341,7 @@
       <w:pPr>
         <w:pStyle w:val="Heading2"/>
       </w:pPr>
-      <w:bookmarkStart w:id="13" w:name="_Toc243389760"/>
+      <w:bookmarkStart w:id="13" w:name="_Toc243403836"/>
       <w:r>
         <w:rPr>
           <w:color w:val="1D4E89"/>
@@ -7343,7 +7400,7 @@
         <w:pStyle w:val="Heading1"/>
         <w:pageBreakBefore/>
       </w:pPr>
-      <w:bookmarkStart w:id="14" w:name="_Toc243389761"/>
+      <w:bookmarkStart w:id="14" w:name="_Toc243403837"/>
       <w:r>
         <w:rPr>
           <w:color w:val="1D4E89"/>
@@ -7401,7 +7458,7 @@
       <w:pPr>
         <w:pStyle w:val="Heading2"/>
       </w:pPr>
-      <w:bookmarkStart w:id="15" w:name="_Toc243389762"/>
+      <w:bookmarkStart w:id="15" w:name="_Toc243403838"/>
       <w:r>
         <w:rPr>
           <w:color w:val="1D4E89"/>
@@ -7698,7 +7755,7 @@
       <w:pPr>
         <w:pStyle w:val="Heading2"/>
       </w:pPr>
-      <w:bookmarkStart w:id="16" w:name="_Toc243389763"/>
+      <w:bookmarkStart w:id="16" w:name="_Toc243403839"/>
       <w:r>
         <w:rPr>
           <w:color w:val="1D4E89"/>
@@ -7835,7 +7892,7 @@
       <w:pPr>
         <w:pStyle w:val="Heading2"/>
       </w:pPr>
-      <w:bookmarkStart w:id="17" w:name="_Toc243389764"/>
+      <w:bookmarkStart w:id="17" w:name="_Toc243403840"/>
       <w:r>
         <w:rPr>
           <w:color w:val="1D4E89"/>
@@ -7877,7 +7934,7 @@
       <w:pPr>
         <w:pStyle w:val="Heading2"/>
       </w:pPr>
-      <w:bookmarkStart w:id="18" w:name="_Toc243389765"/>
+      <w:bookmarkStart w:id="18" w:name="_Toc243403841"/>
       <w:r>
         <w:rPr>
           <w:color w:val="1D4E89"/>
@@ -7900,7 +7957,7 @@
       <w:pPr>
         <w:pStyle w:val="Heading2"/>
       </w:pPr>
-      <w:bookmarkStart w:id="19" w:name="_Toc243389766"/>
+      <w:bookmarkStart w:id="19" w:name="_Toc243403842"/>
       <w:r>
         <w:rPr>
           <w:color w:val="1D4E89"/>
@@ -7929,7 +7986,7 @@
       <w:pPr>
         <w:pStyle w:val="Heading2"/>
       </w:pPr>
-      <w:bookmarkStart w:id="20" w:name="_Toc243389767"/>
+      <w:bookmarkStart w:id="20" w:name="_Toc243403843"/>
       <w:r>
         <w:rPr>
           <w:color w:val="1D4E89"/>
@@ -7948,7 +8005,7 @@
         <w:pStyle w:val="Heading1"/>
         <w:pageBreakBefore/>
       </w:pPr>
-      <w:bookmarkStart w:id="21" w:name="_Toc243389768"/>
+      <w:bookmarkStart w:id="21" w:name="_Toc243403844"/>
       <w:r>
         <w:rPr>
           <w:color w:val="1D4E89"/>
@@ -8006,7 +8063,7 @@
       <w:pPr>
         <w:pStyle w:val="Heading2"/>
       </w:pPr>
-      <w:bookmarkStart w:id="22" w:name="_Toc243389769"/>
+      <w:bookmarkStart w:id="22" w:name="_Toc243403845"/>
       <w:r>
         <w:rPr>
           <w:color w:val="1D4E89"/>
@@ -8065,7 +8122,7 @@
         </w:numPr>
       </w:pPr>
       <w:r>
-        <w:t>Admins also see Trip Value, Currency and Exchange Rate. The value and currency come from the latest quote, and the rate is today’s rate from the currency list (section 13.5). Check them: for any currency other than GHS, the rate is required.</w:t>
+        <w:t>Admins also see Trip Value, Currency and Exchange Rate. The value and currency come from the latest quote, and the rate is today’s rate from the currency list (section 11.7). Check them: for any currency other than GHS, the rate is required.</w:t>
       </w:r>
     </w:p>
     <w:p>
@@ -8169,7 +8226,7 @@
       <w:pPr>
         <w:pStyle w:val="Heading2"/>
       </w:pPr>
-      <w:bookmarkStart w:id="23" w:name="_Toc243389770"/>
+      <w:bookmarkStart w:id="23" w:name="_Toc243403846"/>
       <w:r>
         <w:rPr>
           <w:color w:val="1D4E89"/>
@@ -8607,7 +8664,7 @@
       <w:pPr>
         <w:pStyle w:val="Heading2"/>
       </w:pPr>
-      <w:bookmarkStart w:id="24" w:name="_Toc243389771"/>
+      <w:bookmarkStart w:id="24" w:name="_Toc243403847"/>
       <w:r>
         <w:rPr>
           <w:color w:val="1D4E89"/>
@@ -8681,7 +8738,7 @@
       <w:pPr>
         <w:pStyle w:val="Heading2"/>
       </w:pPr>
-      <w:bookmarkStart w:id="25" w:name="_Toc243389772"/>
+      <w:bookmarkStart w:id="25" w:name="_Toc243403848"/>
       <w:r>
         <w:rPr>
           <w:color w:val="1D4E89"/>
@@ -8699,7 +8756,7 @@
       <w:pPr>
         <w:pStyle w:val="Heading2"/>
       </w:pPr>
-      <w:bookmarkStart w:id="26" w:name="_Toc243389773"/>
+      <w:bookmarkStart w:id="26" w:name="_Toc243403849"/>
       <w:r>
         <w:rPr>
           <w:color w:val="1D4E89"/>
@@ -8793,7 +8850,7 @@
         </w:numPr>
       </w:pPr>
       <w:r>
-        <w:t>Enter the Amount and choose the Currency. Choosing a currency fills in its Exchange Rate to cedis from the currency list; change it if you paid at a different rate. Add a Description, the date, and attach a photo or scan of the Receipt if you have one.</w:t>
+        <w:t>Enter the Amount and choose the Currency. Choosing a currency fills in the Exchange Rate to cedis for the expense date (section 11.7); change it if you paid at a different rate. Add a Description, the date, and attach a photo or scan of the Receipt if you have one.</w:t>
       </w:r>
     </w:p>
     <w:p>
@@ -8857,7 +8914,7 @@
       <w:pPr>
         <w:pStyle w:val="Heading2"/>
       </w:pPr>
-      <w:bookmarkStart w:id="27" w:name="_Toc243389774"/>
+      <w:bookmarkStart w:id="27" w:name="_Toc243403850"/>
       <w:r>
         <w:rPr>
           <w:color w:val="1D4E89"/>
@@ -8875,7 +8932,7 @@
       <w:pPr>
         <w:pStyle w:val="Heading2"/>
       </w:pPr>
-      <w:bookmarkStart w:id="28" w:name="_Toc243389775"/>
+      <w:bookmarkStart w:id="28" w:name="_Toc243403851"/>
       <w:r>
         <w:rPr>
           <w:color w:val="1D4E89"/>
@@ -8953,7 +9010,7 @@
         <w:pStyle w:val="Heading1"/>
         <w:pageBreakBefore/>
       </w:pPr>
-      <w:bookmarkStart w:id="29" w:name="_Toc243389776"/>
+      <w:bookmarkStart w:id="29" w:name="_Toc243403852"/>
       <w:r>
         <w:rPr>
           <w:color w:val="1D4E89"/>
@@ -9006,7 +9063,7 @@
       <w:pPr>
         <w:pStyle w:val="Heading2"/>
       </w:pPr>
-      <w:bookmarkStart w:id="30" w:name="_Toc243389777"/>
+      <w:bookmarkStart w:id="30" w:name="_Toc243403853"/>
       <w:r>
         <w:rPr>
           <w:color w:val="1D4E89"/>
@@ -9283,7 +9340,7 @@
       <w:pPr>
         <w:pStyle w:val="Heading2"/>
       </w:pPr>
-      <w:bookmarkStart w:id="31" w:name="_Toc243389778"/>
+      <w:bookmarkStart w:id="31" w:name="_Toc243403854"/>
       <w:r>
         <w:rPr>
           <w:color w:val="1D4E89"/>
@@ -9347,7 +9404,7 @@
         <w:pStyle w:val="Heading1"/>
         <w:pageBreakBefore/>
       </w:pPr>
-      <w:bookmarkStart w:id="32" w:name="_Toc243389779"/>
+      <w:bookmarkStart w:id="32" w:name="_Toc243403855"/>
       <w:r>
         <w:rPr>
           <w:color w:val="1D4E89"/>
@@ -9360,7 +9417,7 @@
       <w:pPr>
         <w:pStyle w:val="Heading2"/>
       </w:pPr>
-      <w:bookmarkStart w:id="33" w:name="_Toc243389780"/>
+      <w:bookmarkStart w:id="33" w:name="_Toc243403856"/>
       <w:r>
         <w:rPr>
           <w:color w:val="1D4E89"/>
@@ -9423,7 +9480,7 @@
       <w:pPr>
         <w:pStyle w:val="Heading2"/>
       </w:pPr>
-      <w:bookmarkStart w:id="34" w:name="_Toc243389781"/>
+      <w:bookmarkStart w:id="34" w:name="_Toc243403857"/>
       <w:r>
         <w:rPr>
           <w:color w:val="1D4E89"/>
@@ -9487,7 +9544,7 @@
         <w:pStyle w:val="Heading1"/>
         <w:pageBreakBefore/>
       </w:pPr>
-      <w:bookmarkStart w:id="35" w:name="_Toc243389782"/>
+      <w:bookmarkStart w:id="35" w:name="_Toc243403858"/>
       <w:r>
         <w:rPr>
           <w:color w:val="1D4E89"/>
@@ -9540,7 +9597,7 @@
       <w:pPr>
         <w:pStyle w:val="Heading2"/>
       </w:pPr>
-      <w:bookmarkStart w:id="36" w:name="_Toc243389783"/>
+      <w:bookmarkStart w:id="36" w:name="_Toc243403859"/>
       <w:r>
         <w:rPr>
           <w:color w:val="1D4E89"/>
@@ -9601,7 +9658,7 @@
       <w:pPr>
         <w:pStyle w:val="Heading2"/>
       </w:pPr>
-      <w:bookmarkStart w:id="37" w:name="_Toc243389784"/>
+      <w:bookmarkStart w:id="37" w:name="_Toc243403860"/>
       <w:r>
         <w:rPr>
           <w:color w:val="1D4E89"/>
@@ -9623,10 +9680,7 @@
         <w:rPr>
           <w:b/>
         </w:rPr>
-        <w:t>Overview:</w:t>
-      </w:r>
-      <w:r>
-        <w:t xml:space="preserve"> company details, Lifetime Revenue (all payments received) and Outstanding Balance (what is still owed on issued invoices).</w:t>
+        <w:t>Overview: company details, Lifetime Revenue (all payments received, in cedis) and Outstanding Balance (what is still owed on issued invoices, one line per currency).</w:t>
       </w:r>
     </w:p>
     <w:p>
@@ -9665,17 +9719,14 @@
         <w:rPr>
           <w:b/>
         </w:rPr>
-        <w:t>Statement:</w:t>
-      </w:r>
-      <w:r>
-        <w:t xml:space="preserve"> every invoice and payment in date order, with a running balance.</w:t>
+        <w:t>Statement: every invoice and payment in date order, with a running balance in cedis. Each invoice is converted at its own exchange rate, and its payments at the same rate, so a paid invoice nets to zero.</w:t>
       </w:r>
     </w:p>
     <w:p>
       <w:pPr>
         <w:pStyle w:val="Heading2"/>
       </w:pPr>
-      <w:bookmarkStart w:id="38" w:name="_Toc243389785"/>
+      <w:bookmarkStart w:id="38" w:name="_Toc243403861"/>
       <w:r>
         <w:rPr>
           <w:color w:val="1D4E89"/>
@@ -9757,7 +9808,7 @@
       <w:pPr>
         <w:pStyle w:val="Heading2"/>
       </w:pPr>
-      <w:bookmarkStart w:id="39" w:name="_Toc243389786"/>
+      <w:bookmarkStart w:id="39" w:name="_Toc243403862"/>
       <w:r>
         <w:rPr>
           <w:color w:val="1D4E89"/>
@@ -9776,7 +9827,7 @@
         <w:pStyle w:val="Heading1"/>
         <w:pageBreakBefore/>
       </w:pPr>
-      <w:bookmarkStart w:id="40" w:name="_Toc243389787"/>
+      <w:bookmarkStart w:id="40" w:name="_Toc243403863"/>
       <w:r>
         <w:rPr>
           <w:color w:val="1D4E89"/>
@@ -9829,7 +9880,7 @@
       <w:pPr>
         <w:pStyle w:val="Heading2"/>
       </w:pPr>
-      <w:bookmarkStart w:id="41" w:name="_Toc243389788"/>
+      <w:bookmarkStart w:id="41" w:name="_Toc243403864"/>
       <w:r>
         <w:rPr>
           <w:color w:val="1D4E89"/>
@@ -10047,7 +10098,7 @@
       <w:pPr>
         <w:pStyle w:val="Heading2"/>
       </w:pPr>
-      <w:bookmarkStart w:id="42" w:name="_Toc243389789"/>
+      <w:bookmarkStart w:id="42" w:name="_Toc243403865"/>
       <w:r>
         <w:rPr>
           <w:color w:val="1D4E89"/>
@@ -10131,7 +10182,7 @@
         </w:numPr>
       </w:pPr>
       <w:r>
-        <w:t>Check the Currency and Exchange Rate. They start as the first selected trip’s currency (or else the client’s default) and today’s rate from the currency list (section 13.5). Change them if you agreed otherwise. If some trips are priced in another currency, a note reminds you to convert their prices.</w:t>
+        <w:t>Check the Currency and Exchange Rate. They start as the first selected trip’s currency (or else the client’s default) and the rate for the invoice date (section 11.7). Change them if you agreed otherwise. If some trips are priced in another currency, a note reminds you to convert their prices.</w:t>
       </w:r>
     </w:p>
     <w:p>
@@ -10179,7 +10230,7 @@
       <w:pPr>
         <w:pStyle w:val="Heading2"/>
       </w:pPr>
-      <w:bookmarkStart w:id="43" w:name="_Toc243389790"/>
+      <w:bookmarkStart w:id="43" w:name="_Toc243403866"/>
       <w:r>
         <w:rPr>
           <w:color w:val="1D4E89"/>
@@ -10264,7 +10315,7 @@
       <w:pPr>
         <w:pStyle w:val="Heading2"/>
       </w:pPr>
-      <w:bookmarkStart w:id="44" w:name="_Toc243389791"/>
+      <w:bookmarkStart w:id="44" w:name="_Toc243403867"/>
       <w:r>
         <w:rPr>
           <w:color w:val="1D4E89"/>
@@ -10316,7 +10367,7 @@
         <w:pStyle w:val="Heading1"/>
         <w:pageBreakBefore/>
       </w:pPr>
-      <w:bookmarkStart w:id="45" w:name="_Toc243389792"/>
+      <w:bookmarkStart w:id="45" w:name="_Toc243403868"/>
       <w:r>
         <w:rPr>
           <w:color w:val="1D4E89"/>
@@ -10369,7 +10420,7 @@
       <w:pPr>
         <w:pStyle w:val="Heading2"/>
       </w:pPr>
-      <w:bookmarkStart w:id="46" w:name="_Toc243389793"/>
+      <w:bookmarkStart w:id="46" w:name="_Toc243403869"/>
       <w:r>
         <w:rPr>
           <w:color w:val="1D4E89"/>
@@ -10423,7 +10474,7 @@
         </w:numPr>
       </w:pPr>
       <w:r>
-        <w:t>Enter the Amount and choose the Currency the client paid in. The Exchange Rate to cedis is filled in with today’s rate from the currency list; change it to the rate you actually received.</w:t>
+        <w:t>Enter the Amount and choose the Currency the client paid in. The Exchange Rate to cedis is filled in with the rate for the payment date (section 11.7); change it to the rate you actually received.</w:t>
       </w:r>
     </w:p>
     <w:p>
@@ -10453,6 +10504,11 @@
     <w:p>
       <w:r>
         <w:t>The account’s balance goes up straight away, and the invoice changes to Partially Paid or Paid by itself.</w:t>
+      </w:r>
+    </w:p>
+    <w:p>
+      <w:r>
+        <w:t>A payment in the invoice’s own currency counts at face value, even if its exchange rate differs from the invoice’s. A payment in another currency, for example cedis against a USD invoice, is converted using the two exchange rates; the form shows what it counts as before you save.</w:t>
       </w:r>
     </w:p>
     <w:tbl>
@@ -10499,7 +10555,7 @@
       <w:pPr>
         <w:pStyle w:val="Heading2"/>
       </w:pPr>
-      <w:bookmarkStart w:id="47" w:name="_Toc243389794"/>
+      <w:bookmarkStart w:id="47" w:name="_Toc243403870"/>
       <w:r>
         <w:rPr>
           <w:color w:val="1D4E89"/>
@@ -10517,7 +10573,7 @@
       <w:pPr>
         <w:pStyle w:val="Heading2"/>
       </w:pPr>
-      <w:bookmarkStart w:id="48" w:name="_Toc243389795"/>
+      <w:bookmarkStart w:id="48" w:name="_Toc243403871"/>
       <w:r>
         <w:rPr>
           <w:color w:val="1D4E89"/>
@@ -10576,7 +10632,7 @@
         <w:pStyle w:val="Heading1"/>
         <w:pageBreakBefore/>
       </w:pPr>
-      <w:bookmarkStart w:id="49" w:name="_Toc243389796"/>
+      <w:bookmarkStart w:id="49" w:name="_Toc243403872"/>
       <w:r>
         <w:rPr>
           <w:color w:val="1D4E89"/>
@@ -10634,7 +10690,7 @@
       <w:pPr>
         <w:pStyle w:val="Heading2"/>
       </w:pPr>
-      <w:bookmarkStart w:id="50" w:name="_Toc243389797"/>
+      <w:bookmarkStart w:id="50" w:name="_Toc243403873"/>
       <w:r>
         <w:rPr>
           <w:color w:val="1D4E89"/>
@@ -10652,7 +10708,7 @@
       <w:pPr>
         <w:pStyle w:val="Heading2"/>
       </w:pPr>
-      <w:bookmarkStart w:id="51" w:name="_Toc243389798"/>
+      <w:bookmarkStart w:id="51" w:name="_Toc243403874"/>
       <w:r>
         <w:rPr>
           <w:color w:val="1D4E89"/>
@@ -10737,7 +10793,7 @@
       <w:pPr>
         <w:pStyle w:val="Heading2"/>
       </w:pPr>
-      <w:bookmarkStart w:id="52" w:name="_Toc243389799"/>
+      <w:bookmarkStart w:id="52" w:name="_Toc243403875"/>
       <w:r>
         <w:rPr>
           <w:color w:val="1D4E89"/>
@@ -10755,7 +10811,7 @@
       <w:pPr>
         <w:pStyle w:val="Heading2"/>
       </w:pPr>
-      <w:bookmarkStart w:id="53" w:name="_Toc243389800"/>
+      <w:bookmarkStart w:id="53" w:name="_Toc243403876"/>
       <w:r>
         <w:rPr>
           <w:color w:val="1D4E89"/>
@@ -10800,7 +10856,7 @@
       <w:pPr>
         <w:pStyle w:val="Heading2"/>
       </w:pPr>
-      <w:bookmarkStart w:id="54" w:name="_Toc243389801"/>
+      <w:bookmarkStart w:id="54" w:name="_Toc243403877"/>
       <w:r>
         <w:rPr>
           <w:color w:val="1D4E89"/>
@@ -10864,7 +10920,7 @@
         <w:pStyle w:val="Heading1"/>
         <w:pageBreakBefore/>
       </w:pPr>
-      <w:bookmarkStart w:id="55" w:name="_Toc243389802"/>
+      <w:bookmarkStart w:id="55" w:name="_Toc243403878"/>
       <w:r>
         <w:rPr>
           <w:color w:val="1D4E89"/>
@@ -10917,7 +10973,7 @@
       <w:pPr>
         <w:pStyle w:val="Heading2"/>
       </w:pPr>
-      <w:bookmarkStart w:id="56" w:name="_Toc243389803"/>
+      <w:bookmarkStart w:id="56" w:name="_Toc243403879"/>
       <w:r>
         <w:rPr>
           <w:color w:val="1D4E89"/>
@@ -10945,7 +11001,7 @@
       <w:pPr>
         <w:pStyle w:val="Heading2"/>
       </w:pPr>
-      <w:bookmarkStart w:id="57" w:name="_Toc243389804"/>
+      <w:bookmarkStart w:id="57" w:name="_Toc243403880"/>
       <w:r>
         <w:rPr>
           <w:color w:val="1D4E89"/>
@@ -11070,7 +11126,7 @@
       <w:pPr>
         <w:pStyle w:val="Heading2"/>
       </w:pPr>
-      <w:bookmarkStart w:id="58" w:name="_Toc243389805"/>
+      <w:bookmarkStart w:id="58" w:name="_Toc243403881"/>
       <w:r>
         <w:rPr>
           <w:color w:val="1D4E89"/>
@@ -11088,7 +11144,7 @@
       <w:pPr>
         <w:pStyle w:val="Heading2"/>
       </w:pPr>
-      <w:bookmarkStart w:id="59" w:name="_Toc243389806"/>
+      <w:bookmarkStart w:id="59" w:name="_Toc243403882"/>
       <w:r>
         <w:rPr>
           <w:color w:val="1D4E89"/>
@@ -11161,7 +11217,7 @@
       <w:pPr>
         <w:pStyle w:val="Heading2"/>
       </w:pPr>
-      <w:bookmarkStart w:id="60" w:name="_Toc243389807"/>
+      <w:bookmarkStart w:id="60" w:name="_Toc243403883"/>
       <w:r>
         <w:rPr>
           <w:color w:val="1D4E89"/>
@@ -11179,7 +11235,7 @@
       <w:pPr>
         <w:pStyle w:val="Heading2"/>
       </w:pPr>
-      <w:bookmarkStart w:id="61" w:name="_Toc243389808"/>
+      <w:bookmarkStart w:id="61" w:name="_Toc243403884"/>
       <w:r>
         <w:rPr>
           <w:color w:val="1D4E89"/>
@@ -11195,15 +11251,14 @@
     </w:p>
     <w:p>
       <w:pPr>
-        <w:pStyle w:val="Heading1"/>
-        <w:pageBreakBefore/>
-      </w:pPr>
-      <w:bookmarkStart w:id="62" w:name="_Toc243389809"/>
+        <w:pStyle w:val="Heading2"/>
+      </w:pPr>
+      <w:bookmarkStart w:id="62" w:name="_Toc243403885"/>
       <w:r>
         <w:rPr>
           <w:color w:val="1D4E89"/>
         </w:rPr>
-        <w:t>12. Reports</w:t>
+        <w:t>11.7 Currencies and exchange rates</w:t>
       </w:r>
       <w:bookmarkEnd w:id="62"/>
     </w:p>
@@ -11240,25 +11295,16 @@
               <w:t xml:space="preserve">Who can do this:  </w:t>
             </w:r>
             <w:r>
-              <w:t>Admin and Finance, under Reports.</w:t>
+              <w:t>Admin and Finance, under Finance → Currencies.</w:t>
             </w:r>
           </w:p>
         </w:tc>
       </w:tr>
     </w:tbl>
-    <w:p/>
-    <w:p>
-      <w:pPr>
-        <w:pStyle w:val="Heading2"/>
-      </w:pPr>
-      <w:bookmarkStart w:id="63" w:name="_Toc243389810"/>
-      <w:r>
-        <w:rPr>
-          <w:color w:val="1D4E89"/>
-        </w:rPr>
-        <w:t>12.1 The reports</w:t>
-      </w:r>
-      <w:bookmarkEnd w:id="63"/>
+    <w:p>
+      <w:r>
+        <w:t>The currency list holds the currencies staff can choose for clients, quotes, trips, expenses, invoices, proformas and payments, and their exchange rates to cedis. It starts with GHS, USD, EUR and NGN; add others as you need them.</w:t>
+      </w:r>
     </w:p>
     <w:tbl>
       <w:tblPr>
@@ -11285,7 +11331,7 @@
           </w:tcPr>
           <w:p>
             <w:r>
-              <w:t>Report</w:t>
+              <w:t>Column</w:t>
             </w:r>
           </w:p>
         </w:tc>
@@ -11298,7 +11344,7 @@
               <w:cnfStyle w:val="100000000000" w:firstRow="1" w:lastRow="0" w:firstColumn="0" w:lastColumn="0" w:oddVBand="0" w:evenVBand="0" w:oddHBand="0" w:evenHBand="0" w:firstRowFirstColumn="0" w:firstRowLastColumn="0" w:lastRowFirstColumn="0" w:lastRowLastColumn="0"/>
             </w:pPr>
             <w:r>
-              <w:t>What it shows</w:t>
+              <w:t>What it means</w:t>
             </w:r>
           </w:p>
         </w:tc>
@@ -11316,7 +11362,7 @@
           </w:tcPr>
           <w:p>
             <w:r>
-              <w:t>Revenue</w:t>
+              <w:t>Code</w:t>
             </w:r>
           </w:p>
         </w:tc>
@@ -11329,7 +11375,7 @@
               <w:cnfStyle w:val="000000100000" w:firstRow="0" w:lastRow="0" w:firstColumn="0" w:lastColumn="0" w:oddVBand="0" w:evenVBand="0" w:oddHBand="1" w:evenHBand="0" w:firstRowFirstColumn="0" w:firstRowLastColumn="0" w:lastRowFirstColumn="0" w:lastRowLastColumn="0"/>
             </w:pPr>
             <w:r>
-              <w:t>Invoiced revenue by client, by service type and by month</w:t>
+              <w:t>The 3-letter international code, e.g. USD</w:t>
             </w:r>
           </w:p>
         </w:tc>
@@ -11347,7 +11393,7 @@
           </w:tcPr>
           <w:p>
             <w:r>
-              <w:t>Receivables Aging</w:t>
+              <w:t>Name</w:t>
             </w:r>
           </w:p>
         </w:tc>
@@ -11360,7 +11406,7 @@
               <w:cnfStyle w:val="000000010000" w:firstRow="0" w:lastRow="0" w:firstColumn="0" w:lastColumn="0" w:oddVBand="0" w:evenVBand="0" w:oddHBand="0" w:evenHBand="1" w:firstRowFirstColumn="0" w:firstRowLastColumn="0" w:lastRowFirstColumn="0" w:lastRowLastColumn="0"/>
             </w:pPr>
             <w:r>
-              <w:t>What each client owes, grouped by how long it is overdue: 0-30, 31-60, 61-90 and 90+ days, with the invoices behind each figure</w:t>
+              <w:t>The currency’s name, e.g. US Dollar</w:t>
             </w:r>
           </w:p>
         </w:tc>
@@ -11378,7 +11424,7 @@
           </w:tcPr>
           <w:p>
             <w:r>
-              <w:t>Trip Profitability</w:t>
+              <w:t>Today's Rate</w:t>
             </w:r>
           </w:p>
         </w:tc>
@@ -11391,7 +11437,7 @@
               <w:cnfStyle w:val="000000100000" w:firstRow="0" w:lastRow="0" w:firstColumn="0" w:lastColumn="0" w:oddVBand="0" w:evenVBand="0" w:oddHBand="1" w:evenHBand="0" w:firstRowFirstColumn="0" w:firstRowLastColumn="0" w:lastRowFirstColumn="0" w:lastRowLastColumn="0"/>
             </w:pPr>
             <w:r>
-              <w:t>Each trip’s value minus its expenses, grouped by client, by truck and by month</w:t>
+              <w:t>How many cedis one unit is worth today, e.g. “1 USD = GHS 15.2500,” or “Not set”</w:t>
             </w:r>
           </w:p>
         </w:tc>
@@ -11409,7 +11455,7 @@
           </w:tcPr>
           <w:p>
             <w:r>
-              <w:t>Expenses</w:t>
+              <w:t>Since</w:t>
             </w:r>
           </w:p>
         </w:tc>
@@ -11422,7 +11468,7 @@
               <w:cnfStyle w:val="000000010000" w:firstRow="0" w:lastRow="0" w:firstColumn="0" w:lastColumn="0" w:oddVBand="0" w:evenVBand="0" w:oddHBand="0" w:evenHBand="1" w:firstRowFirstColumn="0" w:firstRowLastColumn="0" w:lastRowFirstColumn="0" w:lastRowLastColumn="0"/>
             </w:pPr>
             <w:r>
-              <w:t>Expenses by category, by truck and by trip</w:t>
+              <w:t>The date today’s rate applies from</w:t>
             </w:r>
           </w:p>
         </w:tc>
@@ -11440,7 +11486,7 @@
           </w:tcPr>
           <w:p>
             <w:r>
-              <w:t>Payments</w:t>
+              <w:t>Status</w:t>
             </w:r>
           </w:p>
         </w:tc>
@@ -11453,81 +11499,64 @@
               <w:cnfStyle w:val="000000100000" w:firstRow="0" w:lastRow="0" w:firstColumn="0" w:lastColumn="0" w:oddVBand="0" w:evenVBand="0" w:oddHBand="1" w:evenHBand="0" w:firstRowFirstColumn="0" w:firstRowLastColumn="0" w:lastRowFirstColumn="0" w:lastRowLastColumn="0"/>
             </w:pPr>
             <w:r>
-              <w:t>Payments collected by method, by client and by account</w:t>
-            </w:r>
-          </w:p>
-        </w:tc>
-      </w:tr>
-      <w:tr>
-        <w:trPr>
-          <w:cnfStyle w:val="000000010000" w:firstRow="0" w:lastRow="0" w:firstColumn="0" w:lastColumn="0" w:oddVBand="0" w:evenVBand="0" w:oddHBand="0" w:evenHBand="1" w:firstRowFirstColumn="0" w:firstRowLastColumn="0" w:lastRowFirstColumn="0" w:lastRowLastColumn="0"/>
-          <w:cantSplit/>
-          <w:jc w:val="center"/>
-        </w:trPr>
-        <w:tc>
-          <w:tcPr>
-            <w:cnfStyle w:val="001000000000" w:firstRow="0" w:lastRow="0" w:firstColumn="1" w:lastColumn="0" w:oddVBand="0" w:evenVBand="0" w:oddHBand="0" w:evenHBand="0" w:firstRowFirstColumn="0" w:firstRowLastColumn="0" w:lastRowFirstColumn="0" w:lastRowLastColumn="0"/>
-            <w:tcW w:w="4320" w:type="dxa"/>
-          </w:tcPr>
-          <w:p>
-            <w:r>
-              <w:t>Fleet Utilization</w:t>
-            </w:r>
-          </w:p>
-        </w:tc>
-        <w:tc>
-          <w:tcPr>
-            <w:tcW w:w="4320" w:type="dxa"/>
-          </w:tcPr>
-          <w:p>
-            <w:pPr>
-              <w:cnfStyle w:val="000000010000" w:firstRow="0" w:lastRow="0" w:firstColumn="0" w:lastColumn="0" w:oddVBand="0" w:evenVBand="0" w:oddHBand="0" w:evenHBand="1" w:firstRowFirstColumn="0" w:firstRowLastColumn="0" w:lastRowFirstColumn="0" w:lastRowLastColumn="0"/>
-            </w:pPr>
-            <w:r>
-              <w:t>Trips per truck, with active and idle days</w:t>
-            </w:r>
-          </w:p>
-        </w:tc>
-      </w:tr>
-      <w:tr>
-        <w:trPr>
-          <w:cnfStyle w:val="000000100000" w:firstRow="0" w:lastRow="0" w:firstColumn="0" w:lastColumn="0" w:oddVBand="0" w:evenVBand="0" w:oddHBand="1" w:evenHBand="0" w:firstRowFirstColumn="0" w:firstRowLastColumn="0" w:lastRowFirstColumn="0" w:lastRowLastColumn="0"/>
-          <w:cantSplit/>
-          <w:jc w:val="center"/>
-        </w:trPr>
-        <w:tc>
-          <w:tcPr>
-            <w:cnfStyle w:val="001000000000" w:firstRow="0" w:lastRow="0" w:firstColumn="1" w:lastColumn="0" w:oddVBand="0" w:evenVBand="0" w:oddHBand="0" w:evenHBand="0" w:firstRowFirstColumn="0" w:firstRowLastColumn="0" w:lastRowFirstColumn="0" w:lastRowLastColumn="0"/>
-            <w:tcW w:w="4320" w:type="dxa"/>
-          </w:tcPr>
-          <w:p>
-            <w:r>
-              <w:t>Client Statement</w:t>
-            </w:r>
-          </w:p>
-        </w:tc>
-        <w:tc>
-          <w:tcPr>
-            <w:tcW w:w="4320" w:type="dxa"/>
-          </w:tcPr>
-          <w:p>
-            <w:pPr>
-              <w:cnfStyle w:val="000000100000" w:firstRow="0" w:lastRow="0" w:firstColumn="0" w:lastColumn="0" w:oddVBand="0" w:evenVBand="0" w:oddHBand="1" w:evenHBand="0" w:firstRowFirstColumn="0" w:firstRowLastColumn="0" w:lastRowFirstColumn="0" w:lastRowLastColumn="0"/>
-            </w:pPr>
-            <w:r>
-              <w:t>One client’s invoices and payments with a running balance</w:t>
+              <w:t>Active currencies appear on forms; inactive ones don’t</w:t>
             </w:r>
           </w:p>
         </w:tc>
       </w:tr>
     </w:tbl>
-    <w:p/>
+    <w:p>
+      <w:r>
+        <w:t>Rates are kept with the date they apply from, so the history stays: each rate applies from its date until the next one. To add a rate:</w:t>
+      </w:r>
+    </w:p>
+    <w:p>
+      <w:pPr>
+        <w:pStyle w:val="ListNumber"/>
+        <w:numPr>
+          <w:ilvl w:val="0"/>
+          <w:numId w:val="19"/>
+        </w:numPr>
+      </w:pPr>
+      <w:r>
+        <w:t>Finance → Currencies, then click “Rates &amp; Edit” on the currency.</w:t>
+      </w:r>
+    </w:p>
+    <w:p>
+      <w:pPr>
+        <w:pStyle w:val="ListNumber"/>
+        <w:numPr>
+          <w:ilvl w:val="0"/>
+          <w:numId w:val="19"/>
+        </w:numPr>
+      </w:pPr>
+      <w:r>
+        <w:t>Under Exchange Rates, set Applies From (the first day the rate applies, today unless you change it) and the Rate to GHS (cedis per unit).</w:t>
+      </w:r>
+    </w:p>
+    <w:p>
+      <w:pPr>
+        <w:pStyle w:val="ListNumber"/>
+        <w:numPr>
+          <w:ilvl w:val="0"/>
+          <w:numId w:val="19"/>
+        </w:numPr>
+      </w:pPr>
+      <w:r>
+        <w:t>Click “Add Rate.”</w:t>
+      </w:r>
+    </w:p>
+    <w:p>
+      <w:r>
+        <w:t>How the forms use the rates:</w:t>
+      </w:r>
+    </w:p>
     <w:p>
       <w:pPr>
         <w:pStyle w:val="ListBullet"/>
       </w:pPr>
       <w:r>
-        <w:t>Most reports have “From” and “To” dates. Set them and click “Filter.”</w:t>
+        <w:t>Choosing a currency fills in the rate for the record’s date: a payment’s date, an expense’s date or an invoice’s date. New trips use today’s rate.</w:t>
       </w:r>
     </w:p>
     <w:p>
@@ -11535,7 +11564,7 @@
         <w:pStyle w:val="ListBullet"/>
       </w:pPr>
       <w:r>
-        <w:t>“Export CSV” downloads the figures to open in Excel. “Print” prints the page.</w:t>
+        <w:t>Change the date and the rate follows, unless you have typed your own rate. Staff can always change the rate on a record, for example to the rate a client actually paid at.</w:t>
       </w:r>
     </w:p>
     <w:p>
@@ -11543,40 +11572,114 @@
         <w:pStyle w:val="ListBullet"/>
       </w:pPr>
       <w:r>
-        <w:t>All amounts are in cedis (GHS).</w:t>
-      </w:r>
-    </w:p>
-    <w:p>
-      <w:pPr>
-        <w:pStyle w:val="Heading2"/>
-      </w:pPr>
-      <w:bookmarkStart w:id="64" w:name="_Toc243389811"/>
+        <w:t>If the date is before the currency’s first rate, the field is left empty and staff type the rate.</w:t>
+      </w:r>
+    </w:p>
+    <w:p>
+      <w:pPr>
+        <w:pStyle w:val="ListBullet"/>
+      </w:pPr>
+      <w:r>
+        <w:t>Adding or removing rates never changes saved records: each trip, invoice, payment and expense keeps the rate it was saved with.</w:t>
+      </w:r>
+    </w:p>
+    <w:p>
+      <w:r>
+        <w:t>Managing the list:</w:t>
+      </w:r>
+    </w:p>
+    <w:p>
+      <w:pPr>
+        <w:pStyle w:val="ListBullet"/>
+      </w:pPr>
+      <w:r>
+        <w:t>“New Currency” adds one, with its code (e.g. XOF), name and, if you know it, its first rate and the date it applies from.</w:t>
+      </w:r>
+    </w:p>
+    <w:p>
+      <w:pPr>
+        <w:pStyle w:val="ListBullet"/>
+      </w:pPr>
+      <w:r>
+        <w:t>On a currency’s page, “Save Changes” updates its name. The code can’t be changed, because saved records use it.</w:t>
+      </w:r>
+    </w:p>
+    <w:p>
+      <w:pPr>
+        <w:pStyle w:val="ListBullet"/>
+      </w:pPr>
+      <w:r>
+        <w:t>Adding a rate for a date that already has one replaces it. “Remove” deletes a rate entered by mistake; the rates around it then apply.</w:t>
+      </w:r>
+    </w:p>
+    <w:p>
+      <w:pPr>
+        <w:pStyle w:val="ListBullet"/>
+      </w:pPr>
+      <w:r>
+        <w:t>“Deactivate” takes a currency off the forms. Records already in that currency keep it. GHS, and the default currency in Settings, can’t be deactivated.</w:t>
+      </w:r>
+    </w:p>
+    <w:p>
+      <w:pPr>
+        <w:pStyle w:val="ListBullet"/>
+      </w:pPr>
+      <w:r>
+        <w:t>“Delete” works only for a currency that nothing uses yet. Once a currency is used, deactivate it instead.</w:t>
+      </w:r>
+    </w:p>
+    <w:tbl>
+      <w:tblPr>
+        <w:tblW w:w="0" w:type="auto"/>
+        <w:tblBorders>
+          <w:top w:val="nil"/>
+          <w:left w:val="nil"/>
+          <w:bottom w:val="nil"/>
+          <w:right w:val="nil"/>
+          <w:insideH w:val="nil"/>
+          <w:insideV w:val="nil"/>
+        </w:tblBorders>
+        <w:tblLook w:val="04A0" w:firstRow="1" w:lastRow="0" w:firstColumn="1" w:lastColumn="0" w:noHBand="0" w:noVBand="1"/>
+      </w:tblPr>
+      <w:tblGrid>
+        <w:gridCol w:w="8640"/>
+      </w:tblGrid>
+      <w:tr>
+        <w:trPr>
+          <w:cantSplit/>
+        </w:trPr>
+        <w:tc>
+          <w:tcPr>
+            <w:tcW w:w="8640" w:type="dxa"/>
+            <w:shd w:val="clear" w:color="auto" w:fill="EAF1FB"/>
+          </w:tcPr>
+          <w:p>
+            <w:r>
+              <w:rPr>
+                <w:b/>
+              </w:rPr>
+              <w:t xml:space="preserve">Note:  </w:t>
+            </w:r>
+            <w:r>
+              <w:t>GHS is the base currency, always at 1. Accounts, reports and trip profit are all in cedis, worked out with each record’s own exchange rate. Every rate added or removed is recorded in the Audit Log.</w:t>
+            </w:r>
+          </w:p>
+        </w:tc>
+      </w:tr>
+    </w:tbl>
+    <w:p>
+      <w:pPr>
+        <w:pStyle w:val="Heading1"/>
+        <w:pageBreakBefore/>
+      </w:pPr>
+      <w:bookmarkStart w:id="63" w:name="_Toc243403886"/>
       <w:r>
         <w:rPr>
           <w:color w:val="1D4E89"/>
         </w:rPr>
-        <w:t>12.2 Client statements</w:t>
-      </w:r>
-      <w:bookmarkEnd w:id="64"/>
-    </w:p>
-    <w:p>
-      <w:r>
-        <w:t>Reports → Client Statement: choose the client, set the From and To dates, and click “Generate.” Use the PDF button to download a statement to send to the client.</w:t>
-      </w:r>
-    </w:p>
-    <w:p>
-      <w:pPr>
-        <w:pStyle w:val="Heading1"/>
-        <w:pageBreakBefore/>
-      </w:pPr>
-      <w:bookmarkStart w:id="65" w:name="_Toc243389812"/>
-      <w:r>
-        <w:rPr>
-          <w:color w:val="1D4E89"/>
-        </w:rPr>
-        <w:t>13. Administration</w:t>
-      </w:r>
-      <w:bookmarkEnd w:id="65"/>
+        <w:t>12. Reports</w:t>
+      </w:r>
+      <w:bookmarkEnd w:id="63"/>
     </w:p>
     <w:tbl>
       <w:tblPr>
@@ -11611,7 +11714,7 @@
               <w:t xml:space="preserve">Who can do this:  </w:t>
             </w:r>
             <w:r>
-              <w:t>Admin only, under Administration.</w:t>
+              <w:t>Admin and Finance, under Reports.</w:t>
             </w:r>
           </w:p>
         </w:tc>
@@ -11622,142 +11725,14 @@
       <w:pPr>
         <w:pStyle w:val="Heading2"/>
       </w:pPr>
-      <w:bookmarkStart w:id="66" w:name="_Toc243389813"/>
+      <w:bookmarkStart w:id="64" w:name="_Toc243403887"/>
       <w:r>
         <w:rPr>
           <w:color w:val="1D4E89"/>
         </w:rPr>
-        <w:t>13.1 Users</w:t>
-      </w:r>
-      <w:bookmarkEnd w:id="66"/>
-    </w:p>
-    <w:p>
-      <w:pPr>
-        <w:pStyle w:val="Heading3"/>
-      </w:pPr>
-      <w:bookmarkStart w:id="67" w:name="_Toc900000066"/>
-      <w:r>
-        <w:rPr>
-          <w:color w:val="1D4E89"/>
-        </w:rPr>
-        <w:t>Creating a user</w:t>
-      </w:r>
-      <w:bookmarkEnd w:id="67"/>
-    </w:p>
-    <w:p>
-      <w:pPr>
-        <w:pStyle w:val="ListNumber"/>
-        <w:numPr>
-          <w:ilvl w:val="0"/>
-          <w:numId w:val="18"/>
-        </w:numPr>
-      </w:pPr>
-      <w:r>
-        <w:t>Administration → Users → “New User.”</w:t>
-      </w:r>
-    </w:p>
-    <w:p>
-      <w:pPr>
-        <w:pStyle w:val="ListNumber"/>
-        <w:numPr>
-          <w:ilvl w:val="0"/>
-          <w:numId w:val="18"/>
-        </w:numPr>
-      </w:pPr>
-      <w:r>
-        <w:t>Enter the Full Name, Username, Email and optionally the Phone.</w:t>
-      </w:r>
-    </w:p>
-    <w:p>
-      <w:pPr>
-        <w:pStyle w:val="ListNumber"/>
-        <w:numPr>
-          <w:ilvl w:val="0"/>
-          <w:numId w:val="18"/>
-        </w:numPr>
-      </w:pPr>
-      <w:r>
-        <w:t>Choose the Role: Admin, Finance or Operations (see section 1.5).</w:t>
-      </w:r>
-    </w:p>
-    <w:p>
-      <w:pPr>
-        <w:pStyle w:val="ListNumber"/>
-        <w:numPr>
-          <w:ilvl w:val="0"/>
-          <w:numId w:val="18"/>
-        </w:numPr>
-      </w:pPr>
-      <w:r>
-        <w:t>Enter a starting Password twice: at least 8 characters, with upper and lower case letters and a number.</w:t>
-      </w:r>
-    </w:p>
-    <w:p>
-      <w:pPr>
-        <w:pStyle w:val="ListNumber"/>
-        <w:numPr>
-          <w:ilvl w:val="0"/>
-          <w:numId w:val="18"/>
-        </w:numPr>
-      </w:pPr>
-      <w:r>
-        <w:t>Save, and give the user their username and password. They must choose a new password when they first log in.</w:t>
-      </w:r>
-    </w:p>
-    <w:p>
-      <w:pPr>
-        <w:pStyle w:val="Heading3"/>
-      </w:pPr>
-      <w:bookmarkStart w:id="68" w:name="_Toc900000067"/>
-      <w:r>
-        <w:rPr>
-          <w:color w:val="1D4E89"/>
-        </w:rPr>
-        <w:t>Managing an existing user</w:t>
-      </w:r>
-      <w:bookmarkEnd w:id="68"/>
-    </w:p>
-    <w:p>
-      <w:pPr>
-        <w:pStyle w:val="ListBullet"/>
-      </w:pPr>
-      <w:r>
-        <w:t>“Edit” changes their details or role.</w:t>
-      </w:r>
-    </w:p>
-    <w:p>
-      <w:pPr>
-        <w:pStyle w:val="ListBullet"/>
-      </w:pPr>
-      <w:r>
-        <w:t>“Reset Password” creates a new password and shows it once in a message at the top of the page. Copy it and give it to the user securely. They must change it at their next login, and any session they had open is ended.</w:t>
-      </w:r>
-    </w:p>
-    <w:p>
-      <w:pPr>
-        <w:pStyle w:val="ListBullet"/>
-      </w:pPr>
-      <w:r>
-        <w:t>“Deactivate” stops a user logging in and signs them out. You can’t deactivate your own account. “Activate” lets them back in.</w:t>
-      </w:r>
-    </w:p>
-    <w:p>
-      <w:pPr>
-        <w:pStyle w:val="Heading2"/>
-      </w:pPr>
-      <w:bookmarkStart w:id="69" w:name="_Toc243389814"/>
-      <w:r>
-        <w:rPr>
-          <w:color w:val="1D4E89"/>
-        </w:rPr>
-        <w:t>13.2 Settings</w:t>
-      </w:r>
-      <w:bookmarkEnd w:id="69"/>
-    </w:p>
-    <w:p>
-      <w:r>
-        <w:t>Administration → Settings holds the details printed on your documents and a few switches:</w:t>
-      </w:r>
+        <w:t>12.1 The reports</w:t>
+      </w:r>
+      <w:bookmarkEnd w:id="64"/>
     </w:p>
     <w:tbl>
       <w:tblPr>
@@ -11784,7 +11759,7 @@
           </w:tcPr>
           <w:p>
             <w:r>
-              <w:t>Section</w:t>
+              <w:t>Report</w:t>
             </w:r>
           </w:p>
         </w:tc>
@@ -11797,7 +11772,7 @@
               <w:cnfStyle w:val="100000000000" w:firstRow="1" w:lastRow="0" w:firstColumn="0" w:lastColumn="0" w:oddVBand="0" w:evenVBand="0" w:oddHBand="0" w:evenHBand="0" w:firstRowFirstColumn="0" w:firstRowLastColumn="0" w:lastRowFirstColumn="0" w:lastRowLastColumn="0"/>
             </w:pPr>
             <w:r>
-              <w:t>Settings</w:t>
+              <w:t>What it shows</w:t>
             </w:r>
           </w:p>
         </w:tc>
@@ -11815,7 +11790,7 @@
           </w:tcPr>
           <w:p>
             <w:r>
-              <w:t>Organization Details</w:t>
+              <w:t>Revenue</w:t>
             </w:r>
           </w:p>
         </w:tc>
@@ -11828,7 +11803,7 @@
               <w:cnfStyle w:val="000000100000" w:firstRow="0" w:lastRow="0" w:firstColumn="0" w:lastColumn="0" w:oddVBand="0" w:evenVBand="0" w:oddHBand="1" w:evenHBand="0" w:firstRowFirstColumn="0" w:firstRowLastColumn="0" w:lastRowFirstColumn="0" w:lastRowLastColumn="0"/>
             </w:pPr>
             <w:r>
-              <w:t>Organization Name, Phone, Email, Address, Default Currency, and Logo (with “Remove current logo”)</w:t>
+              <w:t>Invoiced revenue by client, by service type and by month</w:t>
             </w:r>
           </w:p>
         </w:tc>
@@ -11846,7 +11821,7 @@
           </w:tcPr>
           <w:p>
             <w:r>
-              <w:t>Invoice PDF</w:t>
+              <w:t>Receivables Aging</w:t>
             </w:r>
           </w:p>
         </w:tc>
@@ -11859,7 +11834,7 @@
               <w:cnfStyle w:val="000000010000" w:firstRow="0" w:lastRow="0" w:firstColumn="0" w:lastColumn="0" w:oddVBand="0" w:evenVBand="0" w:oddHBand="0" w:evenHBand="1" w:firstRowFirstColumn="0" w:firstRowLastColumn="0" w:lastRowFirstColumn="0" w:lastRowLastColumn="0"/>
             </w:pPr>
             <w:r>
-              <w:t>“Default to itemized expense breakdown on invoice PDFs,” and Footer Notes printed at the bottom of every invoice</w:t>
+              <w:t>What each client owes, grouped by how long it is overdue: 0-30, 31-60, 61-90 and 90+ days, with the invoices behind each figure</w:t>
             </w:r>
           </w:p>
         </w:tc>
@@ -11877,7 +11852,7 @@
           </w:tcPr>
           <w:p>
             <w:r>
-              <w:t>Proforma Invoices</w:t>
+              <w:t>Trip Profitability</w:t>
             </w:r>
           </w:p>
         </w:tc>
@@ -11890,7 +11865,131 @@
               <w:cnfStyle w:val="000000100000" w:firstRow="0" w:lastRow="0" w:firstColumn="0" w:lastColumn="0" w:oddVBand="0" w:evenVBand="0" w:oddHBand="1" w:evenHBand="0" w:firstRowFirstColumn="0" w:firstRowLastColumn="0" w:lastRowFirstColumn="0" w:lastRowLastColumn="0"/>
             </w:pPr>
             <w:r>
-              <w:t>“Enable proforma invoices,” Default Validity (days), and Proforma Footer Notes</w:t>
+              <w:t>Each trip’s value minus its expenses, grouped by client, by truck and by month</w:t>
+            </w:r>
+          </w:p>
+        </w:tc>
+      </w:tr>
+      <w:tr>
+        <w:trPr>
+          <w:cnfStyle w:val="000000010000" w:firstRow="0" w:lastRow="0" w:firstColumn="0" w:lastColumn="0" w:oddVBand="0" w:evenVBand="0" w:oddHBand="0" w:evenHBand="1" w:firstRowFirstColumn="0" w:firstRowLastColumn="0" w:lastRowFirstColumn="0" w:lastRowLastColumn="0"/>
+          <w:cantSplit/>
+          <w:jc w:val="center"/>
+        </w:trPr>
+        <w:tc>
+          <w:tcPr>
+            <w:cnfStyle w:val="001000000000" w:firstRow="0" w:lastRow="0" w:firstColumn="1" w:lastColumn="0" w:oddVBand="0" w:evenVBand="0" w:oddHBand="0" w:evenHBand="0" w:firstRowFirstColumn="0" w:firstRowLastColumn="0" w:lastRowFirstColumn="0" w:lastRowLastColumn="0"/>
+            <w:tcW w:w="4320" w:type="dxa"/>
+          </w:tcPr>
+          <w:p>
+            <w:r>
+              <w:t>Expenses</w:t>
+            </w:r>
+          </w:p>
+        </w:tc>
+        <w:tc>
+          <w:tcPr>
+            <w:tcW w:w="4320" w:type="dxa"/>
+          </w:tcPr>
+          <w:p>
+            <w:pPr>
+              <w:cnfStyle w:val="000000010000" w:firstRow="0" w:lastRow="0" w:firstColumn="0" w:lastColumn="0" w:oddVBand="0" w:evenVBand="0" w:oddHBand="0" w:evenHBand="1" w:firstRowFirstColumn="0" w:firstRowLastColumn="0" w:lastRowFirstColumn="0" w:lastRowLastColumn="0"/>
+            </w:pPr>
+            <w:r>
+              <w:t>Expenses by category, by truck and by trip</w:t>
+            </w:r>
+          </w:p>
+        </w:tc>
+      </w:tr>
+      <w:tr>
+        <w:trPr>
+          <w:cnfStyle w:val="000000100000" w:firstRow="0" w:lastRow="0" w:firstColumn="0" w:lastColumn="0" w:oddVBand="0" w:evenVBand="0" w:oddHBand="1" w:evenHBand="0" w:firstRowFirstColumn="0" w:firstRowLastColumn="0" w:lastRowFirstColumn="0" w:lastRowLastColumn="0"/>
+          <w:cantSplit/>
+          <w:jc w:val="center"/>
+        </w:trPr>
+        <w:tc>
+          <w:tcPr>
+            <w:cnfStyle w:val="001000000000" w:firstRow="0" w:lastRow="0" w:firstColumn="1" w:lastColumn="0" w:oddVBand="0" w:evenVBand="0" w:oddHBand="0" w:evenHBand="0" w:firstRowFirstColumn="0" w:firstRowLastColumn="0" w:lastRowFirstColumn="0" w:lastRowLastColumn="0"/>
+            <w:tcW w:w="4320" w:type="dxa"/>
+          </w:tcPr>
+          <w:p>
+            <w:r>
+              <w:t>Payments</w:t>
+            </w:r>
+          </w:p>
+        </w:tc>
+        <w:tc>
+          <w:tcPr>
+            <w:tcW w:w="4320" w:type="dxa"/>
+          </w:tcPr>
+          <w:p>
+            <w:pPr>
+              <w:cnfStyle w:val="000000100000" w:firstRow="0" w:lastRow="0" w:firstColumn="0" w:lastColumn="0" w:oddVBand="0" w:evenVBand="0" w:oddHBand="1" w:evenHBand="0" w:firstRowFirstColumn="0" w:firstRowLastColumn="0" w:lastRowFirstColumn="0" w:lastRowLastColumn="0"/>
+            </w:pPr>
+            <w:r>
+              <w:t>Payments collected by method, by client and by account</w:t>
+            </w:r>
+          </w:p>
+        </w:tc>
+      </w:tr>
+      <w:tr>
+        <w:trPr>
+          <w:cnfStyle w:val="000000010000" w:firstRow="0" w:lastRow="0" w:firstColumn="0" w:lastColumn="0" w:oddVBand="0" w:evenVBand="0" w:oddHBand="0" w:evenHBand="1" w:firstRowFirstColumn="0" w:firstRowLastColumn="0" w:lastRowFirstColumn="0" w:lastRowLastColumn="0"/>
+          <w:cantSplit/>
+          <w:jc w:val="center"/>
+        </w:trPr>
+        <w:tc>
+          <w:tcPr>
+            <w:cnfStyle w:val="001000000000" w:firstRow="0" w:lastRow="0" w:firstColumn="1" w:lastColumn="0" w:oddVBand="0" w:evenVBand="0" w:oddHBand="0" w:evenHBand="0" w:firstRowFirstColumn="0" w:firstRowLastColumn="0" w:lastRowFirstColumn="0" w:lastRowLastColumn="0"/>
+            <w:tcW w:w="4320" w:type="dxa"/>
+          </w:tcPr>
+          <w:p>
+            <w:r>
+              <w:t>Fleet Utilization</w:t>
+            </w:r>
+          </w:p>
+        </w:tc>
+        <w:tc>
+          <w:tcPr>
+            <w:tcW w:w="4320" w:type="dxa"/>
+          </w:tcPr>
+          <w:p>
+            <w:pPr>
+              <w:cnfStyle w:val="000000010000" w:firstRow="0" w:lastRow="0" w:firstColumn="0" w:lastColumn="0" w:oddVBand="0" w:evenVBand="0" w:oddHBand="0" w:evenHBand="1" w:firstRowFirstColumn="0" w:firstRowLastColumn="0" w:lastRowFirstColumn="0" w:lastRowLastColumn="0"/>
+            </w:pPr>
+            <w:r>
+              <w:t>Trips per truck, with active and idle days</w:t>
+            </w:r>
+          </w:p>
+        </w:tc>
+      </w:tr>
+      <w:tr>
+        <w:trPr>
+          <w:cnfStyle w:val="000000100000" w:firstRow="0" w:lastRow="0" w:firstColumn="0" w:lastColumn="0" w:oddVBand="0" w:evenVBand="0" w:oddHBand="1" w:evenHBand="0" w:firstRowFirstColumn="0" w:firstRowLastColumn="0" w:lastRowFirstColumn="0" w:lastRowLastColumn="0"/>
+          <w:cantSplit/>
+          <w:jc w:val="center"/>
+        </w:trPr>
+        <w:tc>
+          <w:tcPr>
+            <w:cnfStyle w:val="001000000000" w:firstRow="0" w:lastRow="0" w:firstColumn="1" w:lastColumn="0" w:oddVBand="0" w:evenVBand="0" w:oddHBand="0" w:evenHBand="0" w:firstRowFirstColumn="0" w:firstRowLastColumn="0" w:lastRowFirstColumn="0" w:lastRowLastColumn="0"/>
+            <w:tcW w:w="4320" w:type="dxa"/>
+          </w:tcPr>
+          <w:p>
+            <w:r>
+              <w:t>Client Statement</w:t>
+            </w:r>
+          </w:p>
+        </w:tc>
+        <w:tc>
+          <w:tcPr>
+            <w:tcW w:w="4320" w:type="dxa"/>
+          </w:tcPr>
+          <w:p>
+            <w:pPr>
+              <w:cnfStyle w:val="000000100000" w:firstRow="0" w:lastRow="0" w:firstColumn="0" w:lastColumn="0" w:oddVBand="0" w:evenVBand="0" w:oddHBand="1" w:evenHBand="0" w:firstRowFirstColumn="0" w:firstRowLastColumn="0" w:lastRowFirstColumn="0" w:lastRowLastColumn="0"/>
+            </w:pPr>
+            <w:r>
+              <w:t>One client’s invoices and payments with a running balance</w:t>
             </w:r>
           </w:p>
         </w:tc>
@@ -11898,72 +11997,240 @@
     </w:tbl>
     <w:p/>
     <w:p>
-      <w:r>
-        <w:t>Click “Save Settings” when you’re done.</w:t>
+      <w:pPr>
+        <w:pStyle w:val="ListBullet"/>
+      </w:pPr>
+      <w:r>
+        <w:t>Most reports have “From” and “To” dates. Set them and click “Filter.”</w:t>
+      </w:r>
+    </w:p>
+    <w:p>
+      <w:pPr>
+        <w:pStyle w:val="ListBullet"/>
+      </w:pPr>
+      <w:r>
+        <w:t>“Export CSV” downloads the figures to open in Excel. “Print” prints the page.</w:t>
+      </w:r>
+    </w:p>
+    <w:p>
+      <w:pPr>
+        <w:pStyle w:val="ListBullet"/>
+      </w:pPr>
+      <w:r>
+        <w:t>All amounts are in cedis (GHS).</w:t>
       </w:r>
     </w:p>
     <w:p>
       <w:pPr>
         <w:pStyle w:val="Heading2"/>
       </w:pPr>
-      <w:bookmarkStart w:id="70" w:name="_Toc243389815"/>
+      <w:bookmarkStart w:id="65" w:name="_Toc243403888"/>
       <w:r>
         <w:rPr>
           <w:color w:val="1D4E89"/>
         </w:rPr>
-        <w:t>13.3 Expense categories</w:t>
-      </w:r>
-      <w:bookmarkEnd w:id="70"/>
-    </w:p>
-    <w:p>
-      <w:r>
-        <w:t>Expense categories group trip expenses for the reports. The system comes with nine: Fuel, Toll, Meal, Repair, Loading/Offloading, Tyre, Driver Allowance, Ferry/Crossing and Other. These built-in categories can’t be deleted, but you can deactivate any you don’t use.</w:t>
-      </w:r>
-    </w:p>
-    <w:p>
-      <w:r>
-        <w:t>Add your own with “New Category.” A category you added can be deleted only if no expense uses it; otherwise deactivate it.</w:t>
-      </w:r>
-    </w:p>
-    <w:p>
-      <w:pPr>
-        <w:pStyle w:val="Heading2"/>
-      </w:pPr>
-      <w:bookmarkStart w:id="71" w:name="_Toc243389816"/>
+        <w:t>12.2 Client statements</w:t>
+      </w:r>
+      <w:bookmarkEnd w:id="65"/>
+    </w:p>
+    <w:p>
+      <w:r>
+        <w:t>Reports → Client Statement: choose the client, set the From and To dates, and click “Generate.” Use the PDF button to download a statement to send to the client. Amounts are in cedis, worked out the same way as the Statement tab on the client page.</w:t>
+      </w:r>
+    </w:p>
+    <w:p>
+      <w:pPr>
+        <w:pStyle w:val="Heading1"/>
+        <w:pageBreakBefore/>
+      </w:pPr>
+      <w:bookmarkStart w:id="66" w:name="_Toc243403889"/>
       <w:r>
         <w:rPr>
           <w:color w:val="1D4E89"/>
         </w:rPr>
-        <w:t>13.4 Audit log</w:t>
-      </w:r>
-      <w:bookmarkEnd w:id="71"/>
-    </w:p>
-    <w:p>
-      <w:r>
-        <w:t>The Audit Log records every important change: what was created, changed, deleted, issued, cancelled or reassigned, by whom, when, and from which IP address. Click “Details” on an entry to see the values before and after the change.</w:t>
-      </w:r>
-    </w:p>
-    <w:p>
-      <w:r>
-        <w:t>Filter by entity (e.g. Trip or Invoice), action, staff user, or user type (Staff or Client, for changes made in the portal).</w:t>
-      </w:r>
-    </w:p>
+        <w:t>13. Administration</w:t>
+      </w:r>
+      <w:bookmarkEnd w:id="66"/>
+    </w:p>
+    <w:tbl>
+      <w:tblPr>
+        <w:tblW w:w="0" w:type="auto"/>
+        <w:tblBorders>
+          <w:top w:val="nil"/>
+          <w:left w:val="nil"/>
+          <w:bottom w:val="nil"/>
+          <w:right w:val="nil"/>
+          <w:insideH w:val="nil"/>
+          <w:insideV w:val="nil"/>
+        </w:tblBorders>
+        <w:tblLook w:val="04A0" w:firstRow="1" w:lastRow="0" w:firstColumn="1" w:lastColumn="0" w:noHBand="0" w:noVBand="1"/>
+      </w:tblPr>
+      <w:tblGrid>
+        <w:gridCol w:w="8640"/>
+      </w:tblGrid>
+      <w:tr>
+        <w:trPr>
+          <w:cantSplit/>
+        </w:trPr>
+        <w:tc>
+          <w:tcPr>
+            <w:tcW w:w="8640" w:type="dxa"/>
+            <w:shd w:val="clear" w:color="auto" w:fill="F2F2F2"/>
+          </w:tcPr>
+          <w:p>
+            <w:r>
+              <w:rPr>
+                <w:b/>
+              </w:rPr>
+              <w:t xml:space="preserve">Who can do this:  </w:t>
+            </w:r>
+            <w:r>
+              <w:t>Admin only, under Administration.</w:t>
+            </w:r>
+          </w:p>
+        </w:tc>
+      </w:tr>
+    </w:tbl>
+    <w:p/>
     <w:p>
       <w:pPr>
         <w:pStyle w:val="Heading2"/>
       </w:pPr>
-      <w:bookmarkStart w:id="72" w:name="_Toc243389817"/>
+      <w:bookmarkStart w:id="67" w:name="_Toc243403890"/>
       <w:r>
         <w:rPr>
           <w:color w:val="1D4E89"/>
         </w:rPr>
-        <w:t>13.5 Currencies</w:t>
-      </w:r>
-      <w:bookmarkEnd w:id="72"/>
-    </w:p>
-    <w:p>
-      <w:r>
-        <w:t>Administration → Currencies lists the currencies staff can choose for clients, quotes, trips, expenses, invoices, proformas and payments. It starts with GHS, USD, EUR and NGN.</w:t>
+        <w:t>13.1 Users</w:t>
+      </w:r>
+      <w:bookmarkEnd w:id="67"/>
+    </w:p>
+    <w:p>
+      <w:pPr>
+        <w:pStyle w:val="Heading3"/>
+      </w:pPr>
+      <w:bookmarkStart w:id="68" w:name="_Toc900000066"/>
+      <w:r>
+        <w:rPr>
+          <w:color w:val="1D4E89"/>
+        </w:rPr>
+        <w:t>Creating a user</w:t>
+      </w:r>
+      <w:bookmarkEnd w:id="68"/>
+    </w:p>
+    <w:p>
+      <w:pPr>
+        <w:pStyle w:val="ListNumber"/>
+        <w:numPr>
+          <w:ilvl w:val="0"/>
+          <w:numId w:val="18"/>
+        </w:numPr>
+      </w:pPr>
+      <w:r>
+        <w:t>Administration → Users → “New User.”</w:t>
+      </w:r>
+    </w:p>
+    <w:p>
+      <w:pPr>
+        <w:pStyle w:val="ListNumber"/>
+        <w:numPr>
+          <w:ilvl w:val="0"/>
+          <w:numId w:val="18"/>
+        </w:numPr>
+      </w:pPr>
+      <w:r>
+        <w:t>Enter the Full Name, Username, Email and optionally the Phone.</w:t>
+      </w:r>
+    </w:p>
+    <w:p>
+      <w:pPr>
+        <w:pStyle w:val="ListNumber"/>
+        <w:numPr>
+          <w:ilvl w:val="0"/>
+          <w:numId w:val="18"/>
+        </w:numPr>
+      </w:pPr>
+      <w:r>
+        <w:t>Choose the Role: Admin, Finance or Operations (see section 1.5).</w:t>
+      </w:r>
+    </w:p>
+    <w:p>
+      <w:pPr>
+        <w:pStyle w:val="ListNumber"/>
+        <w:numPr>
+          <w:ilvl w:val="0"/>
+          <w:numId w:val="18"/>
+        </w:numPr>
+      </w:pPr>
+      <w:r>
+        <w:t>Enter a starting Password twice: at least 8 characters, with upper and lower case letters and a number.</w:t>
+      </w:r>
+    </w:p>
+    <w:p>
+      <w:pPr>
+        <w:pStyle w:val="ListNumber"/>
+        <w:numPr>
+          <w:ilvl w:val="0"/>
+          <w:numId w:val="18"/>
+        </w:numPr>
+      </w:pPr>
+      <w:r>
+        <w:t>Save, and give the user their username and password. They must choose a new password when they first log in.</w:t>
+      </w:r>
+    </w:p>
+    <w:p>
+      <w:pPr>
+        <w:pStyle w:val="Heading3"/>
+      </w:pPr>
+      <w:bookmarkStart w:id="69" w:name="_Toc900000067"/>
+      <w:r>
+        <w:rPr>
+          <w:color w:val="1D4E89"/>
+        </w:rPr>
+        <w:t>Managing an existing user</w:t>
+      </w:r>
+      <w:bookmarkEnd w:id="69"/>
+    </w:p>
+    <w:p>
+      <w:pPr>
+        <w:pStyle w:val="ListBullet"/>
+      </w:pPr>
+      <w:r>
+        <w:t>“Edit” changes their details or role.</w:t>
+      </w:r>
+    </w:p>
+    <w:p>
+      <w:pPr>
+        <w:pStyle w:val="ListBullet"/>
+      </w:pPr>
+      <w:r>
+        <w:t>“Reset Password” creates a new password and shows it once in a message at the top of the page. Copy it and give it to the user securely. They must change it at their next login, and any session they had open is ended.</w:t>
+      </w:r>
+    </w:p>
+    <w:p>
+      <w:pPr>
+        <w:pStyle w:val="ListBullet"/>
+      </w:pPr>
+      <w:r>
+        <w:t>“Deactivate” stops a user logging in and signs them out. You can’t deactivate your own account. “Activate” lets them back in.</w:t>
+      </w:r>
+    </w:p>
+    <w:p>
+      <w:pPr>
+        <w:pStyle w:val="Heading2"/>
+      </w:pPr>
+      <w:bookmarkStart w:id="70" w:name="_Toc243403891"/>
+      <w:r>
+        <w:rPr>
+          <w:color w:val="1D4E89"/>
+        </w:rPr>
+        <w:t>13.2 Settings</w:t>
+      </w:r>
+      <w:bookmarkEnd w:id="70"/>
+    </w:p>
+    <w:p>
+      <w:r>
+        <w:t>Administration → Settings holds the details printed on your documents and a few switches:</w:t>
       </w:r>
     </w:p>
     <w:tbl>
@@ -11991,7 +12258,7 @@
           </w:tcPr>
           <w:p>
             <w:r>
-              <w:t>Column</w:t>
+              <w:t>Section</w:t>
             </w:r>
           </w:p>
         </w:tc>
@@ -12004,7 +12271,7 @@
               <w:cnfStyle w:val="100000000000" w:firstRow="1" w:lastRow="0" w:firstColumn="0" w:lastColumn="0" w:oddVBand="0" w:evenVBand="0" w:oddHBand="0" w:evenHBand="0" w:firstRowFirstColumn="0" w:firstRowLastColumn="0" w:lastRowFirstColumn="0" w:lastRowLastColumn="0"/>
             </w:pPr>
             <w:r>
-              <w:t>What it means</w:t>
+              <w:t>Settings</w:t>
             </w:r>
           </w:p>
         </w:tc>
@@ -12022,7 +12289,7 @@
           </w:tcPr>
           <w:p>
             <w:r>
-              <w:t>Code</w:t>
+              <w:t>Organization Details</w:t>
             </w:r>
           </w:p>
         </w:tc>
@@ -12035,7 +12302,7 @@
               <w:cnfStyle w:val="000000100000" w:firstRow="0" w:lastRow="0" w:firstColumn="0" w:lastColumn="0" w:oddVBand="0" w:evenVBand="0" w:oddHBand="1" w:evenHBand="0" w:firstRowFirstColumn="0" w:firstRowLastColumn="0" w:lastRowFirstColumn="0" w:lastRowLastColumn="0"/>
             </w:pPr>
             <w:r>
-              <w:t>The 3-letter international code, e.g. USD</w:t>
+              <w:t>Organization Name, Phone, Email, Address, Default Currency, and Logo (with “Remove current logo”)</w:t>
             </w:r>
           </w:p>
         </w:tc>
@@ -12053,7 +12320,7 @@
           </w:tcPr>
           <w:p>
             <w:r>
-              <w:t>Name</w:t>
+              <w:t>Invoice PDF</w:t>
             </w:r>
           </w:p>
         </w:tc>
@@ -12066,7 +12333,7 @@
               <w:cnfStyle w:val="000000010000" w:firstRow="0" w:lastRow="0" w:firstColumn="0" w:lastColumn="0" w:oddVBand="0" w:evenVBand="0" w:oddHBand="0" w:evenHBand="1" w:firstRowFirstColumn="0" w:firstRowLastColumn="0" w:lastRowFirstColumn="0" w:lastRowLastColumn="0"/>
             </w:pPr>
             <w:r>
-              <w:t>The currency’s name, e.g. US Dollar</w:t>
+              <w:t>“Default to itemized expense breakdown on invoice PDFs,” and Footer Notes printed at the bottom of every invoice</w:t>
             </w:r>
           </w:p>
         </w:tc>
@@ -12084,7 +12351,7 @@
           </w:tcPr>
           <w:p>
             <w:r>
-              <w:t>Rate to GHS</w:t>
+              <w:t>Proforma Invoices</w:t>
             </w:r>
           </w:p>
         </w:tc>
@@ -12097,185 +12364,70 @@
               <w:cnfStyle w:val="000000100000" w:firstRow="0" w:lastRow="0" w:firstColumn="0" w:lastColumn="0" w:oddVBand="0" w:evenVBand="0" w:oddHBand="1" w:evenHBand="0" w:firstRowFirstColumn="0" w:firstRowLastColumn="0" w:lastRowFirstColumn="0" w:lastRowLastColumn="0"/>
             </w:pPr>
             <w:r>
-              <w:t>How many cedis one unit is worth today, e.g. “1 USD = GHS 15.2500,” or “Not set”</w:t>
-            </w:r>
-          </w:p>
-        </w:tc>
-      </w:tr>
-      <w:tr>
-        <w:trPr>
-          <w:cnfStyle w:val="000000010000" w:firstRow="0" w:lastRow="0" w:firstColumn="0" w:lastColumn="0" w:oddVBand="0" w:evenVBand="0" w:oddHBand="0" w:evenHBand="1" w:firstRowFirstColumn="0" w:firstRowLastColumn="0" w:lastRowFirstColumn="0" w:lastRowLastColumn="0"/>
-          <w:cantSplit/>
-          <w:jc w:val="center"/>
-        </w:trPr>
-        <w:tc>
-          <w:tcPr>
-            <w:cnfStyle w:val="001000000000" w:firstRow="0" w:lastRow="0" w:firstColumn="1" w:lastColumn="0" w:oddVBand="0" w:evenVBand="0" w:oddHBand="0" w:evenHBand="0" w:firstRowFirstColumn="0" w:firstRowLastColumn="0" w:lastRowFirstColumn="0" w:lastRowLastColumn="0"/>
-            <w:tcW w:w="4320" w:type="dxa"/>
-          </w:tcPr>
-          <w:p>
-            <w:r>
-              <w:t>Rate Updated</w:t>
-            </w:r>
-          </w:p>
-        </w:tc>
-        <w:tc>
-          <w:tcPr>
-            <w:tcW w:w="4320" w:type="dxa"/>
-          </w:tcPr>
-          <w:p>
-            <w:pPr>
-              <w:cnfStyle w:val="000000010000" w:firstRow="0" w:lastRow="0" w:firstColumn="0" w:lastColumn="0" w:oddVBand="0" w:evenVBand="0" w:oddHBand="0" w:evenHBand="1" w:firstRowFirstColumn="0" w:firstRowLastColumn="0" w:lastRowFirstColumn="0" w:lastRowLastColumn="0"/>
-            </w:pPr>
-            <w:r>
-              <w:t>When the rate was last changed</w:t>
-            </w:r>
-          </w:p>
-        </w:tc>
-      </w:tr>
-      <w:tr>
-        <w:trPr>
-          <w:cnfStyle w:val="000000100000" w:firstRow="0" w:lastRow="0" w:firstColumn="0" w:lastColumn="0" w:oddVBand="0" w:evenVBand="0" w:oddHBand="1" w:evenHBand="0" w:firstRowFirstColumn="0" w:firstRowLastColumn="0" w:lastRowFirstColumn="0" w:lastRowLastColumn="0"/>
-          <w:cantSplit/>
-          <w:jc w:val="center"/>
-        </w:trPr>
-        <w:tc>
-          <w:tcPr>
-            <w:cnfStyle w:val="001000000000" w:firstRow="0" w:lastRow="0" w:firstColumn="1" w:lastColumn="0" w:oddVBand="0" w:evenVBand="0" w:oddHBand="0" w:evenHBand="0" w:firstRowFirstColumn="0" w:firstRowLastColumn="0" w:lastRowFirstColumn="0" w:lastRowLastColumn="0"/>
-            <w:tcW w:w="4320" w:type="dxa"/>
-          </w:tcPr>
-          <w:p>
-            <w:r>
-              <w:t>Status</w:t>
-            </w:r>
-          </w:p>
-        </w:tc>
-        <w:tc>
-          <w:tcPr>
-            <w:tcW w:w="4320" w:type="dxa"/>
-          </w:tcPr>
-          <w:p>
-            <w:pPr>
-              <w:cnfStyle w:val="000000100000" w:firstRow="0" w:lastRow="0" w:firstColumn="0" w:lastColumn="0" w:oddVBand="0" w:evenVBand="0" w:oddHBand="1" w:evenHBand="0" w:firstRowFirstColumn="0" w:firstRowLastColumn="0" w:lastRowFirstColumn="0" w:lastRowLastColumn="0"/>
-            </w:pPr>
-            <w:r>
-              <w:t>Active currencies appear on forms; inactive ones don’t</w:t>
+              <w:t>“Enable proforma invoices,” Default Validity (days), and Proforma Footer Notes</w:t>
             </w:r>
           </w:p>
         </w:tc>
       </w:tr>
     </w:tbl>
-    <w:p>
-      <w:r>
-        <w:t>Keep the rates up to date:</w:t>
-      </w:r>
-    </w:p>
-    <w:p>
-      <w:pPr>
-        <w:pStyle w:val="ListBullet"/>
-      </w:pPr>
-      <w:r>
-        <w:t>When staff choose a currency on a form, its rate is filled in as that record’s exchange rate. Staff can change it on each record, for example to the rate a client actually paid at.</w:t>
-      </w:r>
-    </w:p>
-    <w:p>
-      <w:pPr>
-        <w:pStyle w:val="ListBullet"/>
-      </w:pPr>
-      <w:r>
-        <w:t>Changing a rate here doesn’t change anything already saved: each trip, invoice, payment and expense keeps its own rate.</w:t>
-      </w:r>
-    </w:p>
-    <w:p>
-      <w:pPr>
-        <w:pStyle w:val="ListBullet"/>
-      </w:pPr>
-      <w:r>
-        <w:t>A currency with no rate shows “Not set,” and staff have to type the rate on each record.</w:t>
-      </w:r>
-    </w:p>
-    <w:p>
-      <w:r>
-        <w:t>To manage the list:</w:t>
-      </w:r>
-    </w:p>
-    <w:p>
-      <w:pPr>
-        <w:pStyle w:val="ListBullet"/>
-      </w:pPr>
-      <w:r>
-        <w:t>“Edit” changes a currency’s name or rate. The code can’t be changed, because saved records use it.</w:t>
-      </w:r>
-    </w:p>
-    <w:p>
-      <w:pPr>
-        <w:pStyle w:val="ListBullet"/>
-      </w:pPr>
-      <w:r>
-        <w:t>“New Currency” adds another, with its code (e.g. XOF), name and, if you know it, its rate.</w:t>
-      </w:r>
-    </w:p>
-    <w:p>
-      <w:pPr>
-        <w:pStyle w:val="ListBullet"/>
-      </w:pPr>
-      <w:r>
-        <w:t>“Deactivate” takes a currency off the forms. Records already in that currency keep it. GHS, and the default currency in Settings, can’t be deactivated.</w:t>
-      </w:r>
-    </w:p>
-    <w:p>
-      <w:pPr>
-        <w:pStyle w:val="ListBullet"/>
-      </w:pPr>
-      <w:r>
-        <w:t>“Delete” works only for a currency that nothing uses yet. Once a currency is used, deactivate it instead.</w:t>
-      </w:r>
-    </w:p>
-    <w:tbl>
-      <w:tblPr>
-        <w:tblW w:w="0" w:type="auto"/>
-        <w:tblBorders>
-          <w:top w:val="nil"/>
-          <w:left w:val="nil"/>
-          <w:bottom w:val="nil"/>
-          <w:right w:val="nil"/>
-          <w:insideH w:val="nil"/>
-          <w:insideV w:val="nil"/>
-        </w:tblBorders>
-        <w:tblLook w:val="04A0" w:firstRow="1" w:lastRow="0" w:firstColumn="1" w:lastColumn="0" w:noHBand="0" w:noVBand="1"/>
-      </w:tblPr>
-      <w:tblGrid>
-        <w:gridCol w:w="8640"/>
-      </w:tblGrid>
-      <w:tr>
-        <w:trPr>
-          <w:cantSplit/>
-        </w:trPr>
-        <w:tc>
-          <w:tcPr>
-            <w:tcW w:w="8640" w:type="dxa"/>
-            <w:shd w:val="clear" w:color="auto" w:fill="EAF1FB"/>
-          </w:tcPr>
-          <w:p>
-            <w:r>
-              <w:rPr>
-                <w:b/>
-              </w:rPr>
-              <w:t xml:space="preserve">Note:  </w:t>
-            </w:r>
-            <w:r>
-              <w:t>GHS is the base currency. Accounts, reports and trip profit are all in cedis, worked out with each record’s own exchange rate.</w:t>
-            </w:r>
-          </w:p>
-        </w:tc>
-      </w:tr>
-    </w:tbl>
+    <w:p/>
+    <w:p>
+      <w:r>
+        <w:t>Click “Save Settings” when you’re done.</w:t>
+      </w:r>
+    </w:p>
+    <w:p>
+      <w:pPr>
+        <w:pStyle w:val="Heading2"/>
+      </w:pPr>
+      <w:bookmarkStart w:id="71" w:name="_Toc243403892"/>
+      <w:r>
+        <w:rPr>
+          <w:color w:val="1D4E89"/>
+        </w:rPr>
+        <w:t>13.3 Expense categories</w:t>
+      </w:r>
+      <w:bookmarkEnd w:id="71"/>
+    </w:p>
+    <w:p>
+      <w:r>
+        <w:t>Expense categories group trip expenses for the reports. The system comes with nine: Fuel, Toll, Meal, Repair, Loading/Offloading, Tyre, Driver Allowance, Ferry/Crossing and Other. These built-in categories can’t be deleted, but you can deactivate any you don’t use.</w:t>
+      </w:r>
+    </w:p>
+    <w:p>
+      <w:r>
+        <w:t>Add your own with “New Category.” A category you added can be deleted only if no expense uses it; otherwise deactivate it.</w:t>
+      </w:r>
+    </w:p>
+    <w:p>
+      <w:pPr>
+        <w:pStyle w:val="Heading2"/>
+      </w:pPr>
+      <w:bookmarkStart w:id="72" w:name="_Toc243403893"/>
+      <w:r>
+        <w:rPr>
+          <w:color w:val="1D4E89"/>
+        </w:rPr>
+        <w:t>13.4 Audit log</w:t>
+      </w:r>
+      <w:bookmarkEnd w:id="72"/>
+    </w:p>
+    <w:p>
+      <w:r>
+        <w:t>The Audit Log records every important change: what was created, changed, deleted, issued, cancelled or reassigned, by whom, when, and from which IP address. Click “Details” on an entry to see the values before and after the change.</w:t>
+      </w:r>
+    </w:p>
+    <w:p>
+      <w:r>
+        <w:t>Filter by entity (e.g. Trip or Invoice), action, staff user, or user type (Staff or Client, for changes made in the portal).</w:t>
+      </w:r>
+    </w:p>
     <w:p>
       <w:pPr>
         <w:pStyle w:val="Heading1"/>
         <w:pageBreakBefore/>
       </w:pPr>
-      <w:bookmarkStart w:id="73" w:name="_Toc243389818"/>
+      <w:bookmarkStart w:id="73" w:name="_Toc243403894"/>
       <w:r>
         <w:rPr>
           <w:color w:val="1D4E89"/>
@@ -12293,7 +12445,7 @@
       <w:pPr>
         <w:pStyle w:val="Heading2"/>
       </w:pPr>
-      <w:bookmarkStart w:id="74" w:name="_Toc243389819"/>
+      <w:bookmarkStart w:id="74" w:name="_Toc243403895"/>
       <w:r>
         <w:rPr>
           <w:color w:val="1D4E89"/>
@@ -12338,7 +12490,7 @@
       <w:pPr>
         <w:pStyle w:val="Heading2"/>
       </w:pPr>
-      <w:bookmarkStart w:id="75" w:name="_Toc243389820"/>
+      <w:bookmarkStart w:id="75" w:name="_Toc243403896"/>
       <w:r>
         <w:rPr>
           <w:color w:val="1D4E89"/>
@@ -12623,7 +12775,7 @@
         <w:pStyle w:val="Heading1"/>
         <w:pageBreakBefore/>
       </w:pPr>
-      <w:bookmarkStart w:id="76" w:name="_Toc243389821"/>
+      <w:bookmarkStart w:id="76" w:name="_Toc243403897"/>
       <w:r>
         <w:rPr>
           <w:color w:val="1D4E89"/>
@@ -12897,7 +13049,7 @@
     </w:p>
     <w:p>
       <w:r>
-        <w:t>An Admin adds it, or activates it again, under Administration → Currencies (section 13.5).</w:t>
+        <w:t>An Admin or Finance user adds it, or activates it again, under Finance → Currencies (section 11.7).</w:t>
       </w:r>
     </w:p>
     <w:p>
@@ -12913,7 +13065,7 @@
     </w:p>
     <w:p>
       <w:r>
-        <w:t>Any currency other than GHS needs a rate so the system can work out the amount in cedis. If it isn’t filled in for you, no rate has been set for that currency yet (section 13.5).</w:t>
+        <w:t>Any currency other than GHS needs a rate so the system can work out the amount in cedis. If it isn’t filled in for you, no rate has been entered for that currency on or before the record’s date (section 11.7).</w:t>
       </w:r>
     </w:p>
     <w:p>
@@ -12921,7 +13073,7 @@
         <w:pStyle w:val="Heading1"/>
         <w:pageBreakBefore/>
       </w:pPr>
-      <w:bookmarkStart w:id="91" w:name="_Toc243389822"/>
+      <w:bookmarkStart w:id="91" w:name="_Toc243403898"/>
       <w:r>
         <w:rPr>
           <w:color w:val="1D4E89"/>
@@ -12942,7 +13094,17 @@
     </w:p>
     <w:p>
       <w:r>
-        <w:t>Version 1.1 — October 2026. Adds the currency list (section 13.5): currencies are chosen from a list, today’s exchange rate is filled in on forms, and invoices have their own currency and exchange rate fields.</w:t>
+        <w:t>Version 1.1 — October 2026. Adds the currency list (section 11.7): currencies are chosen from a list, today’s exchange rate is filled in on forms, and invoices have their own currency and exchange rate fields.</w:t>
+      </w:r>
+    </w:p>
+    <w:p>
+      <w:r>
+        <w:t>Version 1.2 — October 2026. Invoice balances and status are worked out in each invoice’s own currency (section 9.1); client balances show one line per currency, and statements are in cedis (section 7.2).</w:t>
+      </w:r>
+    </w:p>
+    <w:p>
+      <w:r>
+        <w:t>Version 1.3 — October 2026. Currencies move to the Finance menu and Finance users can manage them (section 11.7). Exchange rates are kept with the date they apply from, and forms fill in the rate for the record’s date.</w:t>
       </w:r>
     </w:p>
     <w:sectPr>
@@ -13160,6 +13322,12 @@
   </w:num>
   <w:num w:numId="18" w16cid:durableId="1832255556">
     <w:abstractNumId w:val="1"/>
+    <w:lvlOverride w:ilvl="0">
+      <w:startOverride w:val="1"/>
+    </w:lvlOverride>
+  </w:num>
+  <w:num w:numId="19" w16cid:durableId="1218663936">
+    <w:abstractNumId w:val="4"/>
     <w:lvlOverride w:ilvl="0">
       <w:startOverride w:val="1"/>
     </w:lvlOverride>

</xml_diff>